<commit_message>
Branch: main; Updated protocol
</commit_message>
<xml_diff>
--- a/research_protocol/protocol.docx
+++ b/research_protocol/protocol.docx
@@ -607,13 +607,7 @@
                               <w:rPr>
                                 <w:rFonts w:cs="Tahoma"/>
                               </w:rPr>
-                              <w:t>Protocolo de pesquisa</w:t>
-                            </w:r>
-                            <w:r>
-                              <w:rPr>
-                                <w:rFonts w:cs="Tahoma"/>
-                              </w:rPr>
-                              <w:t xml:space="preserve"> </w:t>
+                              <w:t xml:space="preserve">Protocolo de pesquisa </w:t>
                             </w:r>
                             <w:r>
                               <w:rPr>
@@ -649,49 +643,7 @@
                               <w:rPr>
                                 <w:rFonts w:cs="Tahoma"/>
                               </w:rPr>
-                              <w:t>disciplina</w:t>
-                            </w:r>
-                            <w:r>
-                              <w:rPr>
-                                <w:rFonts w:cs="Tahoma"/>
-                              </w:rPr>
-                              <w:t xml:space="preserve"> de</w:t>
-                            </w:r>
-                            <w:r>
-                              <w:rPr>
-                                <w:rFonts w:cs="Tahoma"/>
-                              </w:rPr>
-                              <w:t xml:space="preserve"> </w:t>
-                            </w:r>
-                            <w:r>
-                              <w:rPr>
-                                <w:rFonts w:cs="Tahoma"/>
-                              </w:rPr>
-                              <w:t>Engenharia de Software</w:t>
-                            </w:r>
-                            <w:r>
-                              <w:rPr>
-                                <w:rFonts w:cs="Tahoma"/>
-                              </w:rPr>
-                              <w:t xml:space="preserve"> d</w:t>
-                            </w:r>
-                            <w:r>
-                              <w:rPr>
-                                <w:rFonts w:cs="Tahoma"/>
-                              </w:rPr>
-                              <w:t>o PPGCC da</w:t>
-                            </w:r>
-                            <w:r>
-                              <w:rPr>
-                                <w:rFonts w:cs="Tahoma"/>
-                              </w:rPr>
-                              <w:t xml:space="preserve"> </w:t>
-                            </w:r>
-                            <w:r>
-                              <w:rPr>
-                                <w:rFonts w:cs="Tahoma"/>
-                              </w:rPr>
-                              <w:t>UFG.</w:t>
+                              <w:t>disciplina de Engenharia de Software do PPGCC da UFG.</w:t>
                             </w:r>
                           </w:p>
                           <w:p>
@@ -700,10 +652,7 @@
                               <w:jc w:val="both"/>
                             </w:pPr>
                             <w:r>
-                              <w:t>Professor Orientador: Dr. Valdemar Vicente Graciano Neto</w:t>
-                            </w:r>
-                            <w:r>
-                              <w:t>.</w:t>
+                              <w:t>Professor Orientador: Dr. Valdemar Vicente Graciano Neto.</w:t>
                             </w:r>
                           </w:p>
                         </w:txbxContent>
@@ -1026,33 +975,8 @@
         <w:tab/>
       </w:r>
       <w:r>
-        <w:t>Este estudo consiste em um Mapeamento Sistemático de Literatura (MSL), caracterizado como uma pesquisa metodológica secundária. A condução deste trabalho segue estritamente as diretrizes e o framework propostos por Petersen et al. (2015), projetados para estruturar, categorizar e quantificar visualmente o estado da arte de um determinado campo de conhecimento. O processo é executado em cinco etapas sequenciais: (i) definição das questões de pesquisa; (</w:t>
-      </w:r>
-      <w:proofErr w:type="spellStart"/>
-      <w:r>
-        <w:t>ii</w:t>
-      </w:r>
-      <w:proofErr w:type="spellEnd"/>
-      <w:r>
-        <w:t>) condução da busca por estudos primários em bases de dados eletrônicas; (</w:t>
-      </w:r>
-      <w:proofErr w:type="spellStart"/>
-      <w:r>
-        <w:t>iii</w:t>
-      </w:r>
-      <w:proofErr w:type="spellEnd"/>
-      <w:r>
-        <w:t>) triagem dos estudos por meio da aplicação de critérios explícitos de inclusão e exclusão; (</w:t>
-      </w:r>
-      <w:proofErr w:type="spellStart"/>
-      <w:r>
-        <w:t>iv</w:t>
-      </w:r>
-      <w:proofErr w:type="spellEnd"/>
-      <w:r>
-        <w:t>) desenvolvimento de um esquema de classificação baseado em palavras-chave (</w:t>
-      </w:r>
-      <w:proofErr w:type="spellStart"/>
+        <w:t>Este estudo consiste em um Mapeamento Sistemático de Literatura (MSL), caracterizado como uma pesquisa metodológica secundária. A condução deste trabalho segue estritamente as diretrizes e o framework propostos por Petersen et al. (2015), projetados para estruturar, categorizar e quantificar visualmente o estado da arte de um determinado campo de conhecimento. O processo é executado em cinco etapas sequenciais: (i) definição das questões de pesquisa; (ii) condução da busca por estudos primários em bases de dados eletrônicas; (iii) triagem dos estudos por meio da aplicação de critérios explícitos de inclusão e exclusão; (iv) desenvolvimento de um esquema de classificação baseado em palavras-chave (</w:t>
+      </w:r>
       <w:r>
         <w:rPr>
           <w:i/>
@@ -1060,17 +984,8 @@
         </w:rPr>
         <w:t>keywording</w:t>
       </w:r>
-      <w:proofErr w:type="spellEnd"/>
-      <w:r>
-        <w:t xml:space="preserve">); e (v) extração de dados e mapeamento sistemático dos resultados. Adicionalmente, adota-se o guia de </w:t>
-      </w:r>
-      <w:proofErr w:type="spellStart"/>
-      <w:r>
-        <w:t>Kitchenham</w:t>
-      </w:r>
-      <w:proofErr w:type="spellEnd"/>
-      <w:r>
-        <w:t xml:space="preserve"> e Charters (2007) para assegurar o rigor técnico e a reprodutibilidade dos procedimentos de busca e seleção bibliográfica.</w:t>
+      <w:r>
+        <w:t>); e (v) extração de dados e mapeamento sistemático dos resultados. Adicionalmente, adota-se o guia de Kitchenham e Charters (2007) para assegurar o rigor técnico e a reprodutibilidade dos procedimentos de busca e seleção bibliográfica.</w:t>
       </w:r>
     </w:p>
     <w:p>
@@ -1081,113 +996,17 @@
         <w:tab/>
       </w:r>
       <w:r>
-        <w:t xml:space="preserve">Para a estruturação rigorosa das questões de pesquisa e identificação precisa das palavras-chave que compõem a </w:t>
-      </w:r>
-      <w:proofErr w:type="spellStart"/>
-      <w:r>
-        <w:t>string</w:t>
-      </w:r>
-      <w:proofErr w:type="spellEnd"/>
-      <w:r>
-        <w:t xml:space="preserve"> de busca, adota-se o framework PICOC (acrônimo para </w:t>
-      </w:r>
-      <w:proofErr w:type="spellStart"/>
-      <w:r>
-        <w:t>Population</w:t>
-      </w:r>
-      <w:proofErr w:type="spellEnd"/>
+        <w:t xml:space="preserve">Para a estruturação rigorosa das questões de pesquisa e identificação precisa das palavras-chave que compõem a string de busca, adota-se o framework PICOC (acrônimo para Population, Intervention, Comparison, Outcome, and Context). </w:t>
+      </w:r>
+      <w:r>
+        <w:t>Integrado</w:t>
+      </w:r>
+      <w:r>
+        <w:t xml:space="preserve"> formalmente à Engenharia de Software por Kitchenham e Charters (2007), essa estrutura estende os modelos tradicionais de revisão ao decompor o escopo da investigação em cinco dimensões fundamentais: (i) População (P), que delimita o grupo de interesse, papel ou área afetada; (ii) Intervenção (I), correspondente à tecnologia, ferramenta ou metodologia específica sob análise; (iii) Comparação (C), que identifica a alternativa ou estado atual com o qual a intervenção é contrastada; (iv) Resultado (Outcome - O), que define os efeitos, benefícios ou métricas de interesse a serem medidos; e (v) Contexto (C)</w:t>
+      </w:r>
       <w:r>
         <w:t xml:space="preserve">, </w:t>
       </w:r>
-      <w:proofErr w:type="spellStart"/>
-      <w:r>
-        <w:t>Intervention</w:t>
-      </w:r>
-      <w:proofErr w:type="spellEnd"/>
-      <w:r>
-        <w:t xml:space="preserve">, </w:t>
-      </w:r>
-      <w:proofErr w:type="spellStart"/>
-      <w:r>
-        <w:t>Comparison</w:t>
-      </w:r>
-      <w:proofErr w:type="spellEnd"/>
-      <w:r>
-        <w:t xml:space="preserve">, </w:t>
-      </w:r>
-      <w:proofErr w:type="spellStart"/>
-      <w:r>
-        <w:t>Outcome</w:t>
-      </w:r>
-      <w:proofErr w:type="spellEnd"/>
-      <w:r>
-        <w:t xml:space="preserve">, </w:t>
-      </w:r>
-      <w:proofErr w:type="spellStart"/>
-      <w:r>
-        <w:t>and</w:t>
-      </w:r>
-      <w:proofErr w:type="spellEnd"/>
-      <w:r>
-        <w:t xml:space="preserve"> </w:t>
-      </w:r>
-      <w:proofErr w:type="spellStart"/>
-      <w:r>
-        <w:t>Context</w:t>
-      </w:r>
-      <w:proofErr w:type="spellEnd"/>
-      <w:r>
-        <w:t xml:space="preserve">). </w:t>
-      </w:r>
-      <w:r>
-        <w:t>Integrado</w:t>
-      </w:r>
-      <w:r>
-        <w:t xml:space="preserve"> formalmente à Engenharia de Software por </w:t>
-      </w:r>
-      <w:proofErr w:type="spellStart"/>
-      <w:r>
-        <w:t>Kitchenham</w:t>
-      </w:r>
-      <w:proofErr w:type="spellEnd"/>
-      <w:r>
-        <w:t xml:space="preserve"> e Charters (2007), essa estrutura estende os modelos tradicionais de revisão ao decompor o escopo da investigação em cinco dimensões fundamentais: (i) População (P), que delimita o grupo de interesse, papel ou área afetada; (</w:t>
-      </w:r>
-      <w:proofErr w:type="spellStart"/>
-      <w:r>
-        <w:t>ii</w:t>
-      </w:r>
-      <w:proofErr w:type="spellEnd"/>
-      <w:r>
-        <w:t>) Intervenção (I), correspondente à tecnologia, ferramenta ou metodologia específica sob análise; (</w:t>
-      </w:r>
-      <w:proofErr w:type="spellStart"/>
-      <w:r>
-        <w:t>iii</w:t>
-      </w:r>
-      <w:proofErr w:type="spellEnd"/>
-      <w:r>
-        <w:t>) Comparação (C), que identifica a alternativa ou estado atual com o qual a intervenção é contrastada; (</w:t>
-      </w:r>
-      <w:proofErr w:type="spellStart"/>
-      <w:r>
-        <w:t>iv</w:t>
-      </w:r>
-      <w:proofErr w:type="spellEnd"/>
-      <w:r>
-        <w:t>) Resultado (</w:t>
-      </w:r>
-      <w:proofErr w:type="spellStart"/>
-      <w:r>
-        <w:t>Outcome</w:t>
-      </w:r>
-      <w:proofErr w:type="spellEnd"/>
-      <w:r>
-        <w:t xml:space="preserve"> - O), que define os efeitos, benefícios ou métricas de interesse a serem medidos; e (v) Contexto (C)</w:t>
-      </w:r>
-      <w:r>
-        <w:t xml:space="preserve">, </w:t>
-      </w:r>
       <w:r>
         <w:t>que especifica o ambiente ou cenário no qual a investigação se insere, delimitando o escopo da pesquisa em termos de domínio, tipo de estudo ou período considerado.</w:t>
       </w:r>
@@ -1200,63 +1019,7 @@
         <w:tab/>
       </w:r>
       <w:r>
-        <w:t xml:space="preserve">Para a definição estruturada e alinhamento do escopo deste estudo, adota-se a abordagem </w:t>
-      </w:r>
-      <w:proofErr w:type="spellStart"/>
-      <w:r>
-        <w:t>Goal-Question-Metric</w:t>
-      </w:r>
-      <w:proofErr w:type="spellEnd"/>
-      <w:r>
-        <w:t xml:space="preserve"> (GQM), desenvolvida originalmente por Basili e Weiss (1984) e consolidada por Basili (1992). O GQM é um paradigma de medição orientado a objetivos que estabelece uma estrutura hierárquica dividida em três níveis: (i) Conceitual (</w:t>
-      </w:r>
-      <w:proofErr w:type="spellStart"/>
-      <w:r>
-        <w:t>Goal</w:t>
-      </w:r>
-      <w:proofErr w:type="spellEnd"/>
-      <w:r>
-        <w:t>), onde se define o objetivo principal da investigação sob uma perspectiva e contexto específicos; (</w:t>
-      </w:r>
-      <w:proofErr w:type="spellStart"/>
-      <w:r>
-        <w:t>ii</w:t>
-      </w:r>
-      <w:proofErr w:type="spellEnd"/>
-      <w:r>
-        <w:t>) Operacional (</w:t>
-      </w:r>
-      <w:proofErr w:type="spellStart"/>
-      <w:r>
-        <w:t>Question</w:t>
-      </w:r>
-      <w:proofErr w:type="spellEnd"/>
-      <w:r>
-        <w:t>), no qual o objetivo é refinado em um conjunto de questões que caracterizam o objeto de estudo de forma quantificável; e (</w:t>
-      </w:r>
-      <w:proofErr w:type="spellStart"/>
-      <w:r>
-        <w:t>iii</w:t>
-      </w:r>
-      <w:proofErr w:type="spellEnd"/>
-      <w:r>
-        <w:t>) Quantitativo (</w:t>
-      </w:r>
-      <w:proofErr w:type="spellStart"/>
-      <w:r>
-        <w:t>Metric</w:t>
-      </w:r>
-      <w:proofErr w:type="spellEnd"/>
-      <w:r>
-        <w:t xml:space="preserve">), onde são associadas as métricas de dados necessárias para responder satisfatoriamente a cada questão formulada. No âmbito deste protocolo, a aplicação do framework GQM garante que a coleta e a análise das evidências da literatura estejam rigorosamente vinculadas às metas centrais da pesquisa, evitando a inclusão de métricas </w:t>
-      </w:r>
-      <w:proofErr w:type="spellStart"/>
-      <w:r>
-        <w:t>ad-hoc</w:t>
-      </w:r>
-      <w:proofErr w:type="spellEnd"/>
-      <w:r>
-        <w:t xml:space="preserve"> ou desconexas do propósito científico.</w:t>
+        <w:t>Para a definição estruturada e alinhamento do escopo deste estudo, adota-se a abordagem Goal-Question-Metric (GQM), desenvolvida originalmente por Basili e Weiss (1984) e consolidada por Basili (1992). O GQM é um paradigma de medição orientado a objetivos que estabelece uma estrutura hierárquica dividida em três níveis: (i) Conceitual (Goal), onde se define o objetivo principal da investigação sob uma perspectiva e contexto específicos; (ii) Operacional (Question), no qual o objetivo é refinado em um conjunto de questões que caracterizam o objeto de estudo de forma quantificável; e (iii) Quantitativo (Metric), onde são associadas as métricas de dados necessárias para responder satisfatoriamente a cada questão formulada. No âmbito deste protocolo, a aplicação do framework GQM garante que a coleta e a análise das evidências da literatura estejam rigorosamente vinculadas às metas centrais da pesquisa, evitando a inclusão de métricas ad-hoc ou desconexas do propósito científico.</w:t>
       </w:r>
     </w:p>
     <w:p/>
@@ -1345,7 +1108,122 @@
           <w:bCs/>
         </w:rPr>
         <w:lastRenderedPageBreak/>
-        <w:t>1</w:t>
+        <w:t>1. OBJETIVO</w:t>
+      </w:r>
+      <w:r>
+        <w:rPr>
+          <w:b/>
+          <w:bCs/>
+        </w:rPr>
+        <w:t xml:space="preserve"> GQM</w:t>
+      </w:r>
+    </w:p>
+    <w:p>
+      <w:pPr>
+        <w:rPr>
+          <w:b/>
+          <w:bCs/>
+        </w:rPr>
+      </w:pPr>
+    </w:p>
+    <w:p>
+      <w:r>
+        <w:rPr>
+          <w:b/>
+          <w:bCs/>
+        </w:rPr>
+        <w:t>Analisar</w:t>
+      </w:r>
+      <w:r>
+        <w:t xml:space="preserve"> abordagens de Retrieval-Augmented Generation (RAG) </w:t>
+      </w:r>
+    </w:p>
+    <w:p>
+      <w:r>
+        <w:t xml:space="preserve">            baseadas em Large Language Models (LLMs)</w:t>
+      </w:r>
+    </w:p>
+    <w:p>
+      <w:r>
+        <w:t xml:space="preserve">            aplicadas a codebases de software</w:t>
+      </w:r>
+    </w:p>
+    <w:p>
+      <w:r>
+        <w:rPr>
+          <w:b/>
+          <w:bCs/>
+        </w:rPr>
+        <w:t>com o propósito de</w:t>
+      </w:r>
+      <w:r>
+        <w:t xml:space="preserve"> identificar e classificar</w:t>
+      </w:r>
+      <w:r>
+        <w:t xml:space="preserve"> suas</w:t>
+      </w:r>
+      <w:r>
+        <w:t xml:space="preserve"> técnicas, LLMs empregadas,</w:t>
+      </w:r>
+    </w:p>
+    <w:p>
+      <w:r>
+        <w:t xml:space="preserve">            linguagens</w:t>
+      </w:r>
+      <w:r>
+        <w:t xml:space="preserve"> de programação e tipos de </w:t>
+      </w:r>
+      <w:r>
+        <w:t>sistemas estudados,</w:t>
+      </w:r>
+    </w:p>
+    <w:p>
+      <w:r>
+        <w:t xml:space="preserve">            métricas de avaliação e lacunas existentes</w:t>
+      </w:r>
+    </w:p>
+    <w:p>
+      <w:r>
+        <w:rPr>
+          <w:b/>
+          <w:bCs/>
+        </w:rPr>
+        <w:t>do ponto de vista de</w:t>
+      </w:r>
+      <w:r>
+        <w:t xml:space="preserve"> pesquisadores e praticantes de Engenharia de Software</w:t>
+      </w:r>
+    </w:p>
+    <w:p>
+      <w:r>
+        <w:rPr>
+          <w:b/>
+          <w:bCs/>
+        </w:rPr>
+        <w:t>no contexto de</w:t>
+      </w:r>
+      <w:r>
+        <w:t xml:space="preserve"> estudos primários publicados entre 2020 e 2026</w:t>
+      </w:r>
+      <w:r>
+        <w:t>.</w:t>
+      </w:r>
+    </w:p>
+    <w:p/>
+    <w:p/>
+    <w:p>
+      <w:pPr>
+        <w:rPr>
+          <w:b/>
+          <w:bCs/>
+        </w:rPr>
+      </w:pPr>
+      <w:r>
+        <w:rPr>
+          <w:b/>
+          <w:bCs/>
+        </w:rPr>
+        <w:t>2</w:t>
       </w:r>
       <w:r>
         <w:rPr>
@@ -1359,175 +1237,6 @@
           <w:b/>
           <w:bCs/>
         </w:rPr>
-        <w:t>OBJETIVO</w:t>
-      </w:r>
-      <w:r>
-        <w:rPr>
-          <w:b/>
-          <w:bCs/>
-        </w:rPr>
-        <w:t xml:space="preserve"> GQM</w:t>
-      </w:r>
-    </w:p>
-    <w:p>
-      <w:pPr>
-        <w:rPr>
-          <w:b/>
-          <w:bCs/>
-        </w:rPr>
-      </w:pPr>
-    </w:p>
-    <w:p>
-      <w:r>
-        <w:rPr>
-          <w:b/>
-          <w:bCs/>
-        </w:rPr>
-        <w:t>Analisar</w:t>
-      </w:r>
-      <w:r>
-        <w:t xml:space="preserve"> abordagens de </w:t>
-      </w:r>
-      <w:proofErr w:type="spellStart"/>
-      <w:r>
-        <w:t>Retrieval-Augmented</w:t>
-      </w:r>
-      <w:proofErr w:type="spellEnd"/>
-      <w:r>
-        <w:t xml:space="preserve"> Generation (RAG) </w:t>
-      </w:r>
-    </w:p>
-    <w:p>
-      <w:r>
-        <w:t xml:space="preserve">            baseadas em Large </w:t>
-      </w:r>
-      <w:proofErr w:type="spellStart"/>
-      <w:r>
-        <w:t>Language</w:t>
-      </w:r>
-      <w:proofErr w:type="spellEnd"/>
-      <w:r>
-        <w:t xml:space="preserve"> Models (</w:t>
-      </w:r>
-      <w:proofErr w:type="spellStart"/>
-      <w:r>
-        <w:t>LLMs</w:t>
-      </w:r>
-      <w:proofErr w:type="spellEnd"/>
-      <w:r>
-        <w:t>)</w:t>
-      </w:r>
-    </w:p>
-    <w:p>
-      <w:r>
-        <w:t xml:space="preserve">            aplicadas a </w:t>
-      </w:r>
-      <w:proofErr w:type="spellStart"/>
-      <w:r>
-        <w:t>codebases</w:t>
-      </w:r>
-      <w:proofErr w:type="spellEnd"/>
-      <w:r>
-        <w:t xml:space="preserve"> de software</w:t>
-      </w:r>
-    </w:p>
-    <w:p>
-      <w:r>
-        <w:rPr>
-          <w:b/>
-          <w:bCs/>
-        </w:rPr>
-        <w:t>com o propósito de</w:t>
-      </w:r>
-      <w:r>
-        <w:t xml:space="preserve"> identificar e classificar</w:t>
-      </w:r>
-      <w:r>
-        <w:t xml:space="preserve"> suas</w:t>
-      </w:r>
-      <w:r>
-        <w:t xml:space="preserve"> técnicas, </w:t>
-      </w:r>
-      <w:proofErr w:type="spellStart"/>
-      <w:r>
-        <w:t>LLMs</w:t>
-      </w:r>
-      <w:proofErr w:type="spellEnd"/>
-      <w:r>
-        <w:t xml:space="preserve"> empregadas,</w:t>
-      </w:r>
-    </w:p>
-    <w:p>
-      <w:r>
-        <w:t xml:space="preserve">            linguagens</w:t>
-      </w:r>
-      <w:r>
-        <w:t xml:space="preserve"> de programação e tipos de </w:t>
-      </w:r>
-      <w:r>
-        <w:t>sistemas estudados,</w:t>
-      </w:r>
-    </w:p>
-    <w:p>
-      <w:r>
-        <w:t xml:space="preserve">            métricas de avaliação e lacunas existentes</w:t>
-      </w:r>
-    </w:p>
-    <w:p>
-      <w:r>
-        <w:rPr>
-          <w:b/>
-          <w:bCs/>
-        </w:rPr>
-        <w:t>do ponto de vista de</w:t>
-      </w:r>
-      <w:r>
-        <w:t xml:space="preserve"> pesquisadores e praticantes de Engenharia de Software</w:t>
-      </w:r>
-    </w:p>
-    <w:p>
-      <w:r>
-        <w:rPr>
-          <w:b/>
-          <w:bCs/>
-        </w:rPr>
-        <w:t>no contexto de</w:t>
-      </w:r>
-      <w:r>
-        <w:t xml:space="preserve"> estudos primários publicados entre 2020 e 2026</w:t>
-      </w:r>
-      <w:r>
-        <w:t>.</w:t>
-      </w:r>
-    </w:p>
-    <w:p/>
-    <w:p/>
-    <w:p>
-      <w:pPr>
-        <w:rPr>
-          <w:b/>
-          <w:bCs/>
-        </w:rPr>
-      </w:pPr>
-      <w:r>
-        <w:rPr>
-          <w:b/>
-          <w:bCs/>
-        </w:rPr>
-        <w:t>2</w:t>
-      </w:r>
-      <w:r>
-        <w:rPr>
-          <w:b/>
-          <w:bCs/>
-        </w:rPr>
-        <w:t xml:space="preserve">. </w:t>
-      </w:r>
-      <w:r>
-        <w:rPr>
-          <w:b/>
-          <w:bCs/>
-        </w:rPr>
         <w:t>QUESTÕES DE PESQUISA</w:t>
       </w:r>
     </w:p>
@@ -1544,28 +1253,15 @@
         <w:jc w:val="both"/>
       </w:pPr>
       <w:r>
-        <w:t xml:space="preserve">- RQ1: Quais técnicas e arquiteturas de RAG são propostas para aplicação em </w:t>
-      </w:r>
-      <w:proofErr w:type="spellStart"/>
-      <w:r>
-        <w:t>codebases</w:t>
-      </w:r>
-      <w:proofErr w:type="spellEnd"/>
-      <w:r>
-        <w:t xml:space="preserve"> de software?</w:t>
+        <w:t>- RQ1: Quais técnicas e arquiteturas de RAG são propostas para aplicação em codebases de software?</w:t>
       </w:r>
     </w:p>
     <w:p>
       <w:pPr>
         <w:jc w:val="both"/>
       </w:pPr>
-      <w:proofErr w:type="spellStart"/>
-      <w:r>
-        <w:t>Rationale</w:t>
-      </w:r>
-      <w:proofErr w:type="spellEnd"/>
-      <w:r>
-        <w:t>: Identificar e classificar as arquiteturas existentes: permite consolidar o estado da arte quanto às estratégias de recuperação e processamento de código, servindo de base para as demais questões do mapeamento.</w:t>
+      <w:r>
+        <w:t>Rationale: Identificar e classificar as arquiteturas existentes: permite consolidar o estado da arte quanto às estratégias de recuperação e processamento de código, servindo de base para as demais questões do mapeamento.</w:t>
       </w:r>
     </w:p>
     <w:p>
@@ -1578,44 +1274,15 @@
         <w:jc w:val="both"/>
       </w:pPr>
       <w:r>
-        <w:t xml:space="preserve">- RQ2: Quais Large </w:t>
-      </w:r>
-      <w:proofErr w:type="spellStart"/>
-      <w:r>
-        <w:t>Language</w:t>
-      </w:r>
-      <w:proofErr w:type="spellEnd"/>
-      <w:r>
-        <w:t xml:space="preserve"> Models são empregadas como componente gerador nas abordagens de RAG para </w:t>
-      </w:r>
-      <w:proofErr w:type="spellStart"/>
-      <w:r>
-        <w:t>codebases</w:t>
-      </w:r>
-      <w:proofErr w:type="spellEnd"/>
-      <w:r>
-        <w:t>?</w:t>
+        <w:t>- RQ2: Quais Large Language Models são empregadas como componente gerador nas abordagens de RAG para codebases?</w:t>
       </w:r>
     </w:p>
     <w:p>
       <w:pPr>
         <w:jc w:val="both"/>
       </w:pPr>
-      <w:proofErr w:type="spellStart"/>
-      <w:r>
-        <w:t>Rationale</w:t>
-      </w:r>
-      <w:proofErr w:type="spellEnd"/>
-      <w:r>
-        <w:t xml:space="preserve">: Compreender quais </w:t>
-      </w:r>
-      <w:proofErr w:type="spellStart"/>
-      <w:r>
-        <w:t>LLMs</w:t>
-      </w:r>
-      <w:proofErr w:type="spellEnd"/>
-      <w:r>
-        <w:t xml:space="preserve"> são predominantemente adotadas auxilia pesquisadores e praticantes na seleção de modelos adequados para implementações futuras, além de revelar tendências de adoção na área.</w:t>
+      <w:r>
+        <w:t>Rationale: Compreender quais LLMs são predominantemente adotadas auxilia pesquisadores e praticantes na seleção de modelos adequados para implementações futuras, além de revelar tendências de adoção na área.</w:t>
       </w:r>
     </w:p>
     <w:p>
@@ -1635,13 +1302,8 @@
       <w:pPr>
         <w:jc w:val="both"/>
       </w:pPr>
-      <w:proofErr w:type="spellStart"/>
-      <w:r>
-        <w:t>Rationale</w:t>
-      </w:r>
-      <w:proofErr w:type="spellEnd"/>
-      <w:r>
-        <w:t>: Conhecer o escopo das linguagens e sistemas investigados evidencia o alcance das abordagens propostas e possíveis vieses de cobertura na literatura.</w:t>
+      <w:r>
+        <w:t>Rationale: Conhecer o escopo das linguagens e sistemas investigados evidencia o alcance das abordagens propostas e possíveis vieses de cobertura na literatura.</w:t>
       </w:r>
     </w:p>
     <w:p>
@@ -1654,28 +1316,15 @@
         <w:jc w:val="both"/>
       </w:pPr>
       <w:r>
-        <w:t xml:space="preserve">- RQ4: Quais métricas são utilizadas para avaliar a efetividade das abordagens de RAG em </w:t>
-      </w:r>
-      <w:proofErr w:type="spellStart"/>
-      <w:r>
-        <w:t>codebases</w:t>
-      </w:r>
-      <w:proofErr w:type="spellEnd"/>
-      <w:r>
-        <w:t>?</w:t>
+        <w:t>- RQ4: Quais métricas são utilizadas para avaliar a efetividade das abordagens de RAG em codebases?</w:t>
       </w:r>
     </w:p>
     <w:p>
       <w:pPr>
         <w:jc w:val="both"/>
       </w:pPr>
-      <w:proofErr w:type="spellStart"/>
-      <w:r>
-        <w:t>Rationale</w:t>
-      </w:r>
-      <w:proofErr w:type="spellEnd"/>
-      <w:r>
-        <w:t>: Mapear as métricas utilizadas permite avaliar o rigor dos estudos e identificar padrões de avaliação que possam orientar trabalhos futuros.</w:t>
+      <w:r>
+        <w:t>Rationale: Mapear as métricas utilizadas permite avaliar o rigor dos estudos e identificar padrões de avaliação que possam orientar trabalhos futuros.</w:t>
       </w:r>
     </w:p>
     <w:p>
@@ -1688,25 +1337,12 @@
         <w:jc w:val="both"/>
       </w:pPr>
       <w:r>
-        <w:t xml:space="preserve">- RQ5: Quais são as principais lacunas identificadas na literatura sobre RAG aplicado a </w:t>
-      </w:r>
-      <w:proofErr w:type="spellStart"/>
-      <w:r>
-        <w:t>codebases</w:t>
-      </w:r>
-      <w:proofErr w:type="spellEnd"/>
-      <w:r>
-        <w:t>?</w:t>
-      </w:r>
-    </w:p>
-    <w:p>
-      <w:proofErr w:type="spellStart"/>
-      <w:r>
-        <w:t>Rationale</w:t>
-      </w:r>
-      <w:proofErr w:type="spellEnd"/>
-      <w:r>
-        <w:t>: Identificar lacunas contribui diretamente para a agenda de pesquisa da área, apontando oportunidades para estudos futuros.</w:t>
+        <w:t>- RQ5: Quais são as principais lacunas identificadas na literatura sobre RAG aplicado a codebases?</w:t>
+      </w:r>
+    </w:p>
+    <w:p>
+      <w:r>
+        <w:t>Rationale: Identificar lacunas contribui diretamente para a agenda de pesquisa da área, apontando oportunidades para estudos futuros.</w:t>
       </w:r>
     </w:p>
     <w:p/>
@@ -1738,14 +1374,7 @@
           <w:b/>
           <w:bCs/>
         </w:rPr>
-        <w:t xml:space="preserve">. </w:t>
-      </w:r>
-      <w:r>
-        <w:rPr>
-          <w:b/>
-          <w:bCs/>
-        </w:rPr>
-        <w:t>PICOC</w:t>
+        <w:t>. PICOC</w:t>
       </w:r>
     </w:p>
     <w:p/>
@@ -1820,13 +1449,8 @@
             <w:pPr>
               <w:jc w:val="both"/>
             </w:pPr>
-            <w:proofErr w:type="spellStart"/>
-            <w:r>
-              <w:t>Codebases</w:t>
-            </w:r>
-            <w:proofErr w:type="spellEnd"/>
-            <w:r>
-              <w:t xml:space="preserve"> de software</w:t>
+            <w:r>
+              <w:t>Codebases de software</w:t>
             </w:r>
             <w:r>
               <w:t>:</w:t>
@@ -1866,15 +1490,7 @@
               <w:jc w:val="both"/>
             </w:pPr>
             <w:r>
-              <w:t xml:space="preserve">Abordagens de RAG baseadas em </w:t>
-            </w:r>
-            <w:proofErr w:type="spellStart"/>
-            <w:r>
-              <w:t>LLMs</w:t>
-            </w:r>
-            <w:proofErr w:type="spellEnd"/>
-            <w:r>
-              <w:t xml:space="preserve"> ou IA Generativa.</w:t>
+              <w:t>Abordagens de RAG baseadas em LLMs ou IA Generativa.</w:t>
             </w:r>
           </w:p>
         </w:tc>
@@ -1955,13 +1571,8 @@
             <w:pPr>
               <w:jc w:val="both"/>
             </w:pPr>
-            <w:proofErr w:type="spellStart"/>
-            <w:r>
-              <w:t>LLMs</w:t>
-            </w:r>
-            <w:proofErr w:type="spellEnd"/>
-            <w:r>
-              <w:t xml:space="preserve"> empregadas.</w:t>
+            <w:r>
+              <w:t>LLMs empregadas.</w:t>
             </w:r>
           </w:p>
           <w:p>
@@ -2045,144 +1656,30 @@
           <w:b/>
           <w:bCs/>
         </w:rPr>
-        <w:t>4</w:t>
-      </w:r>
-      <w:r>
-        <w:rPr>
-          <w:b/>
-          <w:bCs/>
-        </w:rPr>
-        <w:t>. S</w:t>
-      </w:r>
-      <w:r>
-        <w:rPr>
-          <w:b/>
-          <w:bCs/>
-        </w:rPr>
-        <w:t>TRINGS</w:t>
-      </w:r>
-      <w:r>
-        <w:rPr>
-          <w:b/>
-          <w:bCs/>
-        </w:rPr>
-        <w:t xml:space="preserve"> </w:t>
-      </w:r>
-      <w:r>
-        <w:rPr>
-          <w:b/>
-          <w:bCs/>
-        </w:rPr>
-        <w:t>DE</w:t>
-      </w:r>
-      <w:r>
-        <w:rPr>
-          <w:b/>
-          <w:bCs/>
-        </w:rPr>
-        <w:t xml:space="preserve"> B</w:t>
-      </w:r>
-      <w:r>
-        <w:rPr>
-          <w:b/>
-          <w:bCs/>
-        </w:rPr>
-        <w:t>USCA</w:t>
-      </w:r>
-    </w:p>
-    <w:p>
-      <w:pPr>
-        <w:rPr>
-          <w:b/>
-          <w:bCs/>
-        </w:rPr>
-      </w:pPr>
-    </w:p>
-    <w:p>
-      <w:r>
-        <w:t>("</w:t>
-      </w:r>
-      <w:proofErr w:type="spellStart"/>
-      <w:r>
-        <w:t>source</w:t>
-      </w:r>
-      <w:proofErr w:type="spellEnd"/>
-      <w:r>
-        <w:t xml:space="preserve"> </w:t>
-      </w:r>
-      <w:proofErr w:type="spellStart"/>
-      <w:r>
-        <w:t>code</w:t>
-      </w:r>
-      <w:proofErr w:type="spellEnd"/>
-      <w:r>
-        <w:t>" OR "</w:t>
-      </w:r>
-      <w:proofErr w:type="spellStart"/>
-      <w:r>
-        <w:t>codebase</w:t>
-      </w:r>
-      <w:proofErr w:type="spellEnd"/>
-      <w:r>
-        <w:t>" OR "</w:t>
-      </w:r>
-      <w:proofErr w:type="spellStart"/>
-      <w:r>
-        <w:t>code</w:t>
-      </w:r>
-      <w:proofErr w:type="spellEnd"/>
-      <w:r>
-        <w:t xml:space="preserve"> </w:t>
-      </w:r>
-      <w:proofErr w:type="spellStart"/>
-      <w:r>
-        <w:t>repository</w:t>
-      </w:r>
-      <w:proofErr w:type="spellEnd"/>
-      <w:r>
-        <w:t>") AND</w:t>
-      </w:r>
-    </w:p>
-    <w:p>
-      <w:r>
-        <w:t>("</w:t>
-      </w:r>
-      <w:proofErr w:type="spellStart"/>
-      <w:r>
-        <w:t>Retrieval-Augmented</w:t>
-      </w:r>
-      <w:proofErr w:type="spellEnd"/>
-      <w:r>
-        <w:t xml:space="preserve"> Generation" OR "RAG") AND</w:t>
-      </w:r>
-    </w:p>
-    <w:p>
-      <w:r>
-        <w:t xml:space="preserve">("LLM" OR "Large </w:t>
-      </w:r>
-      <w:proofErr w:type="spellStart"/>
-      <w:r>
-        <w:t>Language</w:t>
-      </w:r>
-      <w:proofErr w:type="spellEnd"/>
-      <w:r>
-        <w:t xml:space="preserve"> Model" OR "</w:t>
-      </w:r>
-      <w:proofErr w:type="spellStart"/>
-      <w:r>
-        <w:t>GenAI</w:t>
-      </w:r>
-      <w:proofErr w:type="spellEnd"/>
-      <w:r>
-        <w:t>" OR "</w:t>
-      </w:r>
-      <w:proofErr w:type="spellStart"/>
-      <w:r>
-        <w:t>Generative</w:t>
-      </w:r>
-      <w:proofErr w:type="spellEnd"/>
-      <w:r>
-        <w:t xml:space="preserve"> AI")</w:t>
+        <w:t>4. STRINGS DE BUSCA</w:t>
+      </w:r>
+    </w:p>
+    <w:p>
+      <w:pPr>
+        <w:rPr>
+          <w:b/>
+          <w:bCs/>
+        </w:rPr>
+      </w:pPr>
+    </w:p>
+    <w:p>
+      <w:r>
+        <w:t>("source code" OR "codebase" OR "code repository") AND</w:t>
+      </w:r>
+    </w:p>
+    <w:p>
+      <w:r>
+        <w:t>("Retrieval-Augmented Generation" OR "RAG") AND</w:t>
+      </w:r>
+    </w:p>
+    <w:p>
+      <w:r>
+        <w:t>("LLM" OR "Large Language Model" OR "GenAI" OR "Generative AI")</w:t>
       </w:r>
     </w:p>
     <w:p/>
@@ -2243,202 +1740,81 @@
           <w:i/>
           <w:iCs/>
         </w:rPr>
-        <w:t xml:space="preserve">- O “Resultado” não compõe a </w:t>
-      </w:r>
-      <w:proofErr w:type="spellStart"/>
-      <w:r>
+        <w:t>- O “Resultado” não compõe a string pois representa o que será extraído dos estudos, não um critério de busca.</w:t>
+      </w:r>
+    </w:p>
+    <w:p>
+      <w:pPr>
+        <w:jc w:val="both"/>
         <w:rPr>
           <w:i/>
           <w:iCs/>
         </w:rPr>
-        <w:t>string</w:t>
-      </w:r>
-      <w:proofErr w:type="spellEnd"/>
+      </w:pPr>
       <w:r>
         <w:rPr>
           <w:i/>
           <w:iCs/>
         </w:rPr>
-        <w:t xml:space="preserve"> pois representa o que será extraído dos estudos, não um critério de busca.</w:t>
-      </w:r>
-    </w:p>
-    <w:p>
-      <w:pPr>
-        <w:jc w:val="both"/>
+        <w:t xml:space="preserve">- </w:t>
+      </w:r>
+      <w:r>
         <w:rPr>
           <w:i/>
           <w:iCs/>
         </w:rPr>
-      </w:pPr>
-      <w:r>
+        <w:t>O "Contexto" não compõe a string de busca pois é garantido pelos critérios de seleção: a delimitação ao domínio de Engenharia de Software é assegurada pelo CI1, e a exigência de revisão por pares é assegurada pelo CE5.</w:t>
+      </w:r>
+    </w:p>
+    <w:p>
+      <w:pPr>
+        <w:jc w:val="both"/>
         <w:rPr>
           <w:i/>
           <w:iCs/>
         </w:rPr>
-        <w:t xml:space="preserve">- </w:t>
-      </w:r>
+      </w:pPr>
       <w:r>
         <w:rPr>
           <w:i/>
           <w:iCs/>
         </w:rPr>
-        <w:t xml:space="preserve">O "Contexto" não compõe a </w:t>
-      </w:r>
-      <w:proofErr w:type="spellStart"/>
+        <w:t xml:space="preserve">- </w:t>
+      </w:r>
       <w:r>
         <w:rPr>
           <w:i/>
           <w:iCs/>
         </w:rPr>
-        <w:t>string</w:t>
-      </w:r>
-      <w:proofErr w:type="spellEnd"/>
+        <w:t>Embora RAG e LLM componham conceitualmente a mesma Intervenção, eles são representados como dois grupos distintos conectados por AND na string de busca. Essa decisão é intencional: o AND garante que apenas estudos que tratam explicitamente da combinação RAG+LLM sejam recuperados, excluindo trabalhos sobre RAG sem base em modelos de linguagem de grande escala e trabalhos sobre LLMs aplicados a código sem componente de recuperação. Trata-se de uma escolha de precisão sobre sensibilidade. Está-se ciente de que artigos que referenciam modelos específicos (</w:t>
+      </w:r>
       <w:r>
         <w:rPr>
           <w:i/>
           <w:iCs/>
         </w:rPr>
-        <w:t xml:space="preserve"> de busca pois é garantido pelos critérios de seleção: a delimitação ao domínio de Engenharia de Software é assegurada pelo CI1, e a exigência de revisão por pares é assegurada pelo CE5.</w:t>
-      </w:r>
-    </w:p>
-    <w:p>
-      <w:pPr>
-        <w:jc w:val="both"/>
+        <w:t>Ex.:</w:t>
+      </w:r>
+      <w:r>
         <w:rPr>
           <w:i/>
           <w:iCs/>
         </w:rPr>
-      </w:pPr>
+        <w:t xml:space="preserve"> GPT, Llama, Gemini</w:t>
+      </w:r>
       <w:r>
         <w:rPr>
           <w:i/>
           <w:iCs/>
         </w:rPr>
-        <w:t xml:space="preserve">- </w:t>
+        <w:t>, Claude, etc.</w:t>
       </w:r>
       <w:r>
         <w:rPr>
           <w:i/>
           <w:iCs/>
         </w:rPr>
-        <w:t xml:space="preserve">Embora RAG e LLM componham conceitualmente a mesma Intervenção, eles são representados como dois grupos distintos conectados por AND na </w:t>
-      </w:r>
-      <w:proofErr w:type="spellStart"/>
-      <w:r>
-        <w:rPr>
-          <w:i/>
-          <w:iCs/>
-        </w:rPr>
-        <w:t>string</w:t>
-      </w:r>
-      <w:proofErr w:type="spellEnd"/>
-      <w:r>
-        <w:rPr>
-          <w:i/>
-          <w:iCs/>
-        </w:rPr>
-        <w:t xml:space="preserve"> de busca. Essa decisão é intencional: o AND garante que apenas estudos que tratam explicitamente da combinação RAG+LLM sejam recuperados, excluindo trabalhos sobre RAG sem base em modelos de linguagem de grande escala e trabalhos sobre </w:t>
-      </w:r>
-      <w:proofErr w:type="spellStart"/>
-      <w:r>
-        <w:rPr>
-          <w:i/>
-          <w:iCs/>
-        </w:rPr>
-        <w:t>LLMs</w:t>
-      </w:r>
-      <w:proofErr w:type="spellEnd"/>
-      <w:r>
-        <w:rPr>
-          <w:i/>
-          <w:iCs/>
-        </w:rPr>
-        <w:t xml:space="preserve"> aplicados a código sem componente de recuperação. Trata-se de uma escolha de precisão sobre sensibilidade. Está-se ciente de que artigos que referenciam modelos específicos (</w:t>
-      </w:r>
-      <w:r>
-        <w:rPr>
-          <w:i/>
-          <w:iCs/>
-        </w:rPr>
-        <w:t>Ex.:</w:t>
-      </w:r>
-      <w:r>
-        <w:rPr>
-          <w:i/>
-          <w:iCs/>
-        </w:rPr>
-        <w:t xml:space="preserve"> GPT, </w:t>
-      </w:r>
-      <w:proofErr w:type="spellStart"/>
-      <w:r>
-        <w:rPr>
-          <w:i/>
-          <w:iCs/>
-        </w:rPr>
-        <w:t>Llama</w:t>
-      </w:r>
-      <w:proofErr w:type="spellEnd"/>
-      <w:r>
-        <w:rPr>
-          <w:i/>
-          <w:iCs/>
-        </w:rPr>
-        <w:t>, Gemini</w:t>
-      </w:r>
-      <w:r>
-        <w:rPr>
-          <w:i/>
-          <w:iCs/>
-        </w:rPr>
-        <w:t xml:space="preserve">, </w:t>
-      </w:r>
-      <w:proofErr w:type="gramStart"/>
-      <w:r>
-        <w:rPr>
-          <w:i/>
-          <w:iCs/>
-        </w:rPr>
-        <w:t>Claude, etc.</w:t>
-      </w:r>
-      <w:proofErr w:type="gramEnd"/>
-      <w:r>
-        <w:rPr>
-          <w:i/>
-          <w:iCs/>
-        </w:rPr>
-        <w:t xml:space="preserve">) sem empregar os termos "LLM" ou "Large </w:t>
-      </w:r>
-      <w:proofErr w:type="spellStart"/>
-      <w:r>
-        <w:rPr>
-          <w:i/>
-          <w:iCs/>
-        </w:rPr>
-        <w:t>Language</w:t>
-      </w:r>
-      <w:proofErr w:type="spellEnd"/>
-      <w:r>
-        <w:rPr>
-          <w:i/>
-          <w:iCs/>
-        </w:rPr>
-        <w:t xml:space="preserve"> Model" podem não ser recuperados; para mitigar parcialmente esse risco, o termo "</w:t>
-      </w:r>
-      <w:proofErr w:type="spellStart"/>
-      <w:r>
-        <w:rPr>
-          <w:i/>
-          <w:iCs/>
-        </w:rPr>
-        <w:t>Generative</w:t>
-      </w:r>
-      <w:proofErr w:type="spellEnd"/>
-      <w:r>
-        <w:rPr>
-          <w:i/>
-          <w:iCs/>
-        </w:rPr>
-        <w:t xml:space="preserve"> AI" foi incluído como hiperônimo de uso corrente na literatura, aumentando a chance de cobertura indireta desses modelos. Essa decisão é documentada aqui para fins de rastreabilidade e reprodutibilidade da busca.</w:t>
+        <w:t>) sem empregar os termos "LLM" ou "Large Language Model" podem não ser recuperados; para mitigar parcialmente esse risco, o termo "Generative AI" foi incluído como hiperônimo de uso corrente na literatura, aumentando a chance de cobertura indireta desses modelos. Essa decisão é documentada aqui para fins de rastreabilidade e reprodutibilidade da busca.</w:t>
       </w:r>
     </w:p>
     <w:p/>
@@ -2457,14 +1833,7 @@
           <w:bCs/>
         </w:rPr>
         <w:lastRenderedPageBreak/>
-        <w:t>5</w:t>
-      </w:r>
-      <w:r>
-        <w:rPr>
-          <w:b/>
-          <w:bCs/>
-        </w:rPr>
-        <w:t xml:space="preserve">. </w:t>
+        <w:t xml:space="preserve">5. </w:t>
       </w:r>
       <w:r>
         <w:rPr>
@@ -2592,47 +1961,7 @@
               <w:jc w:val="both"/>
             </w:pPr>
             <w:r>
-              <w:t xml:space="preserve">Principal repositório de publicações da </w:t>
-            </w:r>
-            <w:proofErr w:type="spellStart"/>
-            <w:r>
-              <w:t>Association</w:t>
-            </w:r>
-            <w:proofErr w:type="spellEnd"/>
-            <w:r>
-              <w:t xml:space="preserve"> for </w:t>
-            </w:r>
-            <w:proofErr w:type="spellStart"/>
-            <w:r>
-              <w:t>Computing</w:t>
-            </w:r>
-            <w:proofErr w:type="spellEnd"/>
-            <w:r>
-              <w:t xml:space="preserve"> Machinery (ACM), com cobertura abrangente de Engenharia de Software e áreas correlatas. Indexa </w:t>
-            </w:r>
-            <w:proofErr w:type="spellStart"/>
-            <w:r>
-              <w:t>venues</w:t>
-            </w:r>
-            <w:proofErr w:type="spellEnd"/>
-            <w:r>
-              <w:t xml:space="preserve"> de alto impacto como ESEC/FSE, ISSTA, ICSE (</w:t>
-            </w:r>
-            <w:proofErr w:type="spellStart"/>
-            <w:r>
-              <w:t>co-publicada</w:t>
-            </w:r>
-            <w:proofErr w:type="spellEnd"/>
-            <w:r>
-              <w:t xml:space="preserve"> com IEEE) e periódicos como TOSEM e CACM. Oferece busca avançada com operadores booleanos e exportação estruturada em </w:t>
-            </w:r>
-            <w:proofErr w:type="spellStart"/>
-            <w:r>
-              <w:t>BibTeX</w:t>
-            </w:r>
-            <w:proofErr w:type="spellEnd"/>
-            <w:r>
-              <w:t xml:space="preserve"> </w:t>
+              <w:t xml:space="preserve">Principal repositório de publicações da Association for Computing Machinery (ACM), com cobertura abrangente de Engenharia de Software e áreas correlatas. Indexa venues de alto impacto como ESEC/FSE, ISSTA, ICSE (co-publicada com IEEE) e periódicos como TOSEM e CACM. Oferece busca avançada com operadores booleanos e exportação estruturada em BibTeX </w:t>
             </w:r>
             <w:r>
               <w:t>-</w:t>
@@ -2650,13 +1979,8 @@
           </w:tcPr>
           <w:p>
             <w:r>
-              <w:t xml:space="preserve">IEEE </w:t>
-            </w:r>
-            <w:proofErr w:type="spellStart"/>
-            <w:r>
-              <w:t>Xplore</w:t>
-            </w:r>
-            <w:proofErr w:type="spellEnd"/>
+              <w:t>IEEE Xplore</w:t>
+            </w:r>
           </w:p>
         </w:tc>
         <w:tc>
@@ -2678,15 +2002,7 @@
               <w:jc w:val="both"/>
             </w:pPr>
             <w:r>
-              <w:t>Principal repositório de publicações IEEE e IET em Engenharia de Software, Computação e áreas afins. Indexa conferências de alto impacto como ICSE, ASE, SANER e MSR, além dos principais periódicos da área (e.g., IEEE TSE, IEEE Software). Oferece busca avançada com exportação em CSV/</w:t>
-            </w:r>
-            <w:proofErr w:type="spellStart"/>
-            <w:r>
-              <w:t>BibTeX</w:t>
-            </w:r>
-            <w:proofErr w:type="spellEnd"/>
-            <w:r>
-              <w:t>.</w:t>
+              <w:t>Principal repositório de publicações IEEE e IET em Engenharia de Software, Computação e áreas afins. Indexa conferências de alto impacto como ICSE, ASE, SANER e MSR, além dos principais periódicos da área (e.g., IEEE TSE, IEEE Software). Oferece busca avançada com exportação em CSV/BibTeX.</w:t>
             </w:r>
           </w:p>
         </w:tc>
@@ -2738,85 +2054,21 @@
           <w:i/>
           <w:iCs/>
         </w:rPr>
-        <w:t xml:space="preserve">Observação: As bases selecionadas apresentam sobreposição intencional de cobertura. O Scopus indexa publicações da ACM e do IEEE, podendo duplicar resultados já retornados pela ACM Digital Library e pelo IEEE </w:t>
-      </w:r>
-      <w:proofErr w:type="spellStart"/>
+        <w:t xml:space="preserve">Observação: As bases selecionadas apresentam sobreposição intencional de cobertura. O Scopus indexa publicações da ACM e do IEEE, podendo duplicar resultados já retornados pela ACM Digital Library e pelo IEEE Xplore. Adicionalmente, alguns venues são co-publicados por mais de uma editora </w:t>
+      </w:r>
       <w:r>
         <w:rPr>
           <w:i/>
           <w:iCs/>
         </w:rPr>
-        <w:t>Xplore</w:t>
-      </w:r>
-      <w:proofErr w:type="spellEnd"/>
+        <w:t>(</w:t>
+      </w:r>
       <w:r>
         <w:rPr>
           <w:i/>
           <w:iCs/>
         </w:rPr>
-        <w:t xml:space="preserve">. Adicionalmente, alguns </w:t>
-      </w:r>
-      <w:proofErr w:type="spellStart"/>
-      <w:r>
-        <w:rPr>
-          <w:i/>
-          <w:iCs/>
-        </w:rPr>
-        <w:t>venues</w:t>
-      </w:r>
-      <w:proofErr w:type="spellEnd"/>
-      <w:r>
-        <w:rPr>
-          <w:i/>
-          <w:iCs/>
-        </w:rPr>
-        <w:t xml:space="preserve"> são </w:t>
-      </w:r>
-      <w:proofErr w:type="spellStart"/>
-      <w:r>
-        <w:rPr>
-          <w:i/>
-          <w:iCs/>
-        </w:rPr>
-        <w:t>co-publicados</w:t>
-      </w:r>
-      <w:proofErr w:type="spellEnd"/>
-      <w:r>
-        <w:rPr>
-          <w:i/>
-          <w:iCs/>
-        </w:rPr>
-        <w:t xml:space="preserve"> por mais de uma editora </w:t>
-      </w:r>
-      <w:r>
-        <w:rPr>
-          <w:i/>
-          <w:iCs/>
-        </w:rPr>
-        <w:t>(</w:t>
-      </w:r>
-      <w:r>
-        <w:rPr>
-          <w:i/>
-          <w:iCs/>
-        </w:rPr>
-        <w:t xml:space="preserve">notadamente o ICSE, </w:t>
-      </w:r>
-      <w:proofErr w:type="spellStart"/>
-      <w:r>
-        <w:rPr>
-          <w:i/>
-          <w:iCs/>
-        </w:rPr>
-        <w:t>co-publicado</w:t>
-      </w:r>
-      <w:proofErr w:type="spellEnd"/>
-      <w:r>
-        <w:rPr>
-          <w:i/>
-          <w:iCs/>
-        </w:rPr>
-        <w:t xml:space="preserve"> pela ACM e pelo IEEE</w:t>
+        <w:t>notadamente o ICSE, co-publicado pela ACM e pelo IEEE</w:t>
       </w:r>
       <w:r>
         <w:rPr>
@@ -2989,10 +2241,7 @@
               <w:t xml:space="preserve">cujo foco principal seja a aplicação </w:t>
             </w:r>
             <w:r>
-              <w:t xml:space="preserve">a artefatos de código-fonte </w:t>
-            </w:r>
-            <w:r>
-              <w:t>(código de produção, documentação técnica gerada a partir de código, testes automatizados, scripts de infraestrutura ou queries de banco de dados).</w:t>
+              <w:t>a artefatos de código-fonte (código de produção, documentação técnica gerada a partir de código, testes automatizados, scripts de infraestrutura ou queries de banco de dados).</w:t>
             </w:r>
           </w:p>
         </w:tc>
@@ -3114,10 +2363,7 @@
               <w:jc w:val="both"/>
             </w:pPr>
             <w:r>
-              <w:t>P</w:t>
-            </w:r>
-            <w:r>
-              <w:t>ublicado fora do período de janeiro de 2020 a abril de 2026.</w:t>
+              <w:t>O artigo não satisfaz o critério de inclusão CI1.</w:t>
             </w:r>
           </w:p>
         </w:tc>
@@ -3195,15 +2441,7 @@
               <w:t>e</w:t>
             </w:r>
             <w:r>
-              <w:t xml:space="preserve">m caso de mesmo trabalho em múltiplos </w:t>
-            </w:r>
-            <w:proofErr w:type="spellStart"/>
-            <w:r>
-              <w:t>venues</w:t>
-            </w:r>
-            <w:proofErr w:type="spellEnd"/>
-            <w:r>
-              <w:t xml:space="preserve">, manter apenas a versão publicada com </w:t>
+              <w:t xml:space="preserve">m caso de mesmo trabalho em múltiplos venues, manter apenas a versão publicada com </w:t>
             </w:r>
             <w:r>
               <w:t>revisão</w:t>
@@ -3281,23 +2519,46 @@
               <w:jc w:val="both"/>
             </w:pPr>
             <w:r>
-              <w:t xml:space="preserve">Literatura cinzenta: </w:t>
-            </w:r>
-            <w:proofErr w:type="spellStart"/>
-            <w:r>
-              <w:t>preprints</w:t>
-            </w:r>
-            <w:proofErr w:type="spellEnd"/>
-            <w:r>
-              <w:t xml:space="preserve">, relatórios técnicos, </w:t>
-            </w:r>
-            <w:proofErr w:type="spellStart"/>
-            <w:r>
-              <w:t>whitepapers</w:t>
-            </w:r>
-            <w:proofErr w:type="spellEnd"/>
-            <w:r>
-              <w:t>, posts e artigos sem revisão por pares formal.</w:t>
+              <w:t>Literatura cinzenta: preprints, relatórios técnicos, whitepapers, posts e artigos sem revisão por pares formal.</w:t>
+            </w:r>
+          </w:p>
+        </w:tc>
+      </w:tr>
+      <w:tr>
+        <w:tc>
+          <w:tcPr>
+            <w:tcW w:w="704" w:type="dxa"/>
+          </w:tcPr>
+          <w:p>
+            <w:pPr>
+              <w:jc w:val="center"/>
+              <w:rPr>
+                <w:b/>
+                <w:bCs/>
+              </w:rPr>
+            </w:pPr>
+            <w:r>
+              <w:rPr>
+                <w:b/>
+                <w:bCs/>
+              </w:rPr>
+              <w:t>CE6</w:t>
+            </w:r>
+          </w:p>
+        </w:tc>
+        <w:tc>
+          <w:tcPr>
+            <w:tcW w:w="8315" w:type="dxa"/>
+          </w:tcPr>
+          <w:p>
+            <w:pPr>
+              <w:jc w:val="both"/>
+            </w:pPr>
+            <w:r>
+              <w:t>P</w:t>
+            </w:r>
+            <w:r>
+              <w:t>ublicado fora do período de janeiro de 2020 a abril de 2026.</w:t>
             </w:r>
           </w:p>
         </w:tc>
@@ -3353,7 +2614,6 @@
           <w:b/>
           <w:bCs/>
         </w:rPr>
-        <w:lastRenderedPageBreak/>
         <w:t>REFERÊNCIAS</w:t>
       </w:r>
     </w:p>
@@ -3367,217 +2627,17 @@
           <w:sz w:val="24"/>
           <w:szCs w:val="24"/>
         </w:rPr>
-        <w:t>BASILI, Victor</w:t>
-      </w:r>
-      <w:r>
-        <w:rPr>
-          <w:sz w:val="24"/>
-          <w:szCs w:val="24"/>
-        </w:rPr>
-        <w:t xml:space="preserve"> </w:t>
-      </w:r>
-      <w:proofErr w:type="gramStart"/>
-      <w:r>
-        <w:rPr>
-          <w:sz w:val="24"/>
-          <w:szCs w:val="24"/>
-        </w:rPr>
-        <w:t>R.</w:t>
-      </w:r>
-      <w:r>
-        <w:rPr>
-          <w:sz w:val="24"/>
-          <w:szCs w:val="24"/>
-        </w:rPr>
-        <w:t>.</w:t>
-      </w:r>
-      <w:proofErr w:type="gramEnd"/>
-      <w:r>
-        <w:rPr>
-          <w:sz w:val="24"/>
-          <w:szCs w:val="24"/>
-        </w:rPr>
-        <w:t xml:space="preserve"> </w:t>
-      </w:r>
-      <w:r>
-        <w:rPr>
-          <w:sz w:val="24"/>
-          <w:szCs w:val="24"/>
-        </w:rPr>
-        <w:t xml:space="preserve">Software </w:t>
-      </w:r>
-      <w:proofErr w:type="spellStart"/>
-      <w:r>
-        <w:rPr>
-          <w:sz w:val="24"/>
-          <w:szCs w:val="24"/>
-        </w:rPr>
-        <w:t>Modeling</w:t>
-      </w:r>
-      <w:proofErr w:type="spellEnd"/>
-      <w:r>
-        <w:rPr>
-          <w:sz w:val="24"/>
-          <w:szCs w:val="24"/>
-        </w:rPr>
-        <w:t xml:space="preserve"> </w:t>
-      </w:r>
-      <w:proofErr w:type="spellStart"/>
-      <w:r>
-        <w:rPr>
-          <w:sz w:val="24"/>
-          <w:szCs w:val="24"/>
-        </w:rPr>
-        <w:t>and</w:t>
-      </w:r>
-      <w:proofErr w:type="spellEnd"/>
-      <w:r>
-        <w:rPr>
-          <w:sz w:val="24"/>
-          <w:szCs w:val="24"/>
-        </w:rPr>
-        <w:t xml:space="preserve"> </w:t>
-      </w:r>
-      <w:proofErr w:type="spellStart"/>
-      <w:r>
-        <w:rPr>
-          <w:sz w:val="24"/>
-          <w:szCs w:val="24"/>
-        </w:rPr>
-        <w:t>Measurement</w:t>
-      </w:r>
-      <w:proofErr w:type="spellEnd"/>
-      <w:r>
-        <w:rPr>
-          <w:sz w:val="24"/>
-          <w:szCs w:val="24"/>
-        </w:rPr>
-        <w:t xml:space="preserve">: The </w:t>
-      </w:r>
-      <w:proofErr w:type="spellStart"/>
-      <w:r>
-        <w:rPr>
-          <w:sz w:val="24"/>
-          <w:szCs w:val="24"/>
-        </w:rPr>
-        <w:t>Goal</w:t>
-      </w:r>
-      <w:proofErr w:type="spellEnd"/>
-      <w:r>
-        <w:rPr>
-          <w:sz w:val="24"/>
-          <w:szCs w:val="24"/>
-        </w:rPr>
-        <w:t>/</w:t>
-      </w:r>
-      <w:proofErr w:type="spellStart"/>
-      <w:r>
-        <w:rPr>
-          <w:sz w:val="24"/>
-          <w:szCs w:val="24"/>
-        </w:rPr>
-        <w:t>Question</w:t>
-      </w:r>
-      <w:proofErr w:type="spellEnd"/>
-      <w:r>
-        <w:rPr>
-          <w:sz w:val="24"/>
-          <w:szCs w:val="24"/>
-        </w:rPr>
-        <w:t>/</w:t>
-      </w:r>
-      <w:proofErr w:type="spellStart"/>
-      <w:r>
-        <w:rPr>
-          <w:sz w:val="24"/>
-          <w:szCs w:val="24"/>
-        </w:rPr>
-        <w:t>Metric</w:t>
-      </w:r>
-      <w:proofErr w:type="spellEnd"/>
-      <w:r>
-        <w:rPr>
-          <w:sz w:val="24"/>
-          <w:szCs w:val="24"/>
-        </w:rPr>
-        <w:t xml:space="preserve"> </w:t>
-      </w:r>
-      <w:proofErr w:type="spellStart"/>
-      <w:r>
-        <w:rPr>
-          <w:sz w:val="24"/>
-          <w:szCs w:val="24"/>
-        </w:rPr>
-        <w:t>Paradigm</w:t>
-      </w:r>
-      <w:proofErr w:type="spellEnd"/>
-      <w:r>
-        <w:rPr>
-          <w:sz w:val="24"/>
-          <w:szCs w:val="24"/>
-        </w:rPr>
-        <w:t xml:space="preserve">. </w:t>
-      </w:r>
-      <w:proofErr w:type="spellStart"/>
-      <w:r>
-        <w:rPr>
-          <w:b/>
-          <w:bCs/>
-          <w:sz w:val="24"/>
-          <w:szCs w:val="24"/>
-        </w:rPr>
-        <w:t>I</w:t>
-      </w:r>
-      <w:r>
-        <w:rPr>
-          <w:b/>
-          <w:bCs/>
-          <w:sz w:val="24"/>
-          <w:szCs w:val="24"/>
-        </w:rPr>
-        <w:t>nstitute</w:t>
-      </w:r>
-      <w:proofErr w:type="spellEnd"/>
-      <w:r>
-        <w:rPr>
-          <w:b/>
-          <w:bCs/>
-          <w:sz w:val="24"/>
-          <w:szCs w:val="24"/>
-        </w:rPr>
-        <w:t xml:space="preserve"> for </w:t>
-      </w:r>
-      <w:proofErr w:type="spellStart"/>
-      <w:r>
-        <w:rPr>
-          <w:b/>
-          <w:bCs/>
-          <w:sz w:val="24"/>
-          <w:szCs w:val="24"/>
-        </w:rPr>
-        <w:t>Advanced</w:t>
-      </w:r>
-      <w:proofErr w:type="spellEnd"/>
-      <w:r>
-        <w:rPr>
-          <w:b/>
-          <w:bCs/>
-          <w:sz w:val="24"/>
-          <w:szCs w:val="24"/>
-        </w:rPr>
-        <w:t xml:space="preserve"> Computer </w:t>
-      </w:r>
-      <w:proofErr w:type="spellStart"/>
-      <w:r>
-        <w:rPr>
-          <w:b/>
-          <w:bCs/>
-          <w:sz w:val="24"/>
-          <w:szCs w:val="24"/>
-        </w:rPr>
-        <w:t>Studies</w:t>
-      </w:r>
-      <w:proofErr w:type="spellEnd"/>
+        <w:t xml:space="preserve">BASILI, Victor R.. Software Modeling and Measurement: The Goal/Question/Metric Paradigm. </w:t>
+      </w:r>
+      <w:r>
+        <w:rPr>
+          <w:b/>
+          <w:bCs/>
+          <w:sz w:val="24"/>
+          <w:szCs w:val="24"/>
+        </w:rPr>
+        <w:t>Institute for Advanced Computer Studies</w:t>
+      </w:r>
       <w:r>
         <w:rPr>
           <w:sz w:val="24"/>
@@ -3590,99 +2650,14 @@
           <w:sz w:val="24"/>
           <w:szCs w:val="24"/>
         </w:rPr>
-        <w:t xml:space="preserve"> </w:t>
-      </w:r>
-      <w:proofErr w:type="spellStart"/>
-      <w:r>
-        <w:rPr>
-          <w:sz w:val="24"/>
-          <w:szCs w:val="24"/>
-        </w:rPr>
-        <w:t>Department</w:t>
-      </w:r>
-      <w:proofErr w:type="spellEnd"/>
-      <w:r>
-        <w:rPr>
-          <w:sz w:val="24"/>
-          <w:szCs w:val="24"/>
-        </w:rPr>
-        <w:t xml:space="preserve"> </w:t>
-      </w:r>
-      <w:proofErr w:type="spellStart"/>
-      <w:r>
-        <w:rPr>
-          <w:sz w:val="24"/>
-          <w:szCs w:val="24"/>
-        </w:rPr>
-        <w:t>of</w:t>
-      </w:r>
-      <w:proofErr w:type="spellEnd"/>
-      <w:r>
-        <w:rPr>
-          <w:sz w:val="24"/>
-          <w:szCs w:val="24"/>
-        </w:rPr>
-        <w:t xml:space="preserve"> Computer Science,</w:t>
-      </w:r>
-      <w:r>
-        <w:rPr>
-          <w:sz w:val="24"/>
-          <w:szCs w:val="24"/>
-        </w:rPr>
-        <w:t xml:space="preserve"> </w:t>
-      </w:r>
-      <w:proofErr w:type="spellStart"/>
-      <w:r>
-        <w:rPr>
-          <w:sz w:val="24"/>
-          <w:szCs w:val="24"/>
-        </w:rPr>
-        <w:t>University</w:t>
-      </w:r>
-      <w:proofErr w:type="spellEnd"/>
-      <w:r>
-        <w:rPr>
-          <w:sz w:val="24"/>
-          <w:szCs w:val="24"/>
-        </w:rPr>
-        <w:t xml:space="preserve"> </w:t>
-      </w:r>
-      <w:proofErr w:type="spellStart"/>
-      <w:r>
-        <w:rPr>
-          <w:sz w:val="24"/>
-          <w:szCs w:val="24"/>
-        </w:rPr>
-        <w:t>of</w:t>
-      </w:r>
-      <w:proofErr w:type="spellEnd"/>
-      <w:r>
-        <w:rPr>
-          <w:sz w:val="24"/>
-          <w:szCs w:val="24"/>
-        </w:rPr>
-        <w:t xml:space="preserve"> Maryland</w:t>
-      </w:r>
-      <w:r>
-        <w:rPr>
-          <w:sz w:val="24"/>
-          <w:szCs w:val="24"/>
-        </w:rPr>
-        <w:t>, 1</w:t>
-      </w:r>
-      <w:r>
-        <w:rPr>
-          <w:sz w:val="24"/>
-          <w:szCs w:val="24"/>
-        </w:rPr>
-        <w:t>992</w:t>
-      </w:r>
-      <w:r>
-        <w:rPr>
-          <w:sz w:val="24"/>
-          <w:szCs w:val="24"/>
-        </w:rPr>
-        <w:t>.</w:t>
+        <w:t xml:space="preserve"> Department of Computer Science,</w:t>
+      </w:r>
+      <w:r>
+        <w:rPr>
+          <w:sz w:val="24"/>
+          <w:szCs w:val="24"/>
+        </w:rPr>
+        <w:t xml:space="preserve"> University of Maryland, 1992.</w:t>
       </w:r>
     </w:p>
     <w:p>
@@ -3699,224 +2674,23 @@
           <w:sz w:val="24"/>
           <w:szCs w:val="24"/>
         </w:rPr>
-        <w:t>BASILI</w:t>
-      </w:r>
-      <w:r>
-        <w:rPr>
-          <w:sz w:val="24"/>
-          <w:szCs w:val="24"/>
-        </w:rPr>
-        <w:t xml:space="preserve">, </w:t>
-      </w:r>
-      <w:r>
-        <w:rPr>
-          <w:sz w:val="24"/>
-          <w:szCs w:val="24"/>
-        </w:rPr>
-        <w:t>Victor</w:t>
-      </w:r>
-      <w:r>
-        <w:rPr>
-          <w:sz w:val="24"/>
-          <w:szCs w:val="24"/>
-        </w:rPr>
-        <w:t xml:space="preserve">; </w:t>
-      </w:r>
-      <w:r>
-        <w:rPr>
-          <w:sz w:val="24"/>
-          <w:szCs w:val="24"/>
-        </w:rPr>
-        <w:t>WEISS</w:t>
-      </w:r>
-      <w:r>
-        <w:rPr>
-          <w:sz w:val="24"/>
-          <w:szCs w:val="24"/>
-        </w:rPr>
-        <w:t xml:space="preserve">, </w:t>
-      </w:r>
-      <w:r>
-        <w:rPr>
-          <w:sz w:val="24"/>
-          <w:szCs w:val="24"/>
-        </w:rPr>
-        <w:t xml:space="preserve">David </w:t>
-      </w:r>
-      <w:proofErr w:type="gramStart"/>
-      <w:r>
-        <w:rPr>
-          <w:sz w:val="24"/>
-          <w:szCs w:val="24"/>
-        </w:rPr>
-        <w:t>M.</w:t>
-      </w:r>
-      <w:r>
-        <w:rPr>
-          <w:sz w:val="24"/>
-          <w:szCs w:val="24"/>
-        </w:rPr>
-        <w:t>.</w:t>
-      </w:r>
-      <w:proofErr w:type="gramEnd"/>
-      <w:r>
-        <w:rPr>
-          <w:sz w:val="24"/>
-          <w:szCs w:val="24"/>
-        </w:rPr>
-        <w:t xml:space="preserve"> </w:t>
-      </w:r>
-      <w:r>
-        <w:rPr>
-          <w:sz w:val="24"/>
-          <w:szCs w:val="24"/>
-        </w:rPr>
-        <w:t xml:space="preserve">A </w:t>
-      </w:r>
-      <w:proofErr w:type="spellStart"/>
-      <w:r>
-        <w:rPr>
-          <w:sz w:val="24"/>
-          <w:szCs w:val="24"/>
-        </w:rPr>
-        <w:t>Methodology</w:t>
-      </w:r>
-      <w:proofErr w:type="spellEnd"/>
-      <w:r>
-        <w:rPr>
-          <w:sz w:val="24"/>
-          <w:szCs w:val="24"/>
-        </w:rPr>
-        <w:t xml:space="preserve"> for </w:t>
-      </w:r>
-      <w:proofErr w:type="spellStart"/>
-      <w:r>
-        <w:rPr>
-          <w:sz w:val="24"/>
-          <w:szCs w:val="24"/>
-        </w:rPr>
-        <w:t>Collecting</w:t>
-      </w:r>
-      <w:proofErr w:type="spellEnd"/>
-      <w:r>
-        <w:rPr>
-          <w:sz w:val="24"/>
-          <w:szCs w:val="24"/>
-        </w:rPr>
-        <w:t xml:space="preserve"> </w:t>
-      </w:r>
-      <w:proofErr w:type="spellStart"/>
-      <w:r>
-        <w:rPr>
-          <w:sz w:val="24"/>
-          <w:szCs w:val="24"/>
-        </w:rPr>
-        <w:t>Valid</w:t>
-      </w:r>
-      <w:proofErr w:type="spellEnd"/>
-      <w:r>
-        <w:rPr>
-          <w:sz w:val="24"/>
-          <w:szCs w:val="24"/>
-        </w:rPr>
-        <w:t xml:space="preserve"> Software </w:t>
-      </w:r>
-      <w:proofErr w:type="spellStart"/>
-      <w:r>
-        <w:rPr>
-          <w:sz w:val="24"/>
-          <w:szCs w:val="24"/>
-        </w:rPr>
-        <w:t>Engineering</w:t>
-      </w:r>
-      <w:proofErr w:type="spellEnd"/>
-      <w:r>
-        <w:rPr>
-          <w:sz w:val="24"/>
-          <w:szCs w:val="24"/>
-        </w:rPr>
-        <w:t xml:space="preserve"> Data</w:t>
-      </w:r>
-      <w:r>
-        <w:rPr>
-          <w:sz w:val="24"/>
-          <w:szCs w:val="24"/>
-        </w:rPr>
-        <w:t xml:space="preserve">. </w:t>
-      </w:r>
-      <w:r>
-        <w:rPr>
-          <w:b/>
-          <w:bCs/>
-          <w:sz w:val="24"/>
-          <w:szCs w:val="24"/>
-        </w:rPr>
-        <w:t xml:space="preserve">IEEE </w:t>
-      </w:r>
-      <w:proofErr w:type="spellStart"/>
-      <w:r>
-        <w:rPr>
-          <w:b/>
-          <w:bCs/>
-          <w:sz w:val="24"/>
-          <w:szCs w:val="24"/>
-        </w:rPr>
-        <w:t>Transactions</w:t>
-      </w:r>
-      <w:proofErr w:type="spellEnd"/>
-      <w:r>
-        <w:rPr>
-          <w:b/>
-          <w:bCs/>
-          <w:sz w:val="24"/>
-          <w:szCs w:val="24"/>
-        </w:rPr>
-        <w:t xml:space="preserve"> </w:t>
-      </w:r>
-      <w:proofErr w:type="spellStart"/>
-      <w:r>
-        <w:rPr>
-          <w:b/>
-          <w:bCs/>
-          <w:sz w:val="24"/>
-          <w:szCs w:val="24"/>
-        </w:rPr>
-        <w:t>on</w:t>
-      </w:r>
-      <w:proofErr w:type="spellEnd"/>
-      <w:r>
-        <w:rPr>
-          <w:b/>
-          <w:bCs/>
-          <w:sz w:val="24"/>
-          <w:szCs w:val="24"/>
-        </w:rPr>
-        <w:t xml:space="preserve"> Software </w:t>
-      </w:r>
-      <w:proofErr w:type="spellStart"/>
-      <w:r>
-        <w:rPr>
-          <w:b/>
-          <w:bCs/>
-          <w:sz w:val="24"/>
-          <w:szCs w:val="24"/>
-        </w:rPr>
-        <w:t>Engineering</w:t>
-      </w:r>
-      <w:proofErr w:type="spellEnd"/>
-      <w:r>
-        <w:rPr>
-          <w:sz w:val="24"/>
-          <w:szCs w:val="24"/>
-        </w:rPr>
-        <w:t xml:space="preserve">, </w:t>
-      </w:r>
-      <w:r>
-        <w:rPr>
-          <w:sz w:val="24"/>
-          <w:szCs w:val="24"/>
-        </w:rPr>
-        <w:t xml:space="preserve">v. </w:t>
+        <w:t xml:space="preserve">BASILI, Victor; WEISS, David M.. A Methodology for Collecting Valid Software Engineering Data. </w:t>
+      </w:r>
+      <w:r>
+        <w:rPr>
+          <w:b/>
+          <w:bCs/>
+          <w:sz w:val="24"/>
+          <w:szCs w:val="24"/>
+        </w:rPr>
+        <w:t>IEEE Transactions on Software Engineering</w:t>
+      </w:r>
+      <w:r>
+        <w:rPr>
+          <w:sz w:val="24"/>
+          <w:szCs w:val="24"/>
+        </w:rPr>
+        <w:t xml:space="preserve">, v. </w:t>
       </w:r>
       <w:r>
         <w:rPr>
@@ -3930,14 +2704,7 @@
           <w:sz w:val="24"/>
           <w:szCs w:val="24"/>
         </w:rPr>
-        <w:t>-10, n. 6</w:t>
-      </w:r>
-      <w:r>
-        <w:rPr>
-          <w:sz w:val="24"/>
-          <w:szCs w:val="24"/>
-        </w:rPr>
-        <w:t>,</w:t>
+        <w:t>-10, n. 6,</w:t>
       </w:r>
       <w:r>
         <w:rPr>
@@ -3951,21 +2718,7 @@
           <w:sz w:val="24"/>
           <w:szCs w:val="24"/>
         </w:rPr>
-        <w:t xml:space="preserve"> </w:t>
-      </w:r>
-      <w:r>
-        <w:rPr>
-          <w:sz w:val="24"/>
-          <w:szCs w:val="24"/>
-        </w:rPr>
-        <w:t>1984</w:t>
-      </w:r>
-      <w:r>
-        <w:rPr>
-          <w:sz w:val="24"/>
-          <w:szCs w:val="24"/>
-        </w:rPr>
-        <w:t>.</w:t>
+        <w:t xml:space="preserve"> 1984.</w:t>
       </w:r>
     </w:p>
     <w:p>
@@ -4010,41 +2763,8 @@
           <w:sz w:val="24"/>
           <w:szCs w:val="24"/>
         </w:rPr>
-        <w:t xml:space="preserve">. </w:t>
-      </w:r>
-      <w:proofErr w:type="spellStart"/>
-      <w:r>
-        <w:rPr>
-          <w:sz w:val="24"/>
-          <w:szCs w:val="24"/>
-        </w:rPr>
-        <w:t>Guidelines</w:t>
-      </w:r>
-      <w:proofErr w:type="spellEnd"/>
-      <w:r>
-        <w:rPr>
-          <w:sz w:val="24"/>
-          <w:szCs w:val="24"/>
-        </w:rPr>
-        <w:t xml:space="preserve"> for </w:t>
-      </w:r>
-      <w:proofErr w:type="spellStart"/>
-      <w:r>
-        <w:rPr>
-          <w:sz w:val="24"/>
-          <w:szCs w:val="24"/>
-        </w:rPr>
-        <w:t>performing</w:t>
-      </w:r>
-      <w:proofErr w:type="spellEnd"/>
-      <w:r>
-        <w:rPr>
-          <w:sz w:val="24"/>
-          <w:szCs w:val="24"/>
-        </w:rPr>
-        <w:t xml:space="preserve"> </w:t>
-      </w:r>
-      <w:proofErr w:type="spellStart"/>
+        <w:t xml:space="preserve">. Guidelines for performing </w:t>
+      </w:r>
       <w:r>
         <w:rPr>
           <w:sz w:val="24"/>
@@ -4057,17 +2777,8 @@
           <w:sz w:val="24"/>
           <w:szCs w:val="24"/>
         </w:rPr>
-        <w:t>ystematic</w:t>
-      </w:r>
-      <w:proofErr w:type="spellEnd"/>
-      <w:r>
-        <w:rPr>
-          <w:sz w:val="24"/>
-          <w:szCs w:val="24"/>
-        </w:rPr>
-        <w:t xml:space="preserve"> </w:t>
-      </w:r>
-      <w:proofErr w:type="spellStart"/>
+        <w:t xml:space="preserve">ystematic </w:t>
+      </w:r>
       <w:r>
         <w:rPr>
           <w:sz w:val="24"/>
@@ -4080,15 +2791,7 @@
           <w:sz w:val="24"/>
           <w:szCs w:val="24"/>
         </w:rPr>
-        <w:t>iterature</w:t>
-      </w:r>
-      <w:proofErr w:type="spellEnd"/>
-      <w:r>
-        <w:rPr>
-          <w:sz w:val="24"/>
-          <w:szCs w:val="24"/>
-        </w:rPr>
-        <w:t xml:space="preserve"> </w:t>
+        <w:t xml:space="preserve">iterature </w:t>
       </w:r>
       <w:r>
         <w:rPr>
@@ -4118,7 +2821,6 @@
         </w:rPr>
         <w:t xml:space="preserve">oftware </w:t>
       </w:r>
-      <w:proofErr w:type="spellStart"/>
       <w:r>
         <w:rPr>
           <w:sz w:val="24"/>
@@ -4131,83 +2833,23 @@
           <w:sz w:val="24"/>
           <w:szCs w:val="24"/>
         </w:rPr>
-        <w:t>ngineering</w:t>
-      </w:r>
-      <w:proofErr w:type="spellEnd"/>
-      <w:r>
-        <w:rPr>
-          <w:sz w:val="24"/>
-          <w:szCs w:val="24"/>
-        </w:rPr>
-        <w:t xml:space="preserve">. </w:t>
-      </w:r>
-      <w:r>
-        <w:rPr>
-          <w:b/>
-          <w:bCs/>
-          <w:sz w:val="24"/>
-          <w:szCs w:val="24"/>
-        </w:rPr>
-        <w:t xml:space="preserve">EBSE </w:t>
-      </w:r>
-      <w:proofErr w:type="spellStart"/>
-      <w:r>
-        <w:rPr>
-          <w:b/>
-          <w:bCs/>
-          <w:sz w:val="24"/>
-          <w:szCs w:val="24"/>
-        </w:rPr>
-        <w:t>Technical</w:t>
-      </w:r>
-      <w:proofErr w:type="spellEnd"/>
-      <w:r>
-        <w:rPr>
-          <w:b/>
-          <w:bCs/>
-          <w:sz w:val="24"/>
-          <w:szCs w:val="24"/>
-        </w:rPr>
-        <w:t xml:space="preserve"> Report EBSE-2007-01</w:t>
-      </w:r>
-      <w:r>
-        <w:rPr>
-          <w:sz w:val="24"/>
-          <w:szCs w:val="24"/>
-        </w:rPr>
-        <w:t xml:space="preserve">, </w:t>
-      </w:r>
-      <w:proofErr w:type="spellStart"/>
-      <w:r>
-        <w:rPr>
-          <w:sz w:val="24"/>
-          <w:szCs w:val="24"/>
-        </w:rPr>
-        <w:t>Keele</w:t>
-      </w:r>
-      <w:proofErr w:type="spellEnd"/>
-      <w:r>
-        <w:rPr>
-          <w:sz w:val="24"/>
-          <w:szCs w:val="24"/>
-        </w:rPr>
-        <w:t xml:space="preserve"> </w:t>
-      </w:r>
-      <w:proofErr w:type="spellStart"/>
-      <w:r>
-        <w:rPr>
-          <w:sz w:val="24"/>
-          <w:szCs w:val="24"/>
-        </w:rPr>
-        <w:t>University</w:t>
-      </w:r>
-      <w:proofErr w:type="spellEnd"/>
-      <w:r>
-        <w:rPr>
-          <w:sz w:val="24"/>
-          <w:szCs w:val="24"/>
-        </w:rPr>
-        <w:t>,</w:t>
+        <w:t xml:space="preserve">ngineering. </w:t>
+      </w:r>
+      <w:r>
+        <w:rPr>
+          <w:b/>
+          <w:bCs/>
+          <w:sz w:val="24"/>
+          <w:szCs w:val="24"/>
+        </w:rPr>
+        <w:t>EBSE Technical Report EBSE-2007-01</w:t>
+      </w:r>
+      <w:r>
+        <w:rPr>
+          <w:sz w:val="24"/>
+          <w:szCs w:val="24"/>
+        </w:rPr>
+        <w:t>, Keele University,</w:t>
       </w:r>
       <w:r>
         <w:rPr>
@@ -4252,143 +2894,16 @@
           <w:sz w:val="24"/>
           <w:szCs w:val="24"/>
         </w:rPr>
-        <w:t xml:space="preserve"> et al. </w:t>
-      </w:r>
-      <w:proofErr w:type="spellStart"/>
-      <w:r>
-        <w:rPr>
-          <w:sz w:val="24"/>
-          <w:szCs w:val="24"/>
-        </w:rPr>
-        <w:t>Guidelines</w:t>
-      </w:r>
-      <w:proofErr w:type="spellEnd"/>
-      <w:r>
-        <w:rPr>
-          <w:sz w:val="24"/>
-          <w:szCs w:val="24"/>
-        </w:rPr>
-        <w:t xml:space="preserve"> for </w:t>
-      </w:r>
-      <w:proofErr w:type="spellStart"/>
-      <w:r>
-        <w:rPr>
-          <w:sz w:val="24"/>
-          <w:szCs w:val="24"/>
-        </w:rPr>
-        <w:t>conducting</w:t>
-      </w:r>
-      <w:proofErr w:type="spellEnd"/>
-      <w:r>
-        <w:rPr>
-          <w:sz w:val="24"/>
-          <w:szCs w:val="24"/>
-        </w:rPr>
-        <w:t xml:space="preserve"> </w:t>
-      </w:r>
-      <w:proofErr w:type="spellStart"/>
-      <w:r>
-        <w:rPr>
-          <w:sz w:val="24"/>
-          <w:szCs w:val="24"/>
-        </w:rPr>
-        <w:t>systematic</w:t>
-      </w:r>
-      <w:proofErr w:type="spellEnd"/>
-      <w:r>
-        <w:rPr>
-          <w:sz w:val="24"/>
-          <w:szCs w:val="24"/>
-        </w:rPr>
-        <w:t xml:space="preserve"> mapping </w:t>
-      </w:r>
-      <w:proofErr w:type="spellStart"/>
-      <w:r>
-        <w:rPr>
-          <w:sz w:val="24"/>
-          <w:szCs w:val="24"/>
-        </w:rPr>
-        <w:t>studies</w:t>
-      </w:r>
-      <w:proofErr w:type="spellEnd"/>
-      <w:r>
-        <w:rPr>
-          <w:sz w:val="24"/>
-          <w:szCs w:val="24"/>
-        </w:rPr>
-        <w:t xml:space="preserve"> in software </w:t>
-      </w:r>
-      <w:proofErr w:type="spellStart"/>
-      <w:r>
-        <w:rPr>
-          <w:sz w:val="24"/>
-          <w:szCs w:val="24"/>
-        </w:rPr>
-        <w:t>engineering</w:t>
-      </w:r>
-      <w:proofErr w:type="spellEnd"/>
-      <w:r>
-        <w:rPr>
-          <w:sz w:val="24"/>
-          <w:szCs w:val="24"/>
-        </w:rPr>
-        <w:t xml:space="preserve">: </w:t>
-      </w:r>
-      <w:proofErr w:type="spellStart"/>
-      <w:r>
-        <w:rPr>
-          <w:sz w:val="24"/>
-          <w:szCs w:val="24"/>
-        </w:rPr>
-        <w:t>An</w:t>
-      </w:r>
-      <w:proofErr w:type="spellEnd"/>
-      <w:r>
-        <w:rPr>
-          <w:sz w:val="24"/>
-          <w:szCs w:val="24"/>
-        </w:rPr>
-        <w:t xml:space="preserve"> update. </w:t>
-      </w:r>
-      <w:proofErr w:type="spellStart"/>
-      <w:r>
-        <w:rPr>
-          <w:b/>
-          <w:bCs/>
-          <w:sz w:val="24"/>
-          <w:szCs w:val="24"/>
-        </w:rPr>
-        <w:t>Information</w:t>
-      </w:r>
-      <w:proofErr w:type="spellEnd"/>
-      <w:r>
-        <w:rPr>
-          <w:b/>
-          <w:bCs/>
-          <w:sz w:val="24"/>
-          <w:szCs w:val="24"/>
-        </w:rPr>
-        <w:t xml:space="preserve"> </w:t>
-      </w:r>
-      <w:proofErr w:type="spellStart"/>
-      <w:r>
-        <w:rPr>
-          <w:b/>
-          <w:bCs/>
-          <w:sz w:val="24"/>
-          <w:szCs w:val="24"/>
-        </w:rPr>
-        <w:t>and</w:t>
-      </w:r>
-      <w:proofErr w:type="spellEnd"/>
-      <w:r>
-        <w:rPr>
-          <w:b/>
-          <w:bCs/>
-          <w:sz w:val="24"/>
-          <w:szCs w:val="24"/>
-        </w:rPr>
-        <w:t xml:space="preserve"> Software Technology</w:t>
+        <w:t xml:space="preserve"> et al. Guidelines for conducting systematic mapping studies in software engineering: An update. </w:t>
+      </w:r>
+      <w:r>
+        <w:rPr>
+          <w:b/>
+          <w:bCs/>
+          <w:sz w:val="24"/>
+          <w:szCs w:val="24"/>
+        </w:rPr>
+        <w:t>Information and Software Technology</w:t>
       </w:r>
       <w:r>
         <w:rPr>
@@ -5039,7 +3554,6 @@
       <w:rFonts w:ascii="Times New Roman" w:eastAsia="Times New Roman" w:hAnsi="Times New Roman" w:cs="Times New Roman"/>
       <w:sz w:val="20"/>
       <w:szCs w:val="20"/>
-      <w:lang/>
     </w:rPr>
   </w:style>
   <w:style w:type="character" w:customStyle="1" w:styleId="RecuodecorpodetextoChar">
@@ -5051,7 +3565,6 @@
       <w:rFonts w:ascii="Times New Roman" w:eastAsia="Times New Roman" w:hAnsi="Times New Roman" w:cs="Times New Roman"/>
       <w:sz w:val="20"/>
       <w:szCs w:val="20"/>
-      <w:lang/>
     </w:rPr>
   </w:style>
   <w:style w:type="character" w:styleId="Hyperlink">

</xml_diff>

<commit_message>
Branch: main; Added PRISMA flowchart.
</commit_message>
<xml_diff>
--- a/research_protocol/protocol.docx
+++ b/research_protocol/protocol.docx
@@ -694,13 +694,7 @@
                         <w:rPr>
                           <w:rFonts w:cs="Tahoma"/>
                         </w:rPr>
-                        <w:t>Protocolo de pesquisa</w:t>
-                      </w:r>
-                      <w:r>
-                        <w:rPr>
-                          <w:rFonts w:cs="Tahoma"/>
-                        </w:rPr>
-                        <w:t xml:space="preserve"> </w:t>
+                        <w:t xml:space="preserve">Protocolo de pesquisa </w:t>
                       </w:r>
                       <w:r>
                         <w:rPr>
@@ -736,49 +730,7 @@
                         <w:rPr>
                           <w:rFonts w:cs="Tahoma"/>
                         </w:rPr>
-                        <w:t>disciplina</w:t>
-                      </w:r>
-                      <w:r>
-                        <w:rPr>
-                          <w:rFonts w:cs="Tahoma"/>
-                        </w:rPr>
-                        <w:t xml:space="preserve"> de</w:t>
-                      </w:r>
-                      <w:r>
-                        <w:rPr>
-                          <w:rFonts w:cs="Tahoma"/>
-                        </w:rPr>
-                        <w:t xml:space="preserve"> </w:t>
-                      </w:r>
-                      <w:r>
-                        <w:rPr>
-                          <w:rFonts w:cs="Tahoma"/>
-                        </w:rPr>
-                        <w:t>Engenharia de Software</w:t>
-                      </w:r>
-                      <w:r>
-                        <w:rPr>
-                          <w:rFonts w:cs="Tahoma"/>
-                        </w:rPr>
-                        <w:t xml:space="preserve"> d</w:t>
-                      </w:r>
-                      <w:r>
-                        <w:rPr>
-                          <w:rFonts w:cs="Tahoma"/>
-                        </w:rPr>
-                        <w:t>o PPGCC da</w:t>
-                      </w:r>
-                      <w:r>
-                        <w:rPr>
-                          <w:rFonts w:cs="Tahoma"/>
-                        </w:rPr>
-                        <w:t xml:space="preserve"> </w:t>
-                      </w:r>
-                      <w:r>
-                        <w:rPr>
-                          <w:rFonts w:cs="Tahoma"/>
-                        </w:rPr>
-                        <w:t>UFG.</w:t>
+                        <w:t>disciplina de Engenharia de Software do PPGCC da UFG.</w:t>
                       </w:r>
                     </w:p>
                     <w:p>
@@ -787,10 +739,7 @@
                         <w:jc w:val="both"/>
                       </w:pPr>
                       <w:r>
-                        <w:t>Professor Orientador: Dr. Valdemar Vicente Graciano Neto</w:t>
-                      </w:r>
-                      <w:r>
-                        <w:t>.</w:t>
+                        <w:t>Professor Orientador: Dr. Valdemar Vicente Graciano Neto.</w:t>
                       </w:r>
                     </w:p>
                   </w:txbxContent>
@@ -975,8 +924,33 @@
         <w:tab/>
       </w:r>
       <w:r>
-        <w:t>Este estudo consiste em um Mapeamento Sistemático de Literatura (MSL), caracterizado como uma pesquisa metodológica secundária. A condução deste trabalho segue estritamente as diretrizes e o framework propostos por Petersen et al. (2015), projetados para estruturar, categorizar e quantificar visualmente o estado da arte de um determinado campo de conhecimento. O processo é executado em cinco etapas sequenciais: (i) definição das questões de pesquisa; (ii) condução da busca por estudos primários em bases de dados eletrônicas; (iii) triagem dos estudos por meio da aplicação de critérios explícitos de inclusão e exclusão; (iv) desenvolvimento de um esquema de classificação baseado em palavras-chave (</w:t>
-      </w:r>
+        <w:t>Este estudo consiste em um Mapeamento Sistemático de Literatura (MSL), caracterizado como uma pesquisa metodológica secundária. A condução deste trabalho segue estritamente as diretrizes e o framework propostos por Petersen et al. (2015), projetados para estruturar, categorizar e quantificar visualmente o estado da arte de um determinado campo de conhecimento. O processo é executado em cinco etapas sequenciais: (i) definição das questões de pesquisa; (</w:t>
+      </w:r>
+      <w:proofErr w:type="spellStart"/>
+      <w:r>
+        <w:t>ii</w:t>
+      </w:r>
+      <w:proofErr w:type="spellEnd"/>
+      <w:r>
+        <w:t>) condução da busca por estudos primários em bases de dados eletrônicas; (</w:t>
+      </w:r>
+      <w:proofErr w:type="spellStart"/>
+      <w:r>
+        <w:t>iii</w:t>
+      </w:r>
+      <w:proofErr w:type="spellEnd"/>
+      <w:r>
+        <w:t>) triagem dos estudos por meio da aplicação de critérios explícitos de inclusão e exclusão; (</w:t>
+      </w:r>
+      <w:proofErr w:type="spellStart"/>
+      <w:r>
+        <w:t>iv</w:t>
+      </w:r>
+      <w:proofErr w:type="spellEnd"/>
+      <w:r>
+        <w:t>) desenvolvimento de um esquema de classificação baseado em palavras-chave (</w:t>
+      </w:r>
+      <w:proofErr w:type="spellStart"/>
       <w:r>
         <w:rPr>
           <w:i/>
@@ -984,8 +958,17 @@
         </w:rPr>
         <w:t>keywording</w:t>
       </w:r>
-      <w:r>
-        <w:t>); e (v) extração de dados e mapeamento sistemático dos resultados. Adicionalmente, adota-se o guia de Kitchenham e Charters (2007) para assegurar o rigor técnico e a reprodutibilidade dos procedimentos de busca e seleção bibliográfica.</w:t>
+      <w:proofErr w:type="spellEnd"/>
+      <w:r>
+        <w:t xml:space="preserve">); e (v) extração de dados e mapeamento sistemático dos resultados. Adicionalmente, adota-se o guia de </w:t>
+      </w:r>
+      <w:proofErr w:type="spellStart"/>
+      <w:r>
+        <w:t>Kitchenham</w:t>
+      </w:r>
+      <w:proofErr w:type="spellEnd"/>
+      <w:r>
+        <w:t xml:space="preserve"> e Charters (2007) para assegurar o rigor técnico e a reprodutibilidade dos procedimentos de busca e seleção bibliográfica.</w:t>
       </w:r>
     </w:p>
     <w:p>
@@ -996,13 +979,109 @@
         <w:tab/>
       </w:r>
       <w:r>
-        <w:t xml:space="preserve">Para a estruturação rigorosa das questões de pesquisa e identificação precisa das palavras-chave que compõem a string de busca, adota-se o framework PICOC (acrônimo para Population, Intervention, Comparison, Outcome, and Context). </w:t>
+        <w:t xml:space="preserve">Para a estruturação rigorosa das questões de pesquisa e identificação precisa das palavras-chave que compõem a </w:t>
+      </w:r>
+      <w:proofErr w:type="spellStart"/>
+      <w:r>
+        <w:t>string</w:t>
+      </w:r>
+      <w:proofErr w:type="spellEnd"/>
+      <w:r>
+        <w:t xml:space="preserve"> de busca, adota-se o framework PICOC (acrônimo para </w:t>
+      </w:r>
+      <w:proofErr w:type="spellStart"/>
+      <w:r>
+        <w:t>Population</w:t>
+      </w:r>
+      <w:proofErr w:type="spellEnd"/>
+      <w:r>
+        <w:t xml:space="preserve">, </w:t>
+      </w:r>
+      <w:proofErr w:type="spellStart"/>
+      <w:r>
+        <w:t>Intervention</w:t>
+      </w:r>
+      <w:proofErr w:type="spellEnd"/>
+      <w:r>
+        <w:t xml:space="preserve">, </w:t>
+      </w:r>
+      <w:proofErr w:type="spellStart"/>
+      <w:r>
+        <w:t>Comparison</w:t>
+      </w:r>
+      <w:proofErr w:type="spellEnd"/>
+      <w:r>
+        <w:t xml:space="preserve">, </w:t>
+      </w:r>
+      <w:proofErr w:type="spellStart"/>
+      <w:r>
+        <w:t>Outcome</w:t>
+      </w:r>
+      <w:proofErr w:type="spellEnd"/>
+      <w:r>
+        <w:t xml:space="preserve">, </w:t>
+      </w:r>
+      <w:proofErr w:type="spellStart"/>
+      <w:r>
+        <w:t>and</w:t>
+      </w:r>
+      <w:proofErr w:type="spellEnd"/>
+      <w:r>
+        <w:t xml:space="preserve"> </w:t>
+      </w:r>
+      <w:proofErr w:type="spellStart"/>
+      <w:r>
+        <w:t>Context</w:t>
+      </w:r>
+      <w:proofErr w:type="spellEnd"/>
+      <w:r>
+        <w:t xml:space="preserve">). </w:t>
       </w:r>
       <w:r>
         <w:t>Integrado</w:t>
       </w:r>
       <w:r>
-        <w:t xml:space="preserve"> formalmente à Engenharia de Software por Kitchenham e Charters (2007), essa estrutura estende os modelos tradicionais de revisão ao decompor o escopo da investigação em cinco dimensões fundamentais: (i) População (P), que delimita o grupo de interesse, papel ou área afetada; (ii) Intervenção (I), correspondente à tecnologia, ferramenta ou metodologia específica sob análise; (iii) Comparação (C), que identifica a alternativa ou estado atual com o qual a intervenção é contrastada; (iv) Resultado (Outcome - O), que define os efeitos, benefícios ou métricas de interesse a serem medidos; e (v) Contexto (C)</w:t>
+        <w:t xml:space="preserve"> formalmente à Engenharia de Software por </w:t>
+      </w:r>
+      <w:proofErr w:type="spellStart"/>
+      <w:r>
+        <w:t>Kitchenham</w:t>
+      </w:r>
+      <w:proofErr w:type="spellEnd"/>
+      <w:r>
+        <w:t xml:space="preserve"> e Charters (2007), essa estrutura estende os modelos tradicionais de revisão ao decompor o escopo da investigação em cinco dimensões fundamentais: (i) População (P), que delimita o grupo de interesse, papel ou área afetada; (</w:t>
+      </w:r>
+      <w:proofErr w:type="spellStart"/>
+      <w:r>
+        <w:t>ii</w:t>
+      </w:r>
+      <w:proofErr w:type="spellEnd"/>
+      <w:r>
+        <w:t>) Intervenção (I), correspondente à tecnologia, ferramenta ou metodologia específica sob análise; (</w:t>
+      </w:r>
+      <w:proofErr w:type="spellStart"/>
+      <w:r>
+        <w:t>iii</w:t>
+      </w:r>
+      <w:proofErr w:type="spellEnd"/>
+      <w:r>
+        <w:t>) Comparação (C), que identifica a alternativa ou estado atual com o qual a intervenção é contrastada; (</w:t>
+      </w:r>
+      <w:proofErr w:type="spellStart"/>
+      <w:r>
+        <w:t>iv</w:t>
+      </w:r>
+      <w:proofErr w:type="spellEnd"/>
+      <w:r>
+        <w:t>) Resultado (</w:t>
+      </w:r>
+      <w:proofErr w:type="spellStart"/>
+      <w:r>
+        <w:t>Outcome</w:t>
+      </w:r>
+      <w:proofErr w:type="spellEnd"/>
+      <w:r>
+        <w:t xml:space="preserve"> - O), que define os efeitos, benefícios ou métricas de interesse a serem medidos; e (v) Contexto (C)</w:t>
       </w:r>
       <w:r>
         <w:t xml:space="preserve">, </w:t>
@@ -1019,10 +1098,457 @@
         <w:tab/>
       </w:r>
       <w:r>
-        <w:t>Para a definição estruturada e alinhamento do escopo deste estudo, adota-se a abordagem Goal-Question-Metric (GQM), desenvolvida originalmente por Basili e Weiss (1984) e consolidada por Basili (1992). O GQM é um paradigma de medição orientado a objetivos que estabelece uma estrutura hierárquica dividida em três níveis: (i) Conceitual (Goal), onde se define o objetivo principal da investigação sob uma perspectiva e contexto específicos; (ii) Operacional (Question), no qual o objetivo é refinado em um conjunto de questões que caracterizam o objeto de estudo de forma quantificável; e (iii) Quantitativo (Metric), onde são associadas as métricas de dados necessárias para responder satisfatoriamente a cada questão formulada. No âmbito deste protocolo, a aplicação do framework GQM garante que a coleta e a análise das evidências da literatura estejam rigorosamente vinculadas às metas centrais da pesquisa, evitando a inclusão de métricas ad-hoc ou desconexas do propósito científico.</w:t>
-      </w:r>
-    </w:p>
-    <w:p/>
+        <w:t>Para garantir a transparência, o rigor e a reprodutibilidade visual no processo de seleção dos estudos primários, adota-se o fluxograma PRISMA (</w:t>
+      </w:r>
+      <w:proofErr w:type="spellStart"/>
+      <w:r>
+        <w:t>Preferred</w:t>
+      </w:r>
+      <w:proofErr w:type="spellEnd"/>
+      <w:r>
+        <w:t xml:space="preserve"> </w:t>
+      </w:r>
+      <w:proofErr w:type="spellStart"/>
+      <w:r>
+        <w:t>Reporting</w:t>
+      </w:r>
+      <w:proofErr w:type="spellEnd"/>
+      <w:r>
+        <w:t xml:space="preserve"> </w:t>
+      </w:r>
+      <w:proofErr w:type="spellStart"/>
+      <w:r>
+        <w:t>Items</w:t>
+      </w:r>
+      <w:proofErr w:type="spellEnd"/>
+      <w:r>
+        <w:t xml:space="preserve"> for </w:t>
+      </w:r>
+      <w:proofErr w:type="spellStart"/>
+      <w:r>
+        <w:t>Systematic</w:t>
+      </w:r>
+      <w:proofErr w:type="spellEnd"/>
+      <w:r>
+        <w:t xml:space="preserve"> Reviews </w:t>
+      </w:r>
+      <w:proofErr w:type="spellStart"/>
+      <w:r>
+        <w:t>and</w:t>
+      </w:r>
+      <w:proofErr w:type="spellEnd"/>
+      <w:r>
+        <w:t xml:space="preserve"> Meta-</w:t>
+      </w:r>
+      <w:proofErr w:type="spellStart"/>
+      <w:r>
+        <w:t>Analyses</w:t>
+      </w:r>
+      <w:proofErr w:type="spellEnd"/>
+      <w:r>
+        <w:t xml:space="preserve">). Embora originado como uma diretriz de relato em outras ciências, o modelo de fluxo de quatro fases do PRISMA é integrado a este estudo de forma complementar e adaptada às práticas de revisão de </w:t>
+      </w:r>
+      <w:proofErr w:type="spellStart"/>
+      <w:r>
+        <w:t>Kitchenham</w:t>
+      </w:r>
+      <w:proofErr w:type="spellEnd"/>
+      <w:r>
+        <w:t xml:space="preserve"> e Charters (2007) e de mapeamento de Petersen et al. (2015). O diagrama documenta de forma rastreável o funil de dados da pesquisa por meio de quatro </w:t>
+      </w:r>
+      <w:proofErr w:type="spellStart"/>
+      <w:r>
+        <w:t>macroetapas</w:t>
+      </w:r>
+      <w:proofErr w:type="spellEnd"/>
+      <w:r>
+        <w:t>: (i) Identificação, que contabiliza os registros brutos localizados nas bases de dados eletrônicas após a remoção de duplicatas; (</w:t>
+      </w:r>
+      <w:proofErr w:type="spellStart"/>
+      <w:r>
+        <w:t>ii</w:t>
+      </w:r>
+      <w:proofErr w:type="spellEnd"/>
+      <w:r>
+        <w:t>) Triagem (</w:t>
+      </w:r>
+      <w:proofErr w:type="spellStart"/>
+      <w:r>
+        <w:t>Screening</w:t>
+      </w:r>
+      <w:proofErr w:type="spellEnd"/>
+      <w:r>
+        <w:t>), que mapeia a exclusão inicial com base na leitura de títulos e resumos; (</w:t>
+      </w:r>
+      <w:proofErr w:type="spellStart"/>
+      <w:r>
+        <w:t>iii</w:t>
+      </w:r>
+      <w:proofErr w:type="spellEnd"/>
+      <w:r>
+        <w:t>) Elegibilidade, que quantifica os artigos avaliados na íntegra a partir dos critérios de inclusão e exclusão; e (</w:t>
+      </w:r>
+      <w:proofErr w:type="spellStart"/>
+      <w:r>
+        <w:t>iv</w:t>
+      </w:r>
+      <w:proofErr w:type="spellEnd"/>
+      <w:r>
+        <w:t>) Inclusão, que consolida o número final de estudos primários selecionados para o mapeamento. O uso do diagrama mitiga vieses de publicação e facilita a auditoria externa do processo de refinamento amostral.</w:t>
+      </w:r>
+    </w:p>
+    <w:p>
+      <w:pPr>
+        <w:jc w:val="both"/>
+      </w:pPr>
+      <w:r>
+        <w:tab/>
+      </w:r>
+      <w:r>
+        <w:t xml:space="preserve">Para a definição estruturada e alinhamento do escopo deste estudo, adota-se a abordagem </w:t>
+      </w:r>
+      <w:proofErr w:type="spellStart"/>
+      <w:r>
+        <w:t>Goal-Question-Metric</w:t>
+      </w:r>
+      <w:proofErr w:type="spellEnd"/>
+      <w:r>
+        <w:t xml:space="preserve"> (GQM), desenvolvida originalmente por Basili e Weiss (1984) e consolidada por Basili (1992). O GQM é um paradigma de medição orientado a objetivos que estabelece uma estrutura hierárquica dividida em três níveis: (i) Conceitual (</w:t>
+      </w:r>
+      <w:proofErr w:type="spellStart"/>
+      <w:r>
+        <w:t>Goal</w:t>
+      </w:r>
+      <w:proofErr w:type="spellEnd"/>
+      <w:r>
+        <w:t>), onde se define o objetivo principal da investigação sob uma perspectiva e contexto específicos; (</w:t>
+      </w:r>
+      <w:proofErr w:type="spellStart"/>
+      <w:r>
+        <w:t>ii</w:t>
+      </w:r>
+      <w:proofErr w:type="spellEnd"/>
+      <w:r>
+        <w:t>) Operacional (</w:t>
+      </w:r>
+      <w:proofErr w:type="spellStart"/>
+      <w:r>
+        <w:t>Question</w:t>
+      </w:r>
+      <w:proofErr w:type="spellEnd"/>
+      <w:r>
+        <w:t>), no qual o objetivo é refinado em um conjunto de questões que caracterizam o objeto de estudo de forma quantificável; e (</w:t>
+      </w:r>
+      <w:proofErr w:type="spellStart"/>
+      <w:r>
+        <w:t>iii</w:t>
+      </w:r>
+      <w:proofErr w:type="spellEnd"/>
+      <w:r>
+        <w:t>) Quantitativo (</w:t>
+      </w:r>
+      <w:proofErr w:type="spellStart"/>
+      <w:r>
+        <w:t>Metric</w:t>
+      </w:r>
+      <w:proofErr w:type="spellEnd"/>
+      <w:r>
+        <w:t xml:space="preserve">), onde são associadas as métricas de dados necessárias para responder satisfatoriamente a cada questão formulada. No âmbito deste protocolo, a aplicação do </w:t>
+      </w:r>
+      <w:r>
+        <w:lastRenderedPageBreak/>
+        <w:t xml:space="preserve">framework GQM garante que a coleta e a análise das evidências da literatura estejam rigorosamente vinculadas às metas centrais da pesquisa, evitando a inclusão de métricas </w:t>
+      </w:r>
+      <w:proofErr w:type="spellStart"/>
+      <w:r>
+        <w:t>ad-hoc</w:t>
+      </w:r>
+      <w:proofErr w:type="spellEnd"/>
+      <w:r>
+        <w:t xml:space="preserve"> ou desconexas do propósito científico.</w:t>
+      </w:r>
+    </w:p>
+    <w:p/>
+    <w:p>
+      <w:pPr>
+        <w:rPr>
+          <w:b/>
+          <w:bCs/>
+        </w:rPr>
+      </w:pPr>
+    </w:p>
+    <w:p>
+      <w:pPr>
+        <w:rPr>
+          <w:b/>
+          <w:bCs/>
+        </w:rPr>
+      </w:pPr>
+    </w:p>
+    <w:p>
+      <w:pPr>
+        <w:rPr>
+          <w:b/>
+          <w:bCs/>
+        </w:rPr>
+      </w:pPr>
+    </w:p>
+    <w:p>
+      <w:pPr>
+        <w:rPr>
+          <w:b/>
+          <w:bCs/>
+        </w:rPr>
+      </w:pPr>
+    </w:p>
+    <w:p>
+      <w:pPr>
+        <w:rPr>
+          <w:b/>
+          <w:bCs/>
+        </w:rPr>
+      </w:pPr>
+    </w:p>
+    <w:p>
+      <w:pPr>
+        <w:rPr>
+          <w:b/>
+          <w:bCs/>
+        </w:rPr>
+      </w:pPr>
+    </w:p>
+    <w:p>
+      <w:pPr>
+        <w:rPr>
+          <w:b/>
+          <w:bCs/>
+        </w:rPr>
+      </w:pPr>
+    </w:p>
+    <w:p>
+      <w:pPr>
+        <w:rPr>
+          <w:b/>
+          <w:bCs/>
+        </w:rPr>
+      </w:pPr>
+    </w:p>
+    <w:p>
+      <w:pPr>
+        <w:rPr>
+          <w:b/>
+          <w:bCs/>
+        </w:rPr>
+      </w:pPr>
+    </w:p>
+    <w:p>
+      <w:pPr>
+        <w:rPr>
+          <w:b/>
+          <w:bCs/>
+        </w:rPr>
+      </w:pPr>
+    </w:p>
+    <w:p>
+      <w:pPr>
+        <w:rPr>
+          <w:b/>
+          <w:bCs/>
+        </w:rPr>
+      </w:pPr>
+    </w:p>
+    <w:p>
+      <w:pPr>
+        <w:rPr>
+          <w:b/>
+          <w:bCs/>
+        </w:rPr>
+      </w:pPr>
+    </w:p>
+    <w:p>
+      <w:pPr>
+        <w:rPr>
+          <w:b/>
+          <w:bCs/>
+        </w:rPr>
+      </w:pPr>
+    </w:p>
+    <w:p>
+      <w:pPr>
+        <w:rPr>
+          <w:b/>
+          <w:bCs/>
+        </w:rPr>
+      </w:pPr>
+    </w:p>
+    <w:p>
+      <w:pPr>
+        <w:rPr>
+          <w:b/>
+          <w:bCs/>
+        </w:rPr>
+      </w:pPr>
+    </w:p>
+    <w:p>
+      <w:pPr>
+        <w:rPr>
+          <w:b/>
+          <w:bCs/>
+        </w:rPr>
+      </w:pPr>
+    </w:p>
+    <w:p>
+      <w:pPr>
+        <w:rPr>
+          <w:b/>
+          <w:bCs/>
+        </w:rPr>
+      </w:pPr>
+    </w:p>
+    <w:p>
+      <w:pPr>
+        <w:rPr>
+          <w:b/>
+          <w:bCs/>
+        </w:rPr>
+      </w:pPr>
+    </w:p>
+    <w:p>
+      <w:pPr>
+        <w:rPr>
+          <w:b/>
+          <w:bCs/>
+        </w:rPr>
+      </w:pPr>
+    </w:p>
+    <w:p>
+      <w:pPr>
+        <w:rPr>
+          <w:b/>
+          <w:bCs/>
+        </w:rPr>
+      </w:pPr>
+    </w:p>
+    <w:p>
+      <w:pPr>
+        <w:rPr>
+          <w:b/>
+          <w:bCs/>
+        </w:rPr>
+      </w:pPr>
+    </w:p>
+    <w:p>
+      <w:pPr>
+        <w:rPr>
+          <w:b/>
+          <w:bCs/>
+        </w:rPr>
+      </w:pPr>
+    </w:p>
+    <w:p>
+      <w:pPr>
+        <w:rPr>
+          <w:b/>
+          <w:bCs/>
+        </w:rPr>
+      </w:pPr>
+    </w:p>
+    <w:p>
+      <w:pPr>
+        <w:rPr>
+          <w:b/>
+          <w:bCs/>
+        </w:rPr>
+      </w:pPr>
+    </w:p>
+    <w:p>
+      <w:pPr>
+        <w:rPr>
+          <w:b/>
+          <w:bCs/>
+        </w:rPr>
+      </w:pPr>
+    </w:p>
+    <w:p>
+      <w:pPr>
+        <w:rPr>
+          <w:b/>
+          <w:bCs/>
+        </w:rPr>
+      </w:pPr>
+    </w:p>
+    <w:p>
+      <w:pPr>
+        <w:rPr>
+          <w:b/>
+          <w:bCs/>
+        </w:rPr>
+      </w:pPr>
+    </w:p>
+    <w:p>
+      <w:pPr>
+        <w:rPr>
+          <w:b/>
+          <w:bCs/>
+        </w:rPr>
+      </w:pPr>
+    </w:p>
+    <w:p>
+      <w:pPr>
+        <w:rPr>
+          <w:b/>
+          <w:bCs/>
+        </w:rPr>
+      </w:pPr>
+    </w:p>
+    <w:p>
+      <w:pPr>
+        <w:rPr>
+          <w:b/>
+          <w:bCs/>
+        </w:rPr>
+      </w:pPr>
+    </w:p>
+    <w:p>
+      <w:pPr>
+        <w:rPr>
+          <w:b/>
+          <w:bCs/>
+        </w:rPr>
+      </w:pPr>
+    </w:p>
+    <w:p>
+      <w:pPr>
+        <w:rPr>
+          <w:b/>
+          <w:bCs/>
+        </w:rPr>
+      </w:pPr>
+    </w:p>
+    <w:p>
+      <w:pPr>
+        <w:rPr>
+          <w:b/>
+          <w:bCs/>
+        </w:rPr>
+      </w:pPr>
+    </w:p>
+    <w:p>
+      <w:pPr>
+        <w:rPr>
+          <w:b/>
+          <w:bCs/>
+        </w:rPr>
+      </w:pPr>
+    </w:p>
+    <w:p>
+      <w:pPr>
+        <w:rPr>
+          <w:b/>
+          <w:bCs/>
+        </w:rPr>
+      </w:pPr>
+    </w:p>
     <w:p>
       <w:pPr>
         <w:rPr>
@@ -1135,17 +1661,49 @@
         <w:t>Analisar</w:t>
       </w:r>
       <w:r>
-        <w:t xml:space="preserve"> abordagens de Retrieval-Augmented Generation (RAG) </w:t>
-      </w:r>
-    </w:p>
-    <w:p>
-      <w:r>
-        <w:t xml:space="preserve">            baseadas em Large Language Models (LLMs)</w:t>
-      </w:r>
-    </w:p>
-    <w:p>
-      <w:r>
-        <w:t xml:space="preserve">            aplicadas a codebases de software</w:t>
+        <w:t xml:space="preserve"> abordagens de </w:t>
+      </w:r>
+      <w:proofErr w:type="spellStart"/>
+      <w:r>
+        <w:t>Retrieval-Augmented</w:t>
+      </w:r>
+      <w:proofErr w:type="spellEnd"/>
+      <w:r>
+        <w:t xml:space="preserve"> Generation (RAG) </w:t>
+      </w:r>
+    </w:p>
+    <w:p>
+      <w:r>
+        <w:t xml:space="preserve">            baseadas em Large </w:t>
+      </w:r>
+      <w:proofErr w:type="spellStart"/>
+      <w:r>
+        <w:t>Language</w:t>
+      </w:r>
+      <w:proofErr w:type="spellEnd"/>
+      <w:r>
+        <w:t xml:space="preserve"> Models (</w:t>
+      </w:r>
+      <w:proofErr w:type="spellStart"/>
+      <w:r>
+        <w:t>LLMs</w:t>
+      </w:r>
+      <w:proofErr w:type="spellEnd"/>
+      <w:r>
+        <w:t>)</w:t>
+      </w:r>
+    </w:p>
+    <w:p>
+      <w:r>
+        <w:t xml:space="preserve">            aplicadas a </w:t>
+      </w:r>
+      <w:proofErr w:type="spellStart"/>
+      <w:r>
+        <w:t>codebases</w:t>
+      </w:r>
+      <w:proofErr w:type="spellEnd"/>
+      <w:r>
+        <w:t xml:space="preserve"> de software</w:t>
       </w:r>
     </w:p>
     <w:p>
@@ -1163,7 +1721,15 @@
         <w:t xml:space="preserve"> suas</w:t>
       </w:r>
       <w:r>
-        <w:t xml:space="preserve"> técnicas, LLMs empregadas,</w:t>
+        <w:t xml:space="preserve"> técnicas, </w:t>
+      </w:r>
+      <w:proofErr w:type="spellStart"/>
+      <w:r>
+        <w:t>LLMs</w:t>
+      </w:r>
+      <w:proofErr w:type="spellEnd"/>
+      <w:r>
+        <w:t xml:space="preserve"> empregadas,</w:t>
       </w:r>
     </w:p>
     <w:p>
@@ -1253,15 +1819,28 @@
         <w:jc w:val="both"/>
       </w:pPr>
       <w:r>
-        <w:t>- RQ1: Quais técnicas e arquiteturas de RAG são propostas para aplicação em codebases de software?</w:t>
+        <w:t xml:space="preserve">- RQ1: Quais técnicas e arquiteturas de RAG são propostas para aplicação em </w:t>
+      </w:r>
+      <w:proofErr w:type="spellStart"/>
+      <w:r>
+        <w:t>codebases</w:t>
+      </w:r>
+      <w:proofErr w:type="spellEnd"/>
+      <w:r>
+        <w:t xml:space="preserve"> de software?</w:t>
       </w:r>
     </w:p>
     <w:p>
       <w:pPr>
         <w:jc w:val="both"/>
       </w:pPr>
-      <w:r>
-        <w:t>Rationale: Identificar e classificar as arquiteturas existentes: permite consolidar o estado da arte quanto às estratégias de recuperação e processamento de código, servindo de base para as demais questões do mapeamento.</w:t>
+      <w:proofErr w:type="spellStart"/>
+      <w:r>
+        <w:t>Rationale</w:t>
+      </w:r>
+      <w:proofErr w:type="spellEnd"/>
+      <w:r>
+        <w:t>: Identificar e classificar as arquiteturas existentes: permite consolidar o estado da arte quanto às estratégias de recuperação e processamento de código, servindo de base para as demais questões do mapeamento.</w:t>
       </w:r>
     </w:p>
     <w:p>
@@ -1274,15 +1853,44 @@
         <w:jc w:val="both"/>
       </w:pPr>
       <w:r>
-        <w:t>- RQ2: Quais Large Language Models são empregadas como componente gerador nas abordagens de RAG para codebases?</w:t>
+        <w:t xml:space="preserve">- RQ2: Quais Large </w:t>
+      </w:r>
+      <w:proofErr w:type="spellStart"/>
+      <w:r>
+        <w:t>Language</w:t>
+      </w:r>
+      <w:proofErr w:type="spellEnd"/>
+      <w:r>
+        <w:t xml:space="preserve"> Models são empregadas como componente gerador nas abordagens de RAG para </w:t>
+      </w:r>
+      <w:proofErr w:type="spellStart"/>
+      <w:r>
+        <w:t>codebases</w:t>
+      </w:r>
+      <w:proofErr w:type="spellEnd"/>
+      <w:r>
+        <w:t>?</w:t>
       </w:r>
     </w:p>
     <w:p>
       <w:pPr>
         <w:jc w:val="both"/>
       </w:pPr>
-      <w:r>
-        <w:t>Rationale: Compreender quais LLMs são predominantemente adotadas auxilia pesquisadores e praticantes na seleção de modelos adequados para implementações futuras, além de revelar tendências de adoção na área.</w:t>
+      <w:proofErr w:type="spellStart"/>
+      <w:r>
+        <w:t>Rationale</w:t>
+      </w:r>
+      <w:proofErr w:type="spellEnd"/>
+      <w:r>
+        <w:t xml:space="preserve">: Compreender quais </w:t>
+      </w:r>
+      <w:proofErr w:type="spellStart"/>
+      <w:r>
+        <w:t>LLMs</w:t>
+      </w:r>
+      <w:proofErr w:type="spellEnd"/>
+      <w:r>
+        <w:t xml:space="preserve"> são predominantemente adotadas auxilia pesquisadores e praticantes na seleção de modelos adequados para implementações futuras, além de revelar tendências de adoção na área.</w:t>
       </w:r>
     </w:p>
     <w:p>
@@ -1302,8 +1910,13 @@
       <w:pPr>
         <w:jc w:val="both"/>
       </w:pPr>
-      <w:r>
-        <w:t>Rationale: Conhecer o escopo das linguagens e sistemas investigados evidencia o alcance das abordagens propostas e possíveis vieses de cobertura na literatura.</w:t>
+      <w:proofErr w:type="spellStart"/>
+      <w:r>
+        <w:t>Rationale</w:t>
+      </w:r>
+      <w:proofErr w:type="spellEnd"/>
+      <w:r>
+        <w:t>: Conhecer o escopo das linguagens e sistemas investigados evidencia o alcance das abordagens propostas e possíveis vieses de cobertura na literatura.</w:t>
       </w:r>
     </w:p>
     <w:p>
@@ -1316,15 +1929,28 @@
         <w:jc w:val="both"/>
       </w:pPr>
       <w:r>
-        <w:t>- RQ4: Quais métricas são utilizadas para avaliar a efetividade das abordagens de RAG em codebases?</w:t>
+        <w:t xml:space="preserve">- RQ4: Quais métricas são utilizadas para avaliar a efetividade das abordagens de RAG em </w:t>
+      </w:r>
+      <w:proofErr w:type="spellStart"/>
+      <w:r>
+        <w:t>codebases</w:t>
+      </w:r>
+      <w:proofErr w:type="spellEnd"/>
+      <w:r>
+        <w:t>?</w:t>
       </w:r>
     </w:p>
     <w:p>
       <w:pPr>
         <w:jc w:val="both"/>
       </w:pPr>
-      <w:r>
-        <w:t>Rationale: Mapear as métricas utilizadas permite avaliar o rigor dos estudos e identificar padrões de avaliação que possam orientar trabalhos futuros.</w:t>
+      <w:proofErr w:type="spellStart"/>
+      <w:r>
+        <w:t>Rationale</w:t>
+      </w:r>
+      <w:proofErr w:type="spellEnd"/>
+      <w:r>
+        <w:t>: Mapear as métricas utilizadas permite avaliar o rigor dos estudos e identificar padrões de avaliação que possam orientar trabalhos futuros.</w:t>
       </w:r>
     </w:p>
     <w:p>
@@ -1337,12 +1963,25 @@
         <w:jc w:val="both"/>
       </w:pPr>
       <w:r>
-        <w:t>- RQ5: Quais são as principais lacunas identificadas na literatura sobre RAG aplicado a codebases?</w:t>
-      </w:r>
-    </w:p>
-    <w:p>
-      <w:r>
-        <w:t>Rationale: Identificar lacunas contribui diretamente para a agenda de pesquisa da área, apontando oportunidades para estudos futuros.</w:t>
+        <w:t xml:space="preserve">- RQ5: Quais são as principais lacunas identificadas na literatura sobre RAG aplicado a </w:t>
+      </w:r>
+      <w:proofErr w:type="spellStart"/>
+      <w:r>
+        <w:t>codebases</w:t>
+      </w:r>
+      <w:proofErr w:type="spellEnd"/>
+      <w:r>
+        <w:t>?</w:t>
+      </w:r>
+    </w:p>
+    <w:p>
+      <w:proofErr w:type="spellStart"/>
+      <w:r>
+        <w:t>Rationale</w:t>
+      </w:r>
+      <w:proofErr w:type="spellEnd"/>
+      <w:r>
+        <w:t>: Identificar lacunas contribui diretamente para a agenda de pesquisa da área, apontando oportunidades para estudos futuros.</w:t>
       </w:r>
     </w:p>
     <w:p/>
@@ -1449,8 +2088,13 @@
             <w:pPr>
               <w:jc w:val="both"/>
             </w:pPr>
-            <w:r>
-              <w:t>Codebases de software</w:t>
+            <w:proofErr w:type="spellStart"/>
+            <w:r>
+              <w:t>Codebases</w:t>
+            </w:r>
+            <w:proofErr w:type="spellEnd"/>
+            <w:r>
+              <w:t xml:space="preserve"> de software</w:t>
             </w:r>
             <w:r>
               <w:t>:</w:t>
@@ -1490,7 +2134,15 @@
               <w:jc w:val="both"/>
             </w:pPr>
             <w:r>
-              <w:t>Abordagens de RAG baseadas em LLMs ou IA Generativa.</w:t>
+              <w:t xml:space="preserve">Abordagens de RAG baseadas em </w:t>
+            </w:r>
+            <w:proofErr w:type="spellStart"/>
+            <w:r>
+              <w:t>LLMs</w:t>
+            </w:r>
+            <w:proofErr w:type="spellEnd"/>
+            <w:r>
+              <w:t xml:space="preserve"> ou IA Generativa.</w:t>
             </w:r>
           </w:p>
         </w:tc>
@@ -1551,7 +2203,15 @@
           </w:tcPr>
           <w:p>
             <w:r>
-              <w:t>O - Outcome (Resultado)</w:t>
+              <w:t xml:space="preserve">O - </w:t>
+            </w:r>
+            <w:proofErr w:type="spellStart"/>
+            <w:r>
+              <w:t>Outcome</w:t>
+            </w:r>
+            <w:proofErr w:type="spellEnd"/>
+            <w:r>
+              <w:t xml:space="preserve"> (Resultado)</w:t>
             </w:r>
           </w:p>
         </w:tc>
@@ -1571,8 +2231,13 @@
             <w:pPr>
               <w:jc w:val="both"/>
             </w:pPr>
-            <w:r>
-              <w:t>LLMs empregadas.</w:t>
+            <w:proofErr w:type="spellStart"/>
+            <w:r>
+              <w:t>LLMs</w:t>
+            </w:r>
+            <w:proofErr w:type="spellEnd"/>
+            <w:r>
+              <w:t xml:space="preserve"> empregadas.</w:t>
             </w:r>
           </w:p>
           <w:p>
@@ -1669,17 +2334,89 @@
     </w:p>
     <w:p>
       <w:r>
-        <w:t>("source code" OR "codebase" OR "code repository") AND</w:t>
-      </w:r>
-    </w:p>
-    <w:p>
-      <w:r>
-        <w:t>("Retrieval-Augmented Generation" OR "RAG") AND</w:t>
-      </w:r>
-    </w:p>
-    <w:p>
-      <w:r>
-        <w:t>("LLM" OR "Large Language Model" OR "GenAI" OR "Generative AI")</w:t>
+        <w:t>("</w:t>
+      </w:r>
+      <w:proofErr w:type="spellStart"/>
+      <w:r>
+        <w:t>source</w:t>
+      </w:r>
+      <w:proofErr w:type="spellEnd"/>
+      <w:r>
+        <w:t xml:space="preserve"> </w:t>
+      </w:r>
+      <w:proofErr w:type="spellStart"/>
+      <w:r>
+        <w:t>code</w:t>
+      </w:r>
+      <w:proofErr w:type="spellEnd"/>
+      <w:r>
+        <w:t>" OR "</w:t>
+      </w:r>
+      <w:proofErr w:type="spellStart"/>
+      <w:r>
+        <w:t>codebase</w:t>
+      </w:r>
+      <w:proofErr w:type="spellEnd"/>
+      <w:r>
+        <w:t>" OR "</w:t>
+      </w:r>
+      <w:proofErr w:type="spellStart"/>
+      <w:r>
+        <w:t>code</w:t>
+      </w:r>
+      <w:proofErr w:type="spellEnd"/>
+      <w:r>
+        <w:t xml:space="preserve"> </w:t>
+      </w:r>
+      <w:proofErr w:type="spellStart"/>
+      <w:r>
+        <w:t>repository</w:t>
+      </w:r>
+      <w:proofErr w:type="spellEnd"/>
+      <w:r>
+        <w:t>") AND</w:t>
+      </w:r>
+    </w:p>
+    <w:p>
+      <w:r>
+        <w:t>("</w:t>
+      </w:r>
+      <w:proofErr w:type="spellStart"/>
+      <w:r>
+        <w:t>Retrieval-Augmented</w:t>
+      </w:r>
+      <w:proofErr w:type="spellEnd"/>
+      <w:r>
+        <w:t xml:space="preserve"> Generation" OR "RAG") AND</w:t>
+      </w:r>
+    </w:p>
+    <w:p>
+      <w:r>
+        <w:t xml:space="preserve">("LLM" OR "Large </w:t>
+      </w:r>
+      <w:proofErr w:type="spellStart"/>
+      <w:r>
+        <w:t>Language</w:t>
+      </w:r>
+      <w:proofErr w:type="spellEnd"/>
+      <w:r>
+        <w:t xml:space="preserve"> Model" OR "</w:t>
+      </w:r>
+      <w:proofErr w:type="spellStart"/>
+      <w:r>
+        <w:t>GenAI</w:t>
+      </w:r>
+      <w:proofErr w:type="spellEnd"/>
+      <w:r>
+        <w:t>" OR "</w:t>
+      </w:r>
+      <w:proofErr w:type="spellStart"/>
+      <w:r>
+        <w:t>Generative</w:t>
+      </w:r>
+      <w:proofErr w:type="spellEnd"/>
+      <w:r>
+        <w:t xml:space="preserve"> AI")</w:t>
       </w:r>
     </w:p>
     <w:p/>
@@ -1740,81 +2477,202 @@
           <w:i/>
           <w:iCs/>
         </w:rPr>
-        <w:t>- O “Resultado” não compõe a string pois representa o que será extraído dos estudos, não um critério de busca.</w:t>
-      </w:r>
-    </w:p>
-    <w:p>
-      <w:pPr>
-        <w:jc w:val="both"/>
+        <w:t xml:space="preserve">- O “Resultado” não compõe a </w:t>
+      </w:r>
+      <w:proofErr w:type="spellStart"/>
+      <w:r>
         <w:rPr>
           <w:i/>
           <w:iCs/>
         </w:rPr>
-      </w:pPr>
+        <w:t>string</w:t>
+      </w:r>
+      <w:proofErr w:type="spellEnd"/>
       <w:r>
         <w:rPr>
           <w:i/>
           <w:iCs/>
         </w:rPr>
-        <w:t xml:space="preserve">- </w:t>
-      </w:r>
-      <w:r>
+        <w:t xml:space="preserve"> pois representa o que será extraído dos estudos, não um critério de busca.</w:t>
+      </w:r>
+    </w:p>
+    <w:p>
+      <w:pPr>
+        <w:jc w:val="both"/>
         <w:rPr>
           <w:i/>
           <w:iCs/>
         </w:rPr>
-        <w:t>O "Contexto" não compõe a string de busca pois é garantido pelos critérios de seleção: a delimitação ao domínio de Engenharia de Software é assegurada pelo CI1, e a exigência de revisão por pares é assegurada pelo CE5.</w:t>
-      </w:r>
-    </w:p>
-    <w:p>
-      <w:pPr>
-        <w:jc w:val="both"/>
+      </w:pPr>
+      <w:r>
         <w:rPr>
           <w:i/>
           <w:iCs/>
         </w:rPr>
-      </w:pPr>
+        <w:t xml:space="preserve">- </w:t>
+      </w:r>
       <w:r>
         <w:rPr>
           <w:i/>
           <w:iCs/>
         </w:rPr>
-        <w:t xml:space="preserve">- </w:t>
-      </w:r>
+        <w:t xml:space="preserve">O "Contexto" não compõe a </w:t>
+      </w:r>
+      <w:proofErr w:type="spellStart"/>
       <w:r>
         <w:rPr>
           <w:i/>
           <w:iCs/>
         </w:rPr>
-        <w:t>Embora RAG e LLM componham conceitualmente a mesma Intervenção, eles são representados como dois grupos distintos conectados por AND na string de busca. Essa decisão é intencional: o AND garante que apenas estudos que tratam explicitamente da combinação RAG+LLM sejam recuperados, excluindo trabalhos sobre RAG sem base em modelos de linguagem de grande escala e trabalhos sobre LLMs aplicados a código sem componente de recuperação. Trata-se de uma escolha de precisão sobre sensibilidade. Está-se ciente de que artigos que referenciam modelos específicos (</w:t>
-      </w:r>
+        <w:t>string</w:t>
+      </w:r>
+      <w:proofErr w:type="spellEnd"/>
       <w:r>
         <w:rPr>
           <w:i/>
           <w:iCs/>
         </w:rPr>
-        <w:t>Ex.:</w:t>
-      </w:r>
-      <w:r>
+        <w:t xml:space="preserve"> de busca pois é garantido pelos critérios de seleção: a delimitação ao domínio de Engenharia de Software é assegurada pelo CI1, e a exigência de revisão por pares é assegurada pelo CE5.</w:t>
+      </w:r>
+    </w:p>
+    <w:p>
+      <w:pPr>
+        <w:jc w:val="both"/>
         <w:rPr>
           <w:i/>
           <w:iCs/>
         </w:rPr>
-        <w:t xml:space="preserve"> GPT, Llama, Gemini</w:t>
-      </w:r>
+      </w:pPr>
       <w:r>
         <w:rPr>
           <w:i/>
           <w:iCs/>
         </w:rPr>
-        <w:t>, Claude, etc.</w:t>
+        <w:t xml:space="preserve">- </w:t>
       </w:r>
       <w:r>
         <w:rPr>
           <w:i/>
           <w:iCs/>
         </w:rPr>
-        <w:t>) sem empregar os termos "LLM" ou "Large Language Model" podem não ser recuperados; para mitigar parcialmente esse risco, o termo "Generative AI" foi incluído como hiperônimo de uso corrente na literatura, aumentando a chance de cobertura indireta desses modelos. Essa decisão é documentada aqui para fins de rastreabilidade e reprodutibilidade da busca.</w:t>
+        <w:t xml:space="preserve">Embora RAG e LLM componham conceitualmente a mesma Intervenção, eles são representados como dois grupos distintos conectados por AND na </w:t>
+      </w:r>
+      <w:proofErr w:type="spellStart"/>
+      <w:r>
+        <w:rPr>
+          <w:i/>
+          <w:iCs/>
+        </w:rPr>
+        <w:t>string</w:t>
+      </w:r>
+      <w:proofErr w:type="spellEnd"/>
+      <w:r>
+        <w:rPr>
+          <w:i/>
+          <w:iCs/>
+        </w:rPr>
+        <w:t xml:space="preserve"> de busca. Essa decisão é intencional: o AND garante que apenas estudos que tratam explicitamente da combinação RAG+LLM sejam recuperados, excluindo trabalhos sobre RAG sem base em modelos de linguagem de grande escala e trabalhos sobre </w:t>
+      </w:r>
+      <w:proofErr w:type="spellStart"/>
+      <w:r>
+        <w:rPr>
+          <w:i/>
+          <w:iCs/>
+        </w:rPr>
+        <w:t>LLMs</w:t>
+      </w:r>
+      <w:proofErr w:type="spellEnd"/>
+      <w:r>
+        <w:rPr>
+          <w:i/>
+          <w:iCs/>
+        </w:rPr>
+        <w:t xml:space="preserve"> aplicados a código sem componente de recuperação. Trata-se de uma escolha de precisão sobre sensibilidade. Está-se ciente de que artigos que referenciam modelos específicos (</w:t>
+      </w:r>
+      <w:r>
+        <w:rPr>
+          <w:i/>
+          <w:iCs/>
+        </w:rPr>
+        <w:t>Ex.:</w:t>
+      </w:r>
+      <w:r>
+        <w:rPr>
+          <w:i/>
+          <w:iCs/>
+        </w:rPr>
+        <w:t xml:space="preserve"> GPT, </w:t>
+      </w:r>
+      <w:proofErr w:type="spellStart"/>
+      <w:r>
+        <w:rPr>
+          <w:i/>
+          <w:iCs/>
+        </w:rPr>
+        <w:t>Llama</w:t>
+      </w:r>
+      <w:proofErr w:type="spellEnd"/>
+      <w:r>
+        <w:rPr>
+          <w:i/>
+          <w:iCs/>
+        </w:rPr>
+        <w:t>, Gemini</w:t>
+      </w:r>
+      <w:r>
+        <w:rPr>
+          <w:i/>
+          <w:iCs/>
+        </w:rPr>
+        <w:t xml:space="preserve">, </w:t>
+      </w:r>
+      <w:proofErr w:type="gramStart"/>
+      <w:r>
+        <w:rPr>
+          <w:i/>
+          <w:iCs/>
+        </w:rPr>
+        <w:t>Claude, etc.</w:t>
+      </w:r>
+      <w:proofErr w:type="gramEnd"/>
+      <w:r>
+        <w:rPr>
+          <w:i/>
+          <w:iCs/>
+        </w:rPr>
+        <w:t xml:space="preserve">) sem empregar os termos "LLM" ou "Large </w:t>
+      </w:r>
+      <w:proofErr w:type="spellStart"/>
+      <w:r>
+        <w:rPr>
+          <w:i/>
+          <w:iCs/>
+        </w:rPr>
+        <w:t>Language</w:t>
+      </w:r>
+      <w:proofErr w:type="spellEnd"/>
+      <w:r>
+        <w:rPr>
+          <w:i/>
+          <w:iCs/>
+        </w:rPr>
+        <w:t xml:space="preserve"> Model" podem não ser recuperados; para mitigar parcialmente esse risco, o termo "</w:t>
+      </w:r>
+      <w:proofErr w:type="spellStart"/>
+      <w:r>
+        <w:rPr>
+          <w:i/>
+          <w:iCs/>
+        </w:rPr>
+        <w:t>Generative</w:t>
+      </w:r>
+      <w:proofErr w:type="spellEnd"/>
+      <w:r>
+        <w:rPr>
+          <w:i/>
+          <w:iCs/>
+        </w:rPr>
+        <w:t xml:space="preserve"> AI" foi incluído como hiperônimo de uso corrente na literatura, aumentando a chance de cobertura indireta desses modelos. Essa decisão é documentada aqui para fins de rastreabilidade e reprodutibilidade da busca.</w:t>
       </w:r>
     </w:p>
     <w:p/>
@@ -1961,7 +2819,47 @@
               <w:jc w:val="both"/>
             </w:pPr>
             <w:r>
-              <w:t xml:space="preserve">Principal repositório de publicações da Association for Computing Machinery (ACM), com cobertura abrangente de Engenharia de Software e áreas correlatas. Indexa venues de alto impacto como ESEC/FSE, ISSTA, ICSE (co-publicada com IEEE) e periódicos como TOSEM e CACM. Oferece busca avançada com operadores booleanos e exportação estruturada em BibTeX </w:t>
+              <w:t xml:space="preserve">Principal repositório de publicações da </w:t>
+            </w:r>
+            <w:proofErr w:type="spellStart"/>
+            <w:r>
+              <w:t>Association</w:t>
+            </w:r>
+            <w:proofErr w:type="spellEnd"/>
+            <w:r>
+              <w:t xml:space="preserve"> for </w:t>
+            </w:r>
+            <w:proofErr w:type="spellStart"/>
+            <w:r>
+              <w:t>Computing</w:t>
+            </w:r>
+            <w:proofErr w:type="spellEnd"/>
+            <w:r>
+              <w:t xml:space="preserve"> Machinery (ACM), com cobertura abrangente de Engenharia de Software e áreas correlatas. Indexa </w:t>
+            </w:r>
+            <w:proofErr w:type="spellStart"/>
+            <w:r>
+              <w:t>venues</w:t>
+            </w:r>
+            <w:proofErr w:type="spellEnd"/>
+            <w:r>
+              <w:t xml:space="preserve"> de alto impacto como ESEC/FSE, ISSTA, ICSE (</w:t>
+            </w:r>
+            <w:proofErr w:type="spellStart"/>
+            <w:r>
+              <w:t>co-publicada</w:t>
+            </w:r>
+            <w:proofErr w:type="spellEnd"/>
+            <w:r>
+              <w:t xml:space="preserve"> com IEEE) e periódicos como TOSEM e CACM. Oferece busca avançada com operadores booleanos e exportação estruturada em </w:t>
+            </w:r>
+            <w:proofErr w:type="spellStart"/>
+            <w:r>
+              <w:t>BibTeX</w:t>
+            </w:r>
+            <w:proofErr w:type="spellEnd"/>
+            <w:r>
+              <w:t xml:space="preserve"> </w:t>
             </w:r>
             <w:r>
               <w:t>-</w:t>
@@ -1979,8 +2877,13 @@
           </w:tcPr>
           <w:p>
             <w:r>
-              <w:t>IEEE Xplore</w:t>
-            </w:r>
+              <w:t xml:space="preserve">IEEE </w:t>
+            </w:r>
+            <w:proofErr w:type="spellStart"/>
+            <w:r>
+              <w:t>Xplore</w:t>
+            </w:r>
+            <w:proofErr w:type="spellEnd"/>
           </w:p>
         </w:tc>
         <w:tc>
@@ -2002,7 +2905,15 @@
               <w:jc w:val="both"/>
             </w:pPr>
             <w:r>
-              <w:t>Principal repositório de publicações IEEE e IET em Engenharia de Software, Computação e áreas afins. Indexa conferências de alto impacto como ICSE, ASE, SANER e MSR, além dos principais periódicos da área (e.g., IEEE TSE, IEEE Software). Oferece busca avançada com exportação em CSV/BibTeX.</w:t>
+              <w:t>Principal repositório de publicações IEEE e IET em Engenharia de Software, Computação e áreas afins. Indexa conferências de alto impacto como ICSE, ASE, SANER e MSR, além dos principais periódicos da área (e.g., IEEE TSE, IEEE Software). Oferece busca avançada com exportação em CSV/</w:t>
+            </w:r>
+            <w:proofErr w:type="spellStart"/>
+            <w:r>
+              <w:t>BibTeX</w:t>
+            </w:r>
+            <w:proofErr w:type="spellEnd"/>
+            <w:r>
+              <w:t>.</w:t>
             </w:r>
           </w:p>
         </w:tc>
@@ -2054,34 +2965,98 @@
           <w:i/>
           <w:iCs/>
         </w:rPr>
-        <w:t xml:space="preserve">Observação: As bases selecionadas apresentam sobreposição intencional de cobertura. O Scopus indexa publicações da ACM e do IEEE, podendo duplicar resultados já retornados pela ACM Digital Library e pelo IEEE Xplore. Adicionalmente, alguns venues são co-publicados por mais de uma editora </w:t>
-      </w:r>
+        <w:t xml:space="preserve">Observação: As bases selecionadas apresentam sobreposição intencional de cobertura. O Scopus indexa publicações da ACM e do IEEE, podendo duplicar resultados já retornados pela ACM Digital Library e pelo IEEE </w:t>
+      </w:r>
+      <w:proofErr w:type="spellStart"/>
       <w:r>
         <w:rPr>
           <w:i/>
           <w:iCs/>
         </w:rPr>
-        <w:t>(</w:t>
-      </w:r>
+        <w:t>Xplore</w:t>
+      </w:r>
+      <w:proofErr w:type="spellEnd"/>
       <w:r>
         <w:rPr>
           <w:i/>
           <w:iCs/>
         </w:rPr>
-        <w:t>notadamente o ICSE, co-publicado pela ACM e pelo IEEE</w:t>
-      </w:r>
+        <w:t xml:space="preserve">. Adicionalmente, alguns </w:t>
+      </w:r>
+      <w:proofErr w:type="spellStart"/>
       <w:r>
         <w:rPr>
           <w:i/>
           <w:iCs/>
         </w:rPr>
-        <w:t>)</w:t>
-      </w:r>
+        <w:t>venues</w:t>
+      </w:r>
+      <w:proofErr w:type="spellEnd"/>
       <w:r>
         <w:rPr>
           <w:i/>
           <w:iCs/>
         </w:rPr>
+        <w:t xml:space="preserve"> são </w:t>
+      </w:r>
+      <w:proofErr w:type="spellStart"/>
+      <w:r>
+        <w:rPr>
+          <w:i/>
+          <w:iCs/>
+        </w:rPr>
+        <w:t>co-publicados</w:t>
+      </w:r>
+      <w:proofErr w:type="spellEnd"/>
+      <w:r>
+        <w:rPr>
+          <w:i/>
+          <w:iCs/>
+        </w:rPr>
+        <w:t xml:space="preserve"> por mais de uma editora </w:t>
+      </w:r>
+      <w:r>
+        <w:rPr>
+          <w:i/>
+          <w:iCs/>
+        </w:rPr>
+        <w:t>(</w:t>
+      </w:r>
+      <w:r>
+        <w:rPr>
+          <w:i/>
+          <w:iCs/>
+        </w:rPr>
+        <w:t xml:space="preserve">notadamente o ICSE, </w:t>
+      </w:r>
+      <w:proofErr w:type="spellStart"/>
+      <w:r>
+        <w:rPr>
+          <w:i/>
+          <w:iCs/>
+        </w:rPr>
+        <w:t>co-publicado</w:t>
+      </w:r>
+      <w:proofErr w:type="spellEnd"/>
+      <w:r>
+        <w:rPr>
+          <w:i/>
+          <w:iCs/>
+        </w:rPr>
+        <w:t xml:space="preserve"> pela ACM e pelo IEEE</w:t>
+      </w:r>
+      <w:r>
+        <w:rPr>
+          <w:i/>
+          <w:iCs/>
+        </w:rPr>
+        <w:t>)</w:t>
+      </w:r>
+      <w:r>
+        <w:rPr>
+          <w:i/>
+          <w:iCs/>
+        </w:rPr>
         <w:t>. Eventuais duplicatas resultantes da busca em múltiplas bases serão identificadas e tratadas conforme o critério CE3.</w:t>
       </w:r>
     </w:p>
@@ -2106,7 +3081,14 @@
           <w:b/>
           <w:bCs/>
         </w:rPr>
-        <w:t>. Critérios</w:t>
+        <w:t xml:space="preserve">. </w:t>
+      </w:r>
+      <w:r>
+        <w:rPr>
+          <w:b/>
+          <w:bCs/>
+        </w:rPr>
+        <w:t>CRITÉRIOS</w:t>
       </w:r>
     </w:p>
     <w:p>
@@ -2441,7 +3423,15 @@
               <w:t>e</w:t>
             </w:r>
             <w:r>
-              <w:t xml:space="preserve">m caso de mesmo trabalho em múltiplos venues, manter apenas a versão publicada com </w:t>
+              <w:t xml:space="preserve">m caso de mesmo trabalho em múltiplos </w:t>
+            </w:r>
+            <w:proofErr w:type="spellStart"/>
+            <w:r>
+              <w:t>venues</w:t>
+            </w:r>
+            <w:proofErr w:type="spellEnd"/>
+            <w:r>
+              <w:t xml:space="preserve">, manter apenas a versão publicada com </w:t>
             </w:r>
             <w:r>
               <w:t>revisão</w:t>
@@ -2519,7 +3509,23 @@
               <w:jc w:val="both"/>
             </w:pPr>
             <w:r>
-              <w:t>Literatura cinzenta: preprints, relatórios técnicos, whitepapers, posts e artigos sem revisão por pares formal.</w:t>
+              <w:t xml:space="preserve">Literatura cinzenta: </w:t>
+            </w:r>
+            <w:proofErr w:type="spellStart"/>
+            <w:r>
+              <w:t>preprints</w:t>
+            </w:r>
+            <w:proofErr w:type="spellEnd"/>
+            <w:r>
+              <w:t xml:space="preserve">, relatórios técnicos, </w:t>
+            </w:r>
+            <w:proofErr w:type="spellStart"/>
+            <w:r>
+              <w:t>whitepapers</w:t>
+            </w:r>
+            <w:proofErr w:type="spellEnd"/>
+            <w:r>
+              <w:t>, posts e artigos sem revisão por pares formal.</w:t>
             </w:r>
           </w:p>
         </w:tc>
@@ -2600,20 +3606,361 @@
     <w:p/>
     <w:p/>
     <w:p/>
-    <w:p/>
-    <w:p/>
-    <w:p>
-      <w:pPr>
-        <w:rPr>
-          <w:b/>
-          <w:bCs/>
-        </w:rPr>
-      </w:pPr>
-      <w:r>
-        <w:rPr>
-          <w:b/>
-          <w:bCs/>
-        </w:rPr>
+    <w:p>
+      <w:pPr>
+        <w:rPr>
+          <w:b/>
+          <w:bCs/>
+        </w:rPr>
+      </w:pPr>
+    </w:p>
+    <w:p>
+      <w:pPr>
+        <w:rPr>
+          <w:b/>
+          <w:bCs/>
+        </w:rPr>
+      </w:pPr>
+      <w:r>
+        <w:rPr>
+          <w:b/>
+          <w:bCs/>
+        </w:rPr>
+        <w:lastRenderedPageBreak/>
+        <w:t>7</w:t>
+      </w:r>
+      <w:r>
+        <w:rPr>
+          <w:b/>
+          <w:bCs/>
+        </w:rPr>
+        <w:t xml:space="preserve">. </w:t>
+      </w:r>
+      <w:r>
+        <w:rPr>
+          <w:b/>
+          <w:bCs/>
+        </w:rPr>
+        <w:t>PRISMA</w:t>
+      </w:r>
+    </w:p>
+    <w:p>
+      <w:pPr>
+        <w:rPr>
+          <w:b/>
+          <w:bCs/>
+        </w:rPr>
+      </w:pPr>
+    </w:p>
+    <w:p>
+      <w:pPr>
+        <w:jc w:val="both"/>
+      </w:pPr>
+      <w:r>
+        <w:t xml:space="preserve">A busca inicial nas bases de dados eletrônicas retornou um total de 140 registros brutos, distribuídos entre Scopus (n = 77), IEEE </w:t>
+      </w:r>
+      <w:proofErr w:type="spellStart"/>
+      <w:r>
+        <w:t>Xplore</w:t>
+      </w:r>
+      <w:proofErr w:type="spellEnd"/>
+      <w:r>
+        <w:t xml:space="preserve"> (n = 51) e ACM Digital Library (n = 12). Para dar suporte ao gerenciamento e à seleção desses estudos, os metadados</w:t>
+      </w:r>
+      <w:r>
+        <w:t xml:space="preserve"> (.</w:t>
+      </w:r>
+      <w:proofErr w:type="spellStart"/>
+      <w:r>
+        <w:t>bib</w:t>
+      </w:r>
+      <w:proofErr w:type="spellEnd"/>
+      <w:r>
+        <w:t>)</w:t>
+      </w:r>
+      <w:r>
+        <w:t xml:space="preserve"> foram importados para a plataforma </w:t>
+      </w:r>
+      <w:proofErr w:type="spellStart"/>
+      <w:r>
+        <w:t>Rayyan</w:t>
+      </w:r>
+      <w:proofErr w:type="spellEnd"/>
+      <w:r>
+        <w:t xml:space="preserve"> (OUZZANI et al., 2016). Por meio das funcionalidades da ferramenta, foi executado o processo automatizado de detecção de similaridade, resultando na identificação e remoção de 32 registros duplicados, restando 108 artigos únicos para a etapa de triagem. Na sequência, realizou-se a análise preliminar de títulos e resumos dentro da plataforma, o que levou à exclusão de 58 estudos que não atendiam aos critérios de elegibilidade. Ao final desse funil de seleção, 50 estudos primários foram integralmente incluídos para a extração de dados e composição do mapeamento sistemático.</w:t>
+      </w:r>
+    </w:p>
+    <w:p/>
+    <w:p>
+      <w:pPr>
+        <w:rPr>
+          <w:b/>
+          <w:bCs/>
+        </w:rPr>
+      </w:pPr>
+      <w:r>
+        <w:rPr>
+          <w:b/>
+          <w:bCs/>
+        </w:rPr>
+        <w:t>7</w:t>
+      </w:r>
+      <w:r>
+        <w:rPr>
+          <w:b/>
+          <w:bCs/>
+        </w:rPr>
+        <w:t xml:space="preserve">.1. </w:t>
+      </w:r>
+      <w:r>
+        <w:rPr>
+          <w:b/>
+          <w:bCs/>
+        </w:rPr>
+        <w:t>Organização dos dados no fluxo PRISMA</w:t>
+      </w:r>
+    </w:p>
+    <w:p>
+      <w:pPr>
+        <w:rPr>
+          <w:b/>
+          <w:bCs/>
+        </w:rPr>
+      </w:pPr>
+    </w:p>
+    <w:p>
+      <w:pPr>
+        <w:pStyle w:val="PargrafodaLista"/>
+        <w:numPr>
+          <w:ilvl w:val="0"/>
+          <w:numId w:val="3"/>
+        </w:numPr>
+        <w:jc w:val="both"/>
+      </w:pPr>
+      <w:r>
+        <w:rPr>
+          <w:b/>
+          <w:bCs/>
+        </w:rPr>
+        <w:t>Identificação (Total Bruto):</w:t>
+      </w:r>
+      <w:r>
+        <w:t xml:space="preserve"> 140 registros importados.</w:t>
+      </w:r>
+    </w:p>
+    <w:p>
+      <w:pPr>
+        <w:numPr>
+          <w:ilvl w:val="0"/>
+          <w:numId w:val="4"/>
+        </w:numPr>
+        <w:jc w:val="both"/>
+      </w:pPr>
+      <w:r>
+        <w:rPr>
+          <w:i/>
+          <w:iCs/>
+        </w:rPr>
+        <w:t xml:space="preserve">IEEE </w:t>
+      </w:r>
+      <w:proofErr w:type="spellStart"/>
+      <w:r>
+        <w:rPr>
+          <w:i/>
+          <w:iCs/>
+        </w:rPr>
+        <w:t>Xplore</w:t>
+      </w:r>
+      <w:proofErr w:type="spellEnd"/>
+      <w:r>
+        <w:rPr>
+          <w:i/>
+          <w:iCs/>
+        </w:rPr>
+        <w:t>:</w:t>
+      </w:r>
+      <w:r>
+        <w:t xml:space="preserve"> 51</w:t>
+      </w:r>
+    </w:p>
+    <w:p>
+      <w:pPr>
+        <w:numPr>
+          <w:ilvl w:val="0"/>
+          <w:numId w:val="4"/>
+        </w:numPr>
+        <w:jc w:val="both"/>
+      </w:pPr>
+      <w:r>
+        <w:rPr>
+          <w:i/>
+          <w:iCs/>
+        </w:rPr>
+        <w:t>Scopus:</w:t>
+      </w:r>
+      <w:r>
+        <w:t xml:space="preserve"> 77</w:t>
+      </w:r>
+    </w:p>
+    <w:p>
+      <w:pPr>
+        <w:numPr>
+          <w:ilvl w:val="0"/>
+          <w:numId w:val="4"/>
+        </w:numPr>
+        <w:jc w:val="both"/>
+      </w:pPr>
+      <w:r>
+        <w:rPr>
+          <w:i/>
+          <w:iCs/>
+        </w:rPr>
+        <w:t>ACM:</w:t>
+      </w:r>
+      <w:r>
+        <w:t xml:space="preserve"> 12</w:t>
+      </w:r>
+    </w:p>
+    <w:p>
+      <w:pPr>
+        <w:pStyle w:val="PargrafodaLista"/>
+        <w:numPr>
+          <w:ilvl w:val="0"/>
+          <w:numId w:val="3"/>
+        </w:numPr>
+        <w:jc w:val="both"/>
+      </w:pPr>
+      <w:r>
+        <w:rPr>
+          <w:b/>
+          <w:bCs/>
+        </w:rPr>
+        <w:t>Remoção de Duplicatas:</w:t>
+      </w:r>
+      <w:r>
+        <w:t xml:space="preserve"> 32 registros deletados (140 - 32 = 108).</w:t>
+      </w:r>
+    </w:p>
+    <w:p>
+      <w:pPr>
+        <w:pStyle w:val="PargrafodaLista"/>
+        <w:numPr>
+          <w:ilvl w:val="0"/>
+          <w:numId w:val="3"/>
+        </w:numPr>
+        <w:jc w:val="both"/>
+      </w:pPr>
+      <w:r>
+        <w:rPr>
+          <w:b/>
+          <w:bCs/>
+        </w:rPr>
+        <w:t>Triagem (</w:t>
+      </w:r>
+      <w:proofErr w:type="spellStart"/>
+      <w:r>
+        <w:rPr>
+          <w:b/>
+          <w:bCs/>
+        </w:rPr>
+        <w:t>Screening</w:t>
+      </w:r>
+      <w:proofErr w:type="spellEnd"/>
+      <w:r>
+        <w:rPr>
+          <w:b/>
+          <w:bCs/>
+        </w:rPr>
+        <w:t>):</w:t>
+      </w:r>
+      <w:r>
+        <w:t xml:space="preserve"> 108 artigos avaliados (título/resumo).</w:t>
+      </w:r>
+    </w:p>
+    <w:p>
+      <w:pPr>
+        <w:pStyle w:val="PargrafodaLista"/>
+        <w:numPr>
+          <w:ilvl w:val="0"/>
+          <w:numId w:val="3"/>
+        </w:numPr>
+        <w:jc w:val="both"/>
+      </w:pPr>
+      <w:r>
+        <w:rPr>
+          <w:b/>
+          <w:bCs/>
+        </w:rPr>
+        <w:t>Excluídos na Triagem:</w:t>
+      </w:r>
+      <w:r>
+        <w:t xml:space="preserve"> 58 artigos.</w:t>
+      </w:r>
+    </w:p>
+    <w:p>
+      <w:pPr>
+        <w:pStyle w:val="PargrafodaLista"/>
+        <w:numPr>
+          <w:ilvl w:val="0"/>
+          <w:numId w:val="3"/>
+        </w:numPr>
+        <w:jc w:val="both"/>
+      </w:pPr>
+      <w:r>
+        <w:rPr>
+          <w:b/>
+          <w:bCs/>
+        </w:rPr>
+        <w:t>Adicionados</w:t>
+      </w:r>
+      <w:r>
+        <w:rPr>
+          <w:b/>
+          <w:bCs/>
+        </w:rPr>
+        <w:t xml:space="preserve"> (Elegíveis / Amostra Final):</w:t>
+      </w:r>
+      <w:r>
+        <w:t xml:space="preserve"> 50 artigos restantes (108 - 58 = 50).</w:t>
+      </w:r>
+    </w:p>
+    <w:p/>
+    <w:p/>
+    <w:p/>
+    <w:p/>
+    <w:p/>
+    <w:p/>
+    <w:p/>
+    <w:p/>
+    <w:p/>
+    <w:p/>
+    <w:p/>
+    <w:p/>
+    <w:p/>
+    <w:p/>
+    <w:p/>
+    <w:p/>
+    <w:p/>
+    <w:p/>
+    <w:p/>
+    <w:p/>
+    <w:p/>
+    <w:p/>
+    <w:p/>
+    <w:p/>
+    <w:p>
+      <w:pPr>
+        <w:rPr>
+          <w:b/>
+          <w:bCs/>
+        </w:rPr>
+      </w:pPr>
+      <w:r>
+        <w:rPr>
+          <w:b/>
+          <w:bCs/>
+        </w:rPr>
+        <w:lastRenderedPageBreak/>
         <w:t>REFERÊNCIAS</w:t>
       </w:r>
     </w:p>
@@ -2627,17 +3974,187 @@
           <w:sz w:val="24"/>
           <w:szCs w:val="24"/>
         </w:rPr>
-        <w:t xml:space="preserve">BASILI, Victor R.. Software Modeling and Measurement: The Goal/Question/Metric Paradigm. </w:t>
-      </w:r>
-      <w:r>
-        <w:rPr>
-          <w:b/>
-          <w:bCs/>
-          <w:sz w:val="24"/>
-          <w:szCs w:val="24"/>
-        </w:rPr>
-        <w:t>Institute for Advanced Computer Studies</w:t>
-      </w:r>
+        <w:t xml:space="preserve">BASILI, Victor </w:t>
+      </w:r>
+      <w:proofErr w:type="gramStart"/>
+      <w:r>
+        <w:rPr>
+          <w:sz w:val="24"/>
+          <w:szCs w:val="24"/>
+        </w:rPr>
+        <w:t>R..</w:t>
+      </w:r>
+      <w:proofErr w:type="gramEnd"/>
+      <w:r>
+        <w:rPr>
+          <w:sz w:val="24"/>
+          <w:szCs w:val="24"/>
+        </w:rPr>
+        <w:t xml:space="preserve"> Software </w:t>
+      </w:r>
+      <w:proofErr w:type="spellStart"/>
+      <w:r>
+        <w:rPr>
+          <w:sz w:val="24"/>
+          <w:szCs w:val="24"/>
+        </w:rPr>
+        <w:t>Modeling</w:t>
+      </w:r>
+      <w:proofErr w:type="spellEnd"/>
+      <w:r>
+        <w:rPr>
+          <w:sz w:val="24"/>
+          <w:szCs w:val="24"/>
+        </w:rPr>
+        <w:t xml:space="preserve"> </w:t>
+      </w:r>
+      <w:proofErr w:type="spellStart"/>
+      <w:r>
+        <w:rPr>
+          <w:sz w:val="24"/>
+          <w:szCs w:val="24"/>
+        </w:rPr>
+        <w:t>and</w:t>
+      </w:r>
+      <w:proofErr w:type="spellEnd"/>
+      <w:r>
+        <w:rPr>
+          <w:sz w:val="24"/>
+          <w:szCs w:val="24"/>
+        </w:rPr>
+        <w:t xml:space="preserve"> </w:t>
+      </w:r>
+      <w:proofErr w:type="spellStart"/>
+      <w:r>
+        <w:rPr>
+          <w:sz w:val="24"/>
+          <w:szCs w:val="24"/>
+        </w:rPr>
+        <w:t>Measurement</w:t>
+      </w:r>
+      <w:proofErr w:type="spellEnd"/>
+      <w:r>
+        <w:rPr>
+          <w:sz w:val="24"/>
+          <w:szCs w:val="24"/>
+        </w:rPr>
+        <w:t xml:space="preserve">: The </w:t>
+      </w:r>
+      <w:proofErr w:type="spellStart"/>
+      <w:r>
+        <w:rPr>
+          <w:sz w:val="24"/>
+          <w:szCs w:val="24"/>
+        </w:rPr>
+        <w:t>Goal</w:t>
+      </w:r>
+      <w:proofErr w:type="spellEnd"/>
+      <w:r>
+        <w:rPr>
+          <w:sz w:val="24"/>
+          <w:szCs w:val="24"/>
+        </w:rPr>
+        <w:t>/</w:t>
+      </w:r>
+      <w:proofErr w:type="spellStart"/>
+      <w:r>
+        <w:rPr>
+          <w:sz w:val="24"/>
+          <w:szCs w:val="24"/>
+        </w:rPr>
+        <w:t>Question</w:t>
+      </w:r>
+      <w:proofErr w:type="spellEnd"/>
+      <w:r>
+        <w:rPr>
+          <w:sz w:val="24"/>
+          <w:szCs w:val="24"/>
+        </w:rPr>
+        <w:t>/</w:t>
+      </w:r>
+      <w:proofErr w:type="spellStart"/>
+      <w:r>
+        <w:rPr>
+          <w:sz w:val="24"/>
+          <w:szCs w:val="24"/>
+        </w:rPr>
+        <w:t>Metric</w:t>
+      </w:r>
+      <w:proofErr w:type="spellEnd"/>
+      <w:r>
+        <w:rPr>
+          <w:sz w:val="24"/>
+          <w:szCs w:val="24"/>
+        </w:rPr>
+        <w:t xml:space="preserve"> </w:t>
+      </w:r>
+      <w:proofErr w:type="spellStart"/>
+      <w:r>
+        <w:rPr>
+          <w:sz w:val="24"/>
+          <w:szCs w:val="24"/>
+        </w:rPr>
+        <w:t>Paradigm</w:t>
+      </w:r>
+      <w:proofErr w:type="spellEnd"/>
+      <w:r>
+        <w:rPr>
+          <w:sz w:val="24"/>
+          <w:szCs w:val="24"/>
+        </w:rPr>
+        <w:t xml:space="preserve">. </w:t>
+      </w:r>
+      <w:proofErr w:type="spellStart"/>
+      <w:r>
+        <w:rPr>
+          <w:b/>
+          <w:bCs/>
+          <w:sz w:val="24"/>
+          <w:szCs w:val="24"/>
+        </w:rPr>
+        <w:t>Institute</w:t>
+      </w:r>
+      <w:proofErr w:type="spellEnd"/>
+      <w:r>
+        <w:rPr>
+          <w:b/>
+          <w:bCs/>
+          <w:sz w:val="24"/>
+          <w:szCs w:val="24"/>
+        </w:rPr>
+        <w:t xml:space="preserve"> for </w:t>
+      </w:r>
+      <w:proofErr w:type="spellStart"/>
+      <w:r>
+        <w:rPr>
+          <w:b/>
+          <w:bCs/>
+          <w:sz w:val="24"/>
+          <w:szCs w:val="24"/>
+        </w:rPr>
+        <w:t>Advanced</w:t>
+      </w:r>
+      <w:proofErr w:type="spellEnd"/>
+      <w:r>
+        <w:rPr>
+          <w:b/>
+          <w:bCs/>
+          <w:sz w:val="24"/>
+          <w:szCs w:val="24"/>
+        </w:rPr>
+        <w:t xml:space="preserve"> Computer </w:t>
+      </w:r>
+      <w:proofErr w:type="spellStart"/>
+      <w:r>
+        <w:rPr>
+          <w:b/>
+          <w:bCs/>
+          <w:sz w:val="24"/>
+          <w:szCs w:val="24"/>
+        </w:rPr>
+        <w:t>Studies</w:t>
+      </w:r>
+      <w:proofErr w:type="spellEnd"/>
       <w:r>
         <w:rPr>
           <w:sz w:val="24"/>
@@ -2650,14 +4167,78 @@
           <w:sz w:val="24"/>
           <w:szCs w:val="24"/>
         </w:rPr>
-        <w:t xml:space="preserve"> Department of Computer Science,</w:t>
-      </w:r>
-      <w:r>
-        <w:rPr>
-          <w:sz w:val="24"/>
-          <w:szCs w:val="24"/>
-        </w:rPr>
-        <w:t xml:space="preserve"> University of Maryland, 1992.</w:t>
+        <w:t xml:space="preserve"> </w:t>
+      </w:r>
+      <w:proofErr w:type="spellStart"/>
+      <w:r>
+        <w:rPr>
+          <w:sz w:val="24"/>
+          <w:szCs w:val="24"/>
+        </w:rPr>
+        <w:t>Department</w:t>
+      </w:r>
+      <w:proofErr w:type="spellEnd"/>
+      <w:r>
+        <w:rPr>
+          <w:sz w:val="24"/>
+          <w:szCs w:val="24"/>
+        </w:rPr>
+        <w:t xml:space="preserve"> </w:t>
+      </w:r>
+      <w:proofErr w:type="spellStart"/>
+      <w:r>
+        <w:rPr>
+          <w:sz w:val="24"/>
+          <w:szCs w:val="24"/>
+        </w:rPr>
+        <w:t>of</w:t>
+      </w:r>
+      <w:proofErr w:type="spellEnd"/>
+      <w:r>
+        <w:rPr>
+          <w:sz w:val="24"/>
+          <w:szCs w:val="24"/>
+        </w:rPr>
+        <w:t xml:space="preserve"> Computer Science,</w:t>
+      </w:r>
+      <w:r>
+        <w:rPr>
+          <w:sz w:val="24"/>
+          <w:szCs w:val="24"/>
+        </w:rPr>
+        <w:t xml:space="preserve"> </w:t>
+      </w:r>
+      <w:proofErr w:type="spellStart"/>
+      <w:r>
+        <w:rPr>
+          <w:sz w:val="24"/>
+          <w:szCs w:val="24"/>
+        </w:rPr>
+        <w:t>University</w:t>
+      </w:r>
+      <w:proofErr w:type="spellEnd"/>
+      <w:r>
+        <w:rPr>
+          <w:sz w:val="24"/>
+          <w:szCs w:val="24"/>
+        </w:rPr>
+        <w:t xml:space="preserve"> </w:t>
+      </w:r>
+      <w:proofErr w:type="spellStart"/>
+      <w:r>
+        <w:rPr>
+          <w:sz w:val="24"/>
+          <w:szCs w:val="24"/>
+        </w:rPr>
+        <w:t>of</w:t>
+      </w:r>
+      <w:proofErr w:type="spellEnd"/>
+      <w:r>
+        <w:rPr>
+          <w:sz w:val="24"/>
+          <w:szCs w:val="24"/>
+        </w:rPr>
+        <w:t xml:space="preserve"> Maryland, 1992.</w:t>
       </w:r>
     </w:p>
     <w:p>
@@ -2674,17 +4255,148 @@
           <w:sz w:val="24"/>
           <w:szCs w:val="24"/>
         </w:rPr>
-        <w:t xml:space="preserve">BASILI, Victor; WEISS, David M.. A Methodology for Collecting Valid Software Engineering Data. </w:t>
-      </w:r>
-      <w:r>
-        <w:rPr>
-          <w:b/>
-          <w:bCs/>
-          <w:sz w:val="24"/>
-          <w:szCs w:val="24"/>
-        </w:rPr>
-        <w:t>IEEE Transactions on Software Engineering</w:t>
-      </w:r>
+        <w:t xml:space="preserve">BASILI, Victor; WEISS, David </w:t>
+      </w:r>
+      <w:proofErr w:type="gramStart"/>
+      <w:r>
+        <w:rPr>
+          <w:sz w:val="24"/>
+          <w:szCs w:val="24"/>
+        </w:rPr>
+        <w:t>M..</w:t>
+      </w:r>
+      <w:proofErr w:type="gramEnd"/>
+      <w:r>
+        <w:rPr>
+          <w:sz w:val="24"/>
+          <w:szCs w:val="24"/>
+        </w:rPr>
+        <w:t xml:space="preserve"> A </w:t>
+      </w:r>
+      <w:proofErr w:type="spellStart"/>
+      <w:r>
+        <w:rPr>
+          <w:sz w:val="24"/>
+          <w:szCs w:val="24"/>
+        </w:rPr>
+        <w:t>Methodology</w:t>
+      </w:r>
+      <w:proofErr w:type="spellEnd"/>
+      <w:r>
+        <w:rPr>
+          <w:sz w:val="24"/>
+          <w:szCs w:val="24"/>
+        </w:rPr>
+        <w:t xml:space="preserve"> for </w:t>
+      </w:r>
+      <w:proofErr w:type="spellStart"/>
+      <w:r>
+        <w:rPr>
+          <w:sz w:val="24"/>
+          <w:szCs w:val="24"/>
+        </w:rPr>
+        <w:t>Collecting</w:t>
+      </w:r>
+      <w:proofErr w:type="spellEnd"/>
+      <w:r>
+        <w:rPr>
+          <w:sz w:val="24"/>
+          <w:szCs w:val="24"/>
+        </w:rPr>
+        <w:t xml:space="preserve"> </w:t>
+      </w:r>
+      <w:proofErr w:type="spellStart"/>
+      <w:r>
+        <w:rPr>
+          <w:sz w:val="24"/>
+          <w:szCs w:val="24"/>
+        </w:rPr>
+        <w:t>Valid</w:t>
+      </w:r>
+      <w:proofErr w:type="spellEnd"/>
+      <w:r>
+        <w:rPr>
+          <w:sz w:val="24"/>
+          <w:szCs w:val="24"/>
+        </w:rPr>
+        <w:t xml:space="preserve"> Software </w:t>
+      </w:r>
+      <w:proofErr w:type="spellStart"/>
+      <w:r>
+        <w:rPr>
+          <w:sz w:val="24"/>
+          <w:szCs w:val="24"/>
+        </w:rPr>
+        <w:t>Engineering</w:t>
+      </w:r>
+      <w:proofErr w:type="spellEnd"/>
+      <w:r>
+        <w:rPr>
+          <w:sz w:val="24"/>
+          <w:szCs w:val="24"/>
+        </w:rPr>
+        <w:t xml:space="preserve"> Data. </w:t>
+      </w:r>
+      <w:r>
+        <w:rPr>
+          <w:b/>
+          <w:bCs/>
+          <w:sz w:val="24"/>
+          <w:szCs w:val="24"/>
+        </w:rPr>
+        <w:t xml:space="preserve">IEEE </w:t>
+      </w:r>
+      <w:proofErr w:type="spellStart"/>
+      <w:r>
+        <w:rPr>
+          <w:b/>
+          <w:bCs/>
+          <w:sz w:val="24"/>
+          <w:szCs w:val="24"/>
+        </w:rPr>
+        <w:t>Transactions</w:t>
+      </w:r>
+      <w:proofErr w:type="spellEnd"/>
+      <w:r>
+        <w:rPr>
+          <w:b/>
+          <w:bCs/>
+          <w:sz w:val="24"/>
+          <w:szCs w:val="24"/>
+        </w:rPr>
+        <w:t xml:space="preserve"> </w:t>
+      </w:r>
+      <w:proofErr w:type="spellStart"/>
+      <w:r>
+        <w:rPr>
+          <w:b/>
+          <w:bCs/>
+          <w:sz w:val="24"/>
+          <w:szCs w:val="24"/>
+        </w:rPr>
+        <w:t>on</w:t>
+      </w:r>
+      <w:proofErr w:type="spellEnd"/>
+      <w:r>
+        <w:rPr>
+          <w:b/>
+          <w:bCs/>
+          <w:sz w:val="24"/>
+          <w:szCs w:val="24"/>
+        </w:rPr>
+        <w:t xml:space="preserve"> Software </w:t>
+      </w:r>
+      <w:proofErr w:type="spellStart"/>
+      <w:r>
+        <w:rPr>
+          <w:b/>
+          <w:bCs/>
+          <w:sz w:val="24"/>
+          <w:szCs w:val="24"/>
+        </w:rPr>
+        <w:t>Engineering</w:t>
+      </w:r>
+      <w:proofErr w:type="spellEnd"/>
       <w:r>
         <w:rPr>
           <w:sz w:val="24"/>
@@ -2763,8 +4475,41 @@
           <w:sz w:val="24"/>
           <w:szCs w:val="24"/>
         </w:rPr>
-        <w:t xml:space="preserve">. Guidelines for performing </w:t>
-      </w:r>
+        <w:t xml:space="preserve">. </w:t>
+      </w:r>
+      <w:proofErr w:type="spellStart"/>
+      <w:r>
+        <w:rPr>
+          <w:sz w:val="24"/>
+          <w:szCs w:val="24"/>
+        </w:rPr>
+        <w:t>Guidelines</w:t>
+      </w:r>
+      <w:proofErr w:type="spellEnd"/>
+      <w:r>
+        <w:rPr>
+          <w:sz w:val="24"/>
+          <w:szCs w:val="24"/>
+        </w:rPr>
+        <w:t xml:space="preserve"> for </w:t>
+      </w:r>
+      <w:proofErr w:type="spellStart"/>
+      <w:r>
+        <w:rPr>
+          <w:sz w:val="24"/>
+          <w:szCs w:val="24"/>
+        </w:rPr>
+        <w:t>performing</w:t>
+      </w:r>
+      <w:proofErr w:type="spellEnd"/>
+      <w:r>
+        <w:rPr>
+          <w:sz w:val="24"/>
+          <w:szCs w:val="24"/>
+        </w:rPr>
+        <w:t xml:space="preserve"> </w:t>
+      </w:r>
+      <w:proofErr w:type="spellStart"/>
       <w:r>
         <w:rPr>
           <w:sz w:val="24"/>
@@ -2777,8 +4522,17 @@
           <w:sz w:val="24"/>
           <w:szCs w:val="24"/>
         </w:rPr>
-        <w:t xml:space="preserve">ystematic </w:t>
-      </w:r>
+        <w:t>ystematic</w:t>
+      </w:r>
+      <w:proofErr w:type="spellEnd"/>
+      <w:r>
+        <w:rPr>
+          <w:sz w:val="24"/>
+          <w:szCs w:val="24"/>
+        </w:rPr>
+        <w:t xml:space="preserve"> </w:t>
+      </w:r>
+      <w:proofErr w:type="spellStart"/>
       <w:r>
         <w:rPr>
           <w:sz w:val="24"/>
@@ -2791,7 +4545,15 @@
           <w:sz w:val="24"/>
           <w:szCs w:val="24"/>
         </w:rPr>
-        <w:t xml:space="preserve">iterature </w:t>
+        <w:t>iterature</w:t>
+      </w:r>
+      <w:proofErr w:type="spellEnd"/>
+      <w:r>
+        <w:rPr>
+          <w:sz w:val="24"/>
+          <w:szCs w:val="24"/>
+        </w:rPr>
+        <w:t xml:space="preserve"> </w:t>
       </w:r>
       <w:r>
         <w:rPr>
@@ -2821,6 +4583,7 @@
         </w:rPr>
         <w:t xml:space="preserve">oftware </w:t>
       </w:r>
+      <w:proofErr w:type="spellStart"/>
       <w:r>
         <w:rPr>
           <w:sz w:val="24"/>
@@ -2833,23 +4596,83 @@
           <w:sz w:val="24"/>
           <w:szCs w:val="24"/>
         </w:rPr>
-        <w:t xml:space="preserve">ngineering. </w:t>
-      </w:r>
-      <w:r>
-        <w:rPr>
-          <w:b/>
-          <w:bCs/>
-          <w:sz w:val="24"/>
-          <w:szCs w:val="24"/>
-        </w:rPr>
-        <w:t>EBSE Technical Report EBSE-2007-01</w:t>
-      </w:r>
-      <w:r>
-        <w:rPr>
-          <w:sz w:val="24"/>
-          <w:szCs w:val="24"/>
-        </w:rPr>
-        <w:t>, Keele University,</w:t>
+        <w:t>ngineering</w:t>
+      </w:r>
+      <w:proofErr w:type="spellEnd"/>
+      <w:r>
+        <w:rPr>
+          <w:sz w:val="24"/>
+          <w:szCs w:val="24"/>
+        </w:rPr>
+        <w:t xml:space="preserve">. </w:t>
+      </w:r>
+      <w:r>
+        <w:rPr>
+          <w:b/>
+          <w:bCs/>
+          <w:sz w:val="24"/>
+          <w:szCs w:val="24"/>
+        </w:rPr>
+        <w:t xml:space="preserve">EBSE </w:t>
+      </w:r>
+      <w:proofErr w:type="spellStart"/>
+      <w:r>
+        <w:rPr>
+          <w:b/>
+          <w:bCs/>
+          <w:sz w:val="24"/>
+          <w:szCs w:val="24"/>
+        </w:rPr>
+        <w:t>Technical</w:t>
+      </w:r>
+      <w:proofErr w:type="spellEnd"/>
+      <w:r>
+        <w:rPr>
+          <w:b/>
+          <w:bCs/>
+          <w:sz w:val="24"/>
+          <w:szCs w:val="24"/>
+        </w:rPr>
+        <w:t xml:space="preserve"> Report EBSE-2007-01</w:t>
+      </w:r>
+      <w:r>
+        <w:rPr>
+          <w:sz w:val="24"/>
+          <w:szCs w:val="24"/>
+        </w:rPr>
+        <w:t xml:space="preserve">, </w:t>
+      </w:r>
+      <w:proofErr w:type="spellStart"/>
+      <w:r>
+        <w:rPr>
+          <w:sz w:val="24"/>
+          <w:szCs w:val="24"/>
+        </w:rPr>
+        <w:t>Keele</w:t>
+      </w:r>
+      <w:proofErr w:type="spellEnd"/>
+      <w:r>
+        <w:rPr>
+          <w:sz w:val="24"/>
+          <w:szCs w:val="24"/>
+        </w:rPr>
+        <w:t xml:space="preserve"> </w:t>
+      </w:r>
+      <w:proofErr w:type="spellStart"/>
+      <w:r>
+        <w:rPr>
+          <w:sz w:val="24"/>
+          <w:szCs w:val="24"/>
+        </w:rPr>
+        <w:t>University</w:t>
+      </w:r>
+      <w:proofErr w:type="spellEnd"/>
+      <w:r>
+        <w:rPr>
+          <w:sz w:val="24"/>
+          <w:szCs w:val="24"/>
+        </w:rPr>
+        <w:t>,</w:t>
       </w:r>
       <w:r>
         <w:rPr>
@@ -2880,6 +4703,98 @@
           <w:sz w:val="24"/>
           <w:szCs w:val="24"/>
         </w:rPr>
+        <w:t xml:space="preserve">OUZZANI, Mourad et al. </w:t>
+      </w:r>
+      <w:proofErr w:type="spellStart"/>
+      <w:r>
+        <w:rPr>
+          <w:sz w:val="24"/>
+          <w:szCs w:val="24"/>
+        </w:rPr>
+        <w:t>Rayyan</w:t>
+      </w:r>
+      <w:proofErr w:type="spellEnd"/>
+      <w:r>
+        <w:rPr>
+          <w:sz w:val="24"/>
+          <w:szCs w:val="24"/>
+        </w:rPr>
+        <w:t xml:space="preserve"> – a web </w:t>
+      </w:r>
+      <w:proofErr w:type="spellStart"/>
+      <w:r>
+        <w:rPr>
+          <w:sz w:val="24"/>
+          <w:szCs w:val="24"/>
+        </w:rPr>
+        <w:t>and</w:t>
+      </w:r>
+      <w:proofErr w:type="spellEnd"/>
+      <w:r>
+        <w:rPr>
+          <w:sz w:val="24"/>
+          <w:szCs w:val="24"/>
+        </w:rPr>
+        <w:t xml:space="preserve"> mobile app for </w:t>
+      </w:r>
+      <w:proofErr w:type="spellStart"/>
+      <w:r>
+        <w:rPr>
+          <w:sz w:val="24"/>
+          <w:szCs w:val="24"/>
+        </w:rPr>
+        <w:t>systematic</w:t>
+      </w:r>
+      <w:proofErr w:type="spellEnd"/>
+      <w:r>
+        <w:rPr>
+          <w:sz w:val="24"/>
+          <w:szCs w:val="24"/>
+        </w:rPr>
+        <w:t xml:space="preserve"> reviews. </w:t>
+      </w:r>
+      <w:proofErr w:type="spellStart"/>
+      <w:r>
+        <w:rPr>
+          <w:b/>
+          <w:bCs/>
+          <w:sz w:val="24"/>
+          <w:szCs w:val="24"/>
+        </w:rPr>
+        <w:t>Systematic</w:t>
+      </w:r>
+      <w:proofErr w:type="spellEnd"/>
+      <w:r>
+        <w:rPr>
+          <w:b/>
+          <w:bCs/>
+          <w:sz w:val="24"/>
+          <w:szCs w:val="24"/>
+        </w:rPr>
+        <w:t xml:space="preserve"> Reviews</w:t>
+      </w:r>
+      <w:r>
+        <w:rPr>
+          <w:sz w:val="24"/>
+          <w:szCs w:val="24"/>
+        </w:rPr>
+        <w:t>, 2016.</w:t>
+      </w:r>
+    </w:p>
+    <w:p>
+      <w:pPr>
+        <w:spacing w:before="240" w:after="240"/>
+        <w:jc w:val="both"/>
+        <w:rPr>
+          <w:sz w:val="24"/>
+          <w:szCs w:val="24"/>
+        </w:rPr>
+      </w:pPr>
+      <w:r>
+        <w:rPr>
+          <w:sz w:val="24"/>
+          <w:szCs w:val="24"/>
+        </w:rPr>
         <w:t>PETERSEN, K</w:t>
       </w:r>
       <w:r>
@@ -2894,16 +4809,143 @@
           <w:sz w:val="24"/>
           <w:szCs w:val="24"/>
         </w:rPr>
-        <w:t xml:space="preserve"> et al. Guidelines for conducting systematic mapping studies in software engineering: An update. </w:t>
-      </w:r>
-      <w:r>
-        <w:rPr>
-          <w:b/>
-          <w:bCs/>
-          <w:sz w:val="24"/>
-          <w:szCs w:val="24"/>
-        </w:rPr>
-        <w:t>Information and Software Technology</w:t>
+        <w:t xml:space="preserve"> et al. </w:t>
+      </w:r>
+      <w:proofErr w:type="spellStart"/>
+      <w:r>
+        <w:rPr>
+          <w:sz w:val="24"/>
+          <w:szCs w:val="24"/>
+        </w:rPr>
+        <w:t>Guidelines</w:t>
+      </w:r>
+      <w:proofErr w:type="spellEnd"/>
+      <w:r>
+        <w:rPr>
+          <w:sz w:val="24"/>
+          <w:szCs w:val="24"/>
+        </w:rPr>
+        <w:t xml:space="preserve"> for </w:t>
+      </w:r>
+      <w:proofErr w:type="spellStart"/>
+      <w:r>
+        <w:rPr>
+          <w:sz w:val="24"/>
+          <w:szCs w:val="24"/>
+        </w:rPr>
+        <w:t>conducting</w:t>
+      </w:r>
+      <w:proofErr w:type="spellEnd"/>
+      <w:r>
+        <w:rPr>
+          <w:sz w:val="24"/>
+          <w:szCs w:val="24"/>
+        </w:rPr>
+        <w:t xml:space="preserve"> </w:t>
+      </w:r>
+      <w:proofErr w:type="spellStart"/>
+      <w:r>
+        <w:rPr>
+          <w:sz w:val="24"/>
+          <w:szCs w:val="24"/>
+        </w:rPr>
+        <w:t>systematic</w:t>
+      </w:r>
+      <w:proofErr w:type="spellEnd"/>
+      <w:r>
+        <w:rPr>
+          <w:sz w:val="24"/>
+          <w:szCs w:val="24"/>
+        </w:rPr>
+        <w:t xml:space="preserve"> mapping </w:t>
+      </w:r>
+      <w:proofErr w:type="spellStart"/>
+      <w:r>
+        <w:rPr>
+          <w:sz w:val="24"/>
+          <w:szCs w:val="24"/>
+        </w:rPr>
+        <w:t>studies</w:t>
+      </w:r>
+      <w:proofErr w:type="spellEnd"/>
+      <w:r>
+        <w:rPr>
+          <w:sz w:val="24"/>
+          <w:szCs w:val="24"/>
+        </w:rPr>
+        <w:t xml:space="preserve"> in software </w:t>
+      </w:r>
+      <w:proofErr w:type="spellStart"/>
+      <w:r>
+        <w:rPr>
+          <w:sz w:val="24"/>
+          <w:szCs w:val="24"/>
+        </w:rPr>
+        <w:t>engineering</w:t>
+      </w:r>
+      <w:proofErr w:type="spellEnd"/>
+      <w:r>
+        <w:rPr>
+          <w:sz w:val="24"/>
+          <w:szCs w:val="24"/>
+        </w:rPr>
+        <w:t xml:space="preserve">: </w:t>
+      </w:r>
+      <w:proofErr w:type="spellStart"/>
+      <w:r>
+        <w:rPr>
+          <w:sz w:val="24"/>
+          <w:szCs w:val="24"/>
+        </w:rPr>
+        <w:t>An</w:t>
+      </w:r>
+      <w:proofErr w:type="spellEnd"/>
+      <w:r>
+        <w:rPr>
+          <w:sz w:val="24"/>
+          <w:szCs w:val="24"/>
+        </w:rPr>
+        <w:t xml:space="preserve"> update. </w:t>
+      </w:r>
+      <w:proofErr w:type="spellStart"/>
+      <w:r>
+        <w:rPr>
+          <w:b/>
+          <w:bCs/>
+          <w:sz w:val="24"/>
+          <w:szCs w:val="24"/>
+        </w:rPr>
+        <w:t>Information</w:t>
+      </w:r>
+      <w:proofErr w:type="spellEnd"/>
+      <w:r>
+        <w:rPr>
+          <w:b/>
+          <w:bCs/>
+          <w:sz w:val="24"/>
+          <w:szCs w:val="24"/>
+        </w:rPr>
+        <w:t xml:space="preserve"> </w:t>
+      </w:r>
+      <w:proofErr w:type="spellStart"/>
+      <w:r>
+        <w:rPr>
+          <w:b/>
+          <w:bCs/>
+          <w:sz w:val="24"/>
+          <w:szCs w:val="24"/>
+        </w:rPr>
+        <w:t>and</w:t>
+      </w:r>
+      <w:proofErr w:type="spellEnd"/>
+      <w:r>
+        <w:rPr>
+          <w:b/>
+          <w:bCs/>
+          <w:sz w:val="24"/>
+          <w:szCs w:val="24"/>
+        </w:rPr>
+        <w:t xml:space="preserve"> Software Technology</w:t>
       </w:r>
       <w:r>
         <w:rPr>
@@ -2936,6 +4978,547 @@
     </w:sectPr>
   </w:body>
 </w:document>
+</file>
+
+<file path=word/numbering.xml><?xml version="1.0" encoding="utf-8"?>
+<w:numbering xmlns:wpc="http://schemas.microsoft.com/office/word/2010/wordprocessingCanvas" xmlns:cx="http://schemas.microsoft.com/office/drawing/2014/chartex" xmlns:cx1="http://schemas.microsoft.com/office/drawing/2015/9/8/chartex" xmlns:cx2="http://schemas.microsoft.com/office/drawing/2015/10/21/chartex" xmlns:cx3="http://schemas.microsoft.com/office/drawing/2016/5/9/chartex" xmlns:cx4="http://schemas.microsoft.com/office/drawing/2016/5/10/chartex" xmlns:cx5="http://schemas.microsoft.com/office/drawing/2016/5/11/chartex" xmlns:cx6="http://schemas.microsoft.com/office/drawing/2016/5/12/chartex" xmlns:cx7="http://schemas.microsoft.com/office/drawing/2016/5/13/chartex" xmlns:cx8="http://schemas.microsoft.com/office/drawing/2016/5/14/chartex" xmlns:mc="http://schemas.openxmlformats.org/markup-compatibility/2006" xmlns:aink="http://schemas.microsoft.com/office/drawing/2016/ink" xmlns:am3d="http://schemas.microsoft.com/office/drawing/2017/model3d" xmlns:o="urn:schemas-microsoft-com:office:office" xmlns:oel="http://schemas.microsoft.com/office/2019/extlst" xmlns:r="http://schemas.openxmlformats.org/officeDocument/2006/relationships" xmlns:m="http://schemas.openxmlformats.org/officeDocument/2006/math" xmlns:v="urn:schemas-microsoft-com:vml" xmlns:wp14="http://schemas.microsoft.com/office/word/2010/wordprocessingDrawing" xmlns:wp="http://schemas.openxmlformats.org/drawingml/2006/wordprocessingDrawing" xmlns:w10="urn:schemas-microsoft-com:office:word" xmlns:w="http://schemas.openxmlformats.org/wordprocessingml/2006/main" xmlns:w14="http://schemas.microsoft.com/office/word/2010/wordml" xmlns:w15="http://schemas.microsoft.com/office/word/2012/wordml" xmlns:w16cex="http://schemas.microsoft.com/office/word/2018/wordml/cex" xmlns:w16cid="http://schemas.microsoft.com/office/word/2016/wordml/cid" xmlns:w16="http://schemas.microsoft.com/office/word/2018/wordml" xmlns:w16du="http://schemas.microsoft.com/office/word/2023/wordml/word16du" xmlns:w16sdtdh="http://schemas.microsoft.com/office/word/2020/wordml/sdtdatahash" xmlns:w16sdtfl="http://schemas.microsoft.com/office/word/2024/wordml/sdtformatlock" xmlns:w16se="http://schemas.microsoft.com/office/word/2015/wordml/symex" xmlns:wpg="http://schemas.microsoft.com/office/word/2010/wordprocessingGroup" xmlns:wpi="http://schemas.microsoft.com/office/word/2010/wordprocessingInk" xmlns:wne="http://schemas.microsoft.com/office/word/2006/wordml" xmlns:wps="http://schemas.microsoft.com/office/word/2010/wordprocessingShape" mc:Ignorable="w14 w15 w16se w16cid w16 w16cex w16sdtdh w16sdtfl w16du wp14">
+  <w:abstractNum w:abstractNumId="0" w15:restartNumberingAfterBreak="0">
+    <w:nsid w:val="1266051D"/>
+    <w:multiLevelType w:val="hybridMultilevel"/>
+    <w:tmpl w:val="9878CBFC"/>
+    <w:lvl w:ilvl="0" w:tplc="04160001">
+      <w:start w:val="1"/>
+      <w:numFmt w:val="bullet"/>
+      <w:lvlText w:val=""/>
+      <w:lvlJc w:val="left"/>
+      <w:pPr>
+        <w:ind w:left="720" w:hanging="360"/>
+      </w:pPr>
+      <w:rPr>
+        <w:rFonts w:ascii="Symbol" w:hAnsi="Symbol" w:hint="default"/>
+      </w:rPr>
+    </w:lvl>
+    <w:lvl w:ilvl="1" w:tplc="04160003" w:tentative="1">
+      <w:start w:val="1"/>
+      <w:numFmt w:val="bullet"/>
+      <w:lvlText w:val="o"/>
+      <w:lvlJc w:val="left"/>
+      <w:pPr>
+        <w:ind w:left="1440" w:hanging="360"/>
+      </w:pPr>
+      <w:rPr>
+        <w:rFonts w:ascii="Courier New" w:hAnsi="Courier New" w:cs="Courier New" w:hint="default"/>
+      </w:rPr>
+    </w:lvl>
+    <w:lvl w:ilvl="2" w:tplc="04160005" w:tentative="1">
+      <w:start w:val="1"/>
+      <w:numFmt w:val="bullet"/>
+      <w:lvlText w:val=""/>
+      <w:lvlJc w:val="left"/>
+      <w:pPr>
+        <w:ind w:left="2160" w:hanging="360"/>
+      </w:pPr>
+      <w:rPr>
+        <w:rFonts w:ascii="Wingdings" w:hAnsi="Wingdings" w:hint="default"/>
+      </w:rPr>
+    </w:lvl>
+    <w:lvl w:ilvl="3" w:tplc="04160001" w:tentative="1">
+      <w:start w:val="1"/>
+      <w:numFmt w:val="bullet"/>
+      <w:lvlText w:val=""/>
+      <w:lvlJc w:val="left"/>
+      <w:pPr>
+        <w:ind w:left="2880" w:hanging="360"/>
+      </w:pPr>
+      <w:rPr>
+        <w:rFonts w:ascii="Symbol" w:hAnsi="Symbol" w:hint="default"/>
+      </w:rPr>
+    </w:lvl>
+    <w:lvl w:ilvl="4" w:tplc="04160003" w:tentative="1">
+      <w:start w:val="1"/>
+      <w:numFmt w:val="bullet"/>
+      <w:lvlText w:val="o"/>
+      <w:lvlJc w:val="left"/>
+      <w:pPr>
+        <w:ind w:left="3600" w:hanging="360"/>
+      </w:pPr>
+      <w:rPr>
+        <w:rFonts w:ascii="Courier New" w:hAnsi="Courier New" w:cs="Courier New" w:hint="default"/>
+      </w:rPr>
+    </w:lvl>
+    <w:lvl w:ilvl="5" w:tplc="04160005" w:tentative="1">
+      <w:start w:val="1"/>
+      <w:numFmt w:val="bullet"/>
+      <w:lvlText w:val=""/>
+      <w:lvlJc w:val="left"/>
+      <w:pPr>
+        <w:ind w:left="4320" w:hanging="360"/>
+      </w:pPr>
+      <w:rPr>
+        <w:rFonts w:ascii="Wingdings" w:hAnsi="Wingdings" w:hint="default"/>
+      </w:rPr>
+    </w:lvl>
+    <w:lvl w:ilvl="6" w:tplc="04160001" w:tentative="1">
+      <w:start w:val="1"/>
+      <w:numFmt w:val="bullet"/>
+      <w:lvlText w:val=""/>
+      <w:lvlJc w:val="left"/>
+      <w:pPr>
+        <w:ind w:left="5040" w:hanging="360"/>
+      </w:pPr>
+      <w:rPr>
+        <w:rFonts w:ascii="Symbol" w:hAnsi="Symbol" w:hint="default"/>
+      </w:rPr>
+    </w:lvl>
+    <w:lvl w:ilvl="7" w:tplc="04160003" w:tentative="1">
+      <w:start w:val="1"/>
+      <w:numFmt w:val="bullet"/>
+      <w:lvlText w:val="o"/>
+      <w:lvlJc w:val="left"/>
+      <w:pPr>
+        <w:ind w:left="5760" w:hanging="360"/>
+      </w:pPr>
+      <w:rPr>
+        <w:rFonts w:ascii="Courier New" w:hAnsi="Courier New" w:cs="Courier New" w:hint="default"/>
+      </w:rPr>
+    </w:lvl>
+    <w:lvl w:ilvl="8" w:tplc="04160005" w:tentative="1">
+      <w:start w:val="1"/>
+      <w:numFmt w:val="bullet"/>
+      <w:lvlText w:val=""/>
+      <w:lvlJc w:val="left"/>
+      <w:pPr>
+        <w:ind w:left="6480" w:hanging="360"/>
+      </w:pPr>
+      <w:rPr>
+        <w:rFonts w:ascii="Wingdings" w:hAnsi="Wingdings" w:hint="default"/>
+      </w:rPr>
+    </w:lvl>
+  </w:abstractNum>
+  <w:abstractNum w:abstractNumId="1" w15:restartNumberingAfterBreak="0">
+    <w:nsid w:val="169E7275"/>
+    <w:multiLevelType w:val="multilevel"/>
+    <w:tmpl w:val="784EAAC8"/>
+    <w:lvl w:ilvl="0">
+      <w:start w:val="1"/>
+      <w:numFmt w:val="bullet"/>
+      <w:lvlText w:val=""/>
+      <w:lvlJc w:val="left"/>
+      <w:pPr>
+        <w:tabs>
+          <w:tab w:val="num" w:pos="720"/>
+        </w:tabs>
+        <w:ind w:left="720" w:hanging="360"/>
+      </w:pPr>
+      <w:rPr>
+        <w:rFonts w:ascii="Symbol" w:hAnsi="Symbol" w:hint="default"/>
+        <w:sz w:val="20"/>
+      </w:rPr>
+    </w:lvl>
+    <w:lvl w:ilvl="1" w:tentative="1">
+      <w:start w:val="1"/>
+      <w:numFmt w:val="bullet"/>
+      <w:lvlText w:val="o"/>
+      <w:lvlJc w:val="left"/>
+      <w:pPr>
+        <w:tabs>
+          <w:tab w:val="num" w:pos="1440"/>
+        </w:tabs>
+        <w:ind w:left="1440" w:hanging="360"/>
+      </w:pPr>
+      <w:rPr>
+        <w:rFonts w:ascii="Courier New" w:hAnsi="Courier New" w:hint="default"/>
+        <w:sz w:val="20"/>
+      </w:rPr>
+    </w:lvl>
+    <w:lvl w:ilvl="2" w:tentative="1">
+      <w:start w:val="1"/>
+      <w:numFmt w:val="bullet"/>
+      <w:lvlText w:val=""/>
+      <w:lvlJc w:val="left"/>
+      <w:pPr>
+        <w:tabs>
+          <w:tab w:val="num" w:pos="2160"/>
+        </w:tabs>
+        <w:ind w:left="2160" w:hanging="360"/>
+      </w:pPr>
+      <w:rPr>
+        <w:rFonts w:ascii="Wingdings" w:hAnsi="Wingdings" w:hint="default"/>
+        <w:sz w:val="20"/>
+      </w:rPr>
+    </w:lvl>
+    <w:lvl w:ilvl="3" w:tentative="1">
+      <w:start w:val="1"/>
+      <w:numFmt w:val="bullet"/>
+      <w:lvlText w:val=""/>
+      <w:lvlJc w:val="left"/>
+      <w:pPr>
+        <w:tabs>
+          <w:tab w:val="num" w:pos="2880"/>
+        </w:tabs>
+        <w:ind w:left="2880" w:hanging="360"/>
+      </w:pPr>
+      <w:rPr>
+        <w:rFonts w:ascii="Wingdings" w:hAnsi="Wingdings" w:hint="default"/>
+        <w:sz w:val="20"/>
+      </w:rPr>
+    </w:lvl>
+    <w:lvl w:ilvl="4" w:tentative="1">
+      <w:start w:val="1"/>
+      <w:numFmt w:val="bullet"/>
+      <w:lvlText w:val=""/>
+      <w:lvlJc w:val="left"/>
+      <w:pPr>
+        <w:tabs>
+          <w:tab w:val="num" w:pos="3600"/>
+        </w:tabs>
+        <w:ind w:left="3600" w:hanging="360"/>
+      </w:pPr>
+      <w:rPr>
+        <w:rFonts w:ascii="Wingdings" w:hAnsi="Wingdings" w:hint="default"/>
+        <w:sz w:val="20"/>
+      </w:rPr>
+    </w:lvl>
+    <w:lvl w:ilvl="5" w:tentative="1">
+      <w:start w:val="1"/>
+      <w:numFmt w:val="bullet"/>
+      <w:lvlText w:val=""/>
+      <w:lvlJc w:val="left"/>
+      <w:pPr>
+        <w:tabs>
+          <w:tab w:val="num" w:pos="4320"/>
+        </w:tabs>
+        <w:ind w:left="4320" w:hanging="360"/>
+      </w:pPr>
+      <w:rPr>
+        <w:rFonts w:ascii="Wingdings" w:hAnsi="Wingdings" w:hint="default"/>
+        <w:sz w:val="20"/>
+      </w:rPr>
+    </w:lvl>
+    <w:lvl w:ilvl="6" w:tentative="1">
+      <w:start w:val="1"/>
+      <w:numFmt w:val="bullet"/>
+      <w:lvlText w:val=""/>
+      <w:lvlJc w:val="left"/>
+      <w:pPr>
+        <w:tabs>
+          <w:tab w:val="num" w:pos="5040"/>
+        </w:tabs>
+        <w:ind w:left="5040" w:hanging="360"/>
+      </w:pPr>
+      <w:rPr>
+        <w:rFonts w:ascii="Wingdings" w:hAnsi="Wingdings" w:hint="default"/>
+        <w:sz w:val="20"/>
+      </w:rPr>
+    </w:lvl>
+    <w:lvl w:ilvl="7" w:tentative="1">
+      <w:start w:val="1"/>
+      <w:numFmt w:val="bullet"/>
+      <w:lvlText w:val=""/>
+      <w:lvlJc w:val="left"/>
+      <w:pPr>
+        <w:tabs>
+          <w:tab w:val="num" w:pos="5760"/>
+        </w:tabs>
+        <w:ind w:left="5760" w:hanging="360"/>
+      </w:pPr>
+      <w:rPr>
+        <w:rFonts w:ascii="Wingdings" w:hAnsi="Wingdings" w:hint="default"/>
+        <w:sz w:val="20"/>
+      </w:rPr>
+    </w:lvl>
+    <w:lvl w:ilvl="8" w:tentative="1">
+      <w:start w:val="1"/>
+      <w:numFmt w:val="bullet"/>
+      <w:lvlText w:val=""/>
+      <w:lvlJc w:val="left"/>
+      <w:pPr>
+        <w:tabs>
+          <w:tab w:val="num" w:pos="6480"/>
+        </w:tabs>
+        <w:ind w:left="6480" w:hanging="360"/>
+      </w:pPr>
+      <w:rPr>
+        <w:rFonts w:ascii="Wingdings" w:hAnsi="Wingdings" w:hint="default"/>
+        <w:sz w:val="20"/>
+      </w:rPr>
+    </w:lvl>
+  </w:abstractNum>
+  <w:abstractNum w:abstractNumId="2" w15:restartNumberingAfterBreak="0">
+    <w:nsid w:val="30CD75B1"/>
+    <w:multiLevelType w:val="multilevel"/>
+    <w:tmpl w:val="A8984AF8"/>
+    <w:lvl w:ilvl="0">
+      <w:start w:val="1"/>
+      <w:numFmt w:val="bullet"/>
+      <w:lvlText w:val=""/>
+      <w:lvlJc w:val="left"/>
+      <w:pPr>
+        <w:tabs>
+          <w:tab w:val="num" w:pos="720"/>
+        </w:tabs>
+        <w:ind w:left="720" w:hanging="360"/>
+      </w:pPr>
+      <w:rPr>
+        <w:rFonts w:ascii="Symbol" w:hAnsi="Symbol" w:hint="default"/>
+        <w:sz w:val="20"/>
+      </w:rPr>
+    </w:lvl>
+    <w:lvl w:ilvl="1" w:tentative="1">
+      <w:start w:val="1"/>
+      <w:numFmt w:val="bullet"/>
+      <w:lvlText w:val="o"/>
+      <w:lvlJc w:val="left"/>
+      <w:pPr>
+        <w:tabs>
+          <w:tab w:val="num" w:pos="1440"/>
+        </w:tabs>
+        <w:ind w:left="1440" w:hanging="360"/>
+      </w:pPr>
+      <w:rPr>
+        <w:rFonts w:ascii="Courier New" w:hAnsi="Courier New" w:hint="default"/>
+        <w:sz w:val="20"/>
+      </w:rPr>
+    </w:lvl>
+    <w:lvl w:ilvl="2" w:tentative="1">
+      <w:start w:val="1"/>
+      <w:numFmt w:val="bullet"/>
+      <w:lvlText w:val=""/>
+      <w:lvlJc w:val="left"/>
+      <w:pPr>
+        <w:tabs>
+          <w:tab w:val="num" w:pos="2160"/>
+        </w:tabs>
+        <w:ind w:left="2160" w:hanging="360"/>
+      </w:pPr>
+      <w:rPr>
+        <w:rFonts w:ascii="Wingdings" w:hAnsi="Wingdings" w:hint="default"/>
+        <w:sz w:val="20"/>
+      </w:rPr>
+    </w:lvl>
+    <w:lvl w:ilvl="3" w:tentative="1">
+      <w:start w:val="1"/>
+      <w:numFmt w:val="bullet"/>
+      <w:lvlText w:val=""/>
+      <w:lvlJc w:val="left"/>
+      <w:pPr>
+        <w:tabs>
+          <w:tab w:val="num" w:pos="2880"/>
+        </w:tabs>
+        <w:ind w:left="2880" w:hanging="360"/>
+      </w:pPr>
+      <w:rPr>
+        <w:rFonts w:ascii="Wingdings" w:hAnsi="Wingdings" w:hint="default"/>
+        <w:sz w:val="20"/>
+      </w:rPr>
+    </w:lvl>
+    <w:lvl w:ilvl="4" w:tentative="1">
+      <w:start w:val="1"/>
+      <w:numFmt w:val="bullet"/>
+      <w:lvlText w:val=""/>
+      <w:lvlJc w:val="left"/>
+      <w:pPr>
+        <w:tabs>
+          <w:tab w:val="num" w:pos="3600"/>
+        </w:tabs>
+        <w:ind w:left="3600" w:hanging="360"/>
+      </w:pPr>
+      <w:rPr>
+        <w:rFonts w:ascii="Wingdings" w:hAnsi="Wingdings" w:hint="default"/>
+        <w:sz w:val="20"/>
+      </w:rPr>
+    </w:lvl>
+    <w:lvl w:ilvl="5" w:tentative="1">
+      <w:start w:val="1"/>
+      <w:numFmt w:val="bullet"/>
+      <w:lvlText w:val=""/>
+      <w:lvlJc w:val="left"/>
+      <w:pPr>
+        <w:tabs>
+          <w:tab w:val="num" w:pos="4320"/>
+        </w:tabs>
+        <w:ind w:left="4320" w:hanging="360"/>
+      </w:pPr>
+      <w:rPr>
+        <w:rFonts w:ascii="Wingdings" w:hAnsi="Wingdings" w:hint="default"/>
+        <w:sz w:val="20"/>
+      </w:rPr>
+    </w:lvl>
+    <w:lvl w:ilvl="6" w:tentative="1">
+      <w:start w:val="1"/>
+      <w:numFmt w:val="bullet"/>
+      <w:lvlText w:val=""/>
+      <w:lvlJc w:val="left"/>
+      <w:pPr>
+        <w:tabs>
+          <w:tab w:val="num" w:pos="5040"/>
+        </w:tabs>
+        <w:ind w:left="5040" w:hanging="360"/>
+      </w:pPr>
+      <w:rPr>
+        <w:rFonts w:ascii="Wingdings" w:hAnsi="Wingdings" w:hint="default"/>
+        <w:sz w:val="20"/>
+      </w:rPr>
+    </w:lvl>
+    <w:lvl w:ilvl="7" w:tentative="1">
+      <w:start w:val="1"/>
+      <w:numFmt w:val="bullet"/>
+      <w:lvlText w:val=""/>
+      <w:lvlJc w:val="left"/>
+      <w:pPr>
+        <w:tabs>
+          <w:tab w:val="num" w:pos="5760"/>
+        </w:tabs>
+        <w:ind w:left="5760" w:hanging="360"/>
+      </w:pPr>
+      <w:rPr>
+        <w:rFonts w:ascii="Wingdings" w:hAnsi="Wingdings" w:hint="default"/>
+        <w:sz w:val="20"/>
+      </w:rPr>
+    </w:lvl>
+    <w:lvl w:ilvl="8" w:tentative="1">
+      <w:start w:val="1"/>
+      <w:numFmt w:val="bullet"/>
+      <w:lvlText w:val=""/>
+      <w:lvlJc w:val="left"/>
+      <w:pPr>
+        <w:tabs>
+          <w:tab w:val="num" w:pos="6480"/>
+        </w:tabs>
+        <w:ind w:left="6480" w:hanging="360"/>
+      </w:pPr>
+      <w:rPr>
+        <w:rFonts w:ascii="Wingdings" w:hAnsi="Wingdings" w:hint="default"/>
+        <w:sz w:val="20"/>
+      </w:rPr>
+    </w:lvl>
+  </w:abstractNum>
+  <w:abstractNum w:abstractNumId="3" w15:restartNumberingAfterBreak="0">
+    <w:nsid w:val="610B261D"/>
+    <w:multiLevelType w:val="hybridMultilevel"/>
+    <w:tmpl w:val="99EEB22E"/>
+    <w:lvl w:ilvl="0" w:tplc="04160003">
+      <w:start w:val="1"/>
+      <w:numFmt w:val="bullet"/>
+      <w:lvlText w:val="o"/>
+      <w:lvlJc w:val="left"/>
+      <w:pPr>
+        <w:ind w:left="1080" w:hanging="360"/>
+      </w:pPr>
+      <w:rPr>
+        <w:rFonts w:ascii="Courier New" w:hAnsi="Courier New" w:cs="Courier New" w:hint="default"/>
+      </w:rPr>
+    </w:lvl>
+    <w:lvl w:ilvl="1" w:tplc="FFFFFFFF" w:tentative="1">
+      <w:start w:val="1"/>
+      <w:numFmt w:val="bullet"/>
+      <w:lvlText w:val="o"/>
+      <w:lvlJc w:val="left"/>
+      <w:pPr>
+        <w:ind w:left="1800" w:hanging="360"/>
+      </w:pPr>
+      <w:rPr>
+        <w:rFonts w:ascii="Courier New" w:hAnsi="Courier New" w:cs="Courier New" w:hint="default"/>
+      </w:rPr>
+    </w:lvl>
+    <w:lvl w:ilvl="2" w:tplc="FFFFFFFF" w:tentative="1">
+      <w:start w:val="1"/>
+      <w:numFmt w:val="bullet"/>
+      <w:lvlText w:val=""/>
+      <w:lvlJc w:val="left"/>
+      <w:pPr>
+        <w:ind w:left="2520" w:hanging="360"/>
+      </w:pPr>
+      <w:rPr>
+        <w:rFonts w:ascii="Wingdings" w:hAnsi="Wingdings" w:hint="default"/>
+      </w:rPr>
+    </w:lvl>
+    <w:lvl w:ilvl="3" w:tplc="FFFFFFFF" w:tentative="1">
+      <w:start w:val="1"/>
+      <w:numFmt w:val="bullet"/>
+      <w:lvlText w:val=""/>
+      <w:lvlJc w:val="left"/>
+      <w:pPr>
+        <w:ind w:left="3240" w:hanging="360"/>
+      </w:pPr>
+      <w:rPr>
+        <w:rFonts w:ascii="Symbol" w:hAnsi="Symbol" w:hint="default"/>
+      </w:rPr>
+    </w:lvl>
+    <w:lvl w:ilvl="4" w:tplc="FFFFFFFF" w:tentative="1">
+      <w:start w:val="1"/>
+      <w:numFmt w:val="bullet"/>
+      <w:lvlText w:val="o"/>
+      <w:lvlJc w:val="left"/>
+      <w:pPr>
+        <w:ind w:left="3960" w:hanging="360"/>
+      </w:pPr>
+      <w:rPr>
+        <w:rFonts w:ascii="Courier New" w:hAnsi="Courier New" w:cs="Courier New" w:hint="default"/>
+      </w:rPr>
+    </w:lvl>
+    <w:lvl w:ilvl="5" w:tplc="FFFFFFFF" w:tentative="1">
+      <w:start w:val="1"/>
+      <w:numFmt w:val="bullet"/>
+      <w:lvlText w:val=""/>
+      <w:lvlJc w:val="left"/>
+      <w:pPr>
+        <w:ind w:left="4680" w:hanging="360"/>
+      </w:pPr>
+      <w:rPr>
+        <w:rFonts w:ascii="Wingdings" w:hAnsi="Wingdings" w:hint="default"/>
+      </w:rPr>
+    </w:lvl>
+    <w:lvl w:ilvl="6" w:tplc="FFFFFFFF" w:tentative="1">
+      <w:start w:val="1"/>
+      <w:numFmt w:val="bullet"/>
+      <w:lvlText w:val=""/>
+      <w:lvlJc w:val="left"/>
+      <w:pPr>
+        <w:ind w:left="5400" w:hanging="360"/>
+      </w:pPr>
+      <w:rPr>
+        <w:rFonts w:ascii="Symbol" w:hAnsi="Symbol" w:hint="default"/>
+      </w:rPr>
+    </w:lvl>
+    <w:lvl w:ilvl="7" w:tplc="FFFFFFFF" w:tentative="1">
+      <w:start w:val="1"/>
+      <w:numFmt w:val="bullet"/>
+      <w:lvlText w:val="o"/>
+      <w:lvlJc w:val="left"/>
+      <w:pPr>
+        <w:ind w:left="6120" w:hanging="360"/>
+      </w:pPr>
+      <w:rPr>
+        <w:rFonts w:ascii="Courier New" w:hAnsi="Courier New" w:cs="Courier New" w:hint="default"/>
+      </w:rPr>
+    </w:lvl>
+    <w:lvl w:ilvl="8" w:tplc="FFFFFFFF" w:tentative="1">
+      <w:start w:val="1"/>
+      <w:numFmt w:val="bullet"/>
+      <w:lvlText w:val=""/>
+      <w:lvlJc w:val="left"/>
+      <w:pPr>
+        <w:ind w:left="6840" w:hanging="360"/>
+      </w:pPr>
+      <w:rPr>
+        <w:rFonts w:ascii="Wingdings" w:hAnsi="Wingdings" w:hint="default"/>
+      </w:rPr>
+    </w:lvl>
+  </w:abstractNum>
+  <w:num w:numId="1" w16cid:durableId="938492037">
+    <w:abstractNumId w:val="2"/>
+  </w:num>
+  <w:num w:numId="2" w16cid:durableId="816459334">
+    <w:abstractNumId w:val="1"/>
+  </w:num>
+  <w:num w:numId="3" w16cid:durableId="1875654372">
+    <w:abstractNumId w:val="0"/>
+  </w:num>
+  <w:num w:numId="4" w16cid:durableId="1544095542">
+    <w:abstractNumId w:val="3"/>
+  </w:num>
+</w:numbering>
 </file>
 
 <file path=word/styles.xml><?xml version="1.0" encoding="utf-8"?>
@@ -3336,7 +5919,7 @@
   <w:style w:type="paragraph" w:default="1" w:styleId="Normal">
     <w:name w:val="Normal"/>
     <w:qFormat/>
-    <w:rsid w:val="00E14693"/>
+    <w:rsid w:val="00A729D0"/>
   </w:style>
   <w:style w:type="paragraph" w:styleId="Ttulo1">
     <w:name w:val="heading 1"/>
@@ -3589,6 +6172,17 @@
       <w:color w:val="605E5C"/>
       <w:shd w:val="clear" w:color="auto" w:fill="E1DFDD"/>
     </w:rPr>
+  </w:style>
+  <w:style w:type="paragraph" w:styleId="PargrafodaLista">
+    <w:name w:val="List Paragraph"/>
+    <w:basedOn w:val="Normal"/>
+    <w:uiPriority w:val="34"/>
+    <w:qFormat/>
+    <w:rsid w:val="005B142D"/>
+    <w:pPr>
+      <w:ind w:left="720"/>
+      <w:contextualSpacing/>
+    </w:pPr>
   </w:style>
 </w:styles>
 </file>

</xml_diff>

<commit_message>
Branch: main; Revised introduction to the research protocol
</commit_message>
<xml_diff>
--- a/research_protocol/protocol.docx
+++ b/research_protocol/protocol.docx
@@ -131,108 +131,100 @@
     </w:p>
     <w:p>
       <w:pPr>
+        <w:jc w:val="right"/>
+      </w:pPr>
+    </w:p>
+    <w:p>
+      <w:pPr>
+        <w:rPr>
+          <w:b/>
+          <w:bCs/>
+        </w:rPr>
+      </w:pPr>
+    </w:p>
+    <w:p>
+      <w:pPr>
+        <w:rPr>
+          <w:b/>
+          <w:bCs/>
+        </w:rPr>
+      </w:pPr>
+    </w:p>
+    <w:p>
+      <w:pPr>
+        <w:rPr>
+          <w:b/>
+          <w:bCs/>
+        </w:rPr>
+      </w:pPr>
+    </w:p>
+    <w:p>
+      <w:pPr>
+        <w:rPr>
+          <w:b/>
+          <w:bCs/>
+        </w:rPr>
+      </w:pPr>
+    </w:p>
+    <w:p>
+      <w:pPr>
+        <w:rPr>
+          <w:b/>
+          <w:bCs/>
+        </w:rPr>
+      </w:pPr>
+    </w:p>
+    <w:p>
+      <w:pPr>
+        <w:rPr>
+          <w:b/>
+          <w:bCs/>
+        </w:rPr>
+      </w:pPr>
+    </w:p>
+    <w:p>
+      <w:pPr>
+        <w:rPr>
+          <w:b/>
+          <w:bCs/>
+        </w:rPr>
+      </w:pPr>
+    </w:p>
+    <w:p>
+      <w:pPr>
+        <w:rPr>
+          <w:b/>
+          <w:bCs/>
+        </w:rPr>
+      </w:pPr>
+    </w:p>
+    <w:p>
+      <w:pPr>
+        <w:rPr>
+          <w:b/>
+          <w:bCs/>
+        </w:rPr>
+      </w:pPr>
+    </w:p>
+    <w:p>
+      <w:pPr>
+        <w:rPr>
+          <w:b/>
+          <w:bCs/>
+        </w:rPr>
+      </w:pPr>
+    </w:p>
+    <w:p>
+      <w:pPr>
+        <w:rPr>
+          <w:b/>
+          <w:bCs/>
+        </w:rPr>
+      </w:pPr>
+    </w:p>
+    <w:p>
+      <w:pPr>
         <w:jc w:val="center"/>
-      </w:pPr>
-      <w:r>
-        <w:t>PAULO AUGUSTO DE OLIVEIRA GONÇALVES</w:t>
-      </w:r>
-    </w:p>
-    <w:p>
-      <w:pPr>
-        <w:jc w:val="right"/>
-      </w:pPr>
-    </w:p>
-    <w:p>
-      <w:pPr>
-        <w:rPr>
-          <w:b/>
-          <w:bCs/>
-        </w:rPr>
-      </w:pPr>
-    </w:p>
-    <w:p>
-      <w:pPr>
-        <w:rPr>
-          <w:b/>
-          <w:bCs/>
-        </w:rPr>
-      </w:pPr>
-    </w:p>
-    <w:p>
-      <w:pPr>
-        <w:rPr>
-          <w:b/>
-          <w:bCs/>
-        </w:rPr>
-      </w:pPr>
-    </w:p>
-    <w:p>
-      <w:pPr>
-        <w:rPr>
-          <w:b/>
-          <w:bCs/>
-        </w:rPr>
-      </w:pPr>
-    </w:p>
-    <w:p>
-      <w:pPr>
-        <w:rPr>
-          <w:b/>
-          <w:bCs/>
-        </w:rPr>
-      </w:pPr>
-    </w:p>
-    <w:p>
-      <w:pPr>
-        <w:rPr>
-          <w:b/>
-          <w:bCs/>
-        </w:rPr>
-      </w:pPr>
-    </w:p>
-    <w:p>
-      <w:pPr>
-        <w:rPr>
-          <w:b/>
-          <w:bCs/>
-        </w:rPr>
-      </w:pPr>
-    </w:p>
-    <w:p>
-      <w:pPr>
-        <w:rPr>
-          <w:b/>
-          <w:bCs/>
-        </w:rPr>
-      </w:pPr>
-    </w:p>
-    <w:p>
-      <w:pPr>
-        <w:rPr>
-          <w:b/>
-          <w:bCs/>
-        </w:rPr>
-      </w:pPr>
-    </w:p>
-    <w:p>
-      <w:pPr>
-        <w:rPr>
-          <w:b/>
-          <w:bCs/>
-        </w:rPr>
-      </w:pPr>
-    </w:p>
-    <w:p>
-      <w:pPr>
-        <w:rPr>
-          <w:b/>
-          <w:bCs/>
-        </w:rPr>
-      </w:pPr>
-    </w:p>
-    <w:p>
-      <w:pPr>
-        <w:jc w:val="center"/>
         <w:rPr>
           <w:b/>
           <w:bCs/>
@@ -462,6 +454,14 @@
         </w:rPr>
         <w:t>SISTEMÁTICO</w:t>
       </w:r>
+    </w:p>
+    <w:p>
+      <w:pPr>
+        <w:rPr>
+          <w:b/>
+          <w:bCs/>
+        </w:rPr>
+      </w:pPr>
     </w:p>
     <w:p>
       <w:pPr>
@@ -924,33 +924,38 @@
         <w:tab/>
       </w:r>
       <w:r>
-        <w:t>Este estudo consiste em um Mapeamento Sistemático de Literatura (MSL), caracterizado como uma pesquisa metodológica secundária. A condução deste trabalho segue estritamente as diretrizes e o framework propostos por Petersen et al. (2015), projetados para estruturar, categorizar e quantificar visualmente o estado da arte de um determinado campo de conhecimento. O processo é executado em cinco etapas sequenciais: (i) definição das questões de pesquisa; (</w:t>
-      </w:r>
-      <w:proofErr w:type="spellStart"/>
-      <w:r>
-        <w:t>ii</w:t>
-      </w:r>
-      <w:proofErr w:type="spellEnd"/>
-      <w:r>
-        <w:t>) condução da busca por estudos primários em bases de dados eletrônicas; (</w:t>
-      </w:r>
-      <w:proofErr w:type="spellStart"/>
-      <w:r>
-        <w:t>iii</w:t>
-      </w:r>
-      <w:proofErr w:type="spellEnd"/>
-      <w:r>
-        <w:t>) triagem dos estudos por meio da aplicação de critérios explícitos de inclusão e exclusão; (</w:t>
-      </w:r>
-      <w:proofErr w:type="spellStart"/>
-      <w:r>
-        <w:t>iv</w:t>
-      </w:r>
-      <w:proofErr w:type="spellEnd"/>
+        <w:t>Este estudo consiste em um Mapeamento Sistemático de Literatura (MSL).</w:t>
+      </w:r>
+      <w:r>
+        <w:t xml:space="preserve"> </w:t>
+      </w:r>
+      <w:r>
+        <w:t xml:space="preserve">A condução deste trabalho segue estritamente as diretrizes e o framework propostos por Petersen et al. (2015), projetados para estruturar, categorizar e quantificar visualmente o estado da arte de um determinado campo de conhecimento. O processo é executado em cinco etapas sequenciais: </w:t>
+      </w:r>
+      <w:r>
+        <w:t>1</w:t>
+      </w:r>
+      <w:r>
+        <w:t xml:space="preserve">) definição das questões de pesquisa; </w:t>
+      </w:r>
+      <w:r>
+        <w:t>2</w:t>
+      </w:r>
+      <w:r>
+        <w:t xml:space="preserve">) condução da busca por estudos primários em bases de dados eletrônicas; </w:t>
+      </w:r>
+      <w:r>
+        <w:t>3</w:t>
+      </w:r>
+      <w:r>
+        <w:t xml:space="preserve">) triagem dos estudos por meio da aplicação de critérios explícitos de inclusão e exclusão; </w:t>
+      </w:r>
+      <w:r>
+        <w:t>4</w:t>
+      </w:r>
       <w:r>
         <w:t>) desenvolvimento de um esquema de classificação baseado em palavras-chave (</w:t>
       </w:r>
-      <w:proofErr w:type="spellStart"/>
       <w:r>
         <w:rPr>
           <w:i/>
@@ -958,17 +963,14 @@
         </w:rPr>
         <w:t>keywording</w:t>
       </w:r>
-      <w:proofErr w:type="spellEnd"/>
-      <w:r>
-        <w:t xml:space="preserve">); e (v) extração de dados e mapeamento sistemático dos resultados. Adicionalmente, adota-se o guia de </w:t>
-      </w:r>
-      <w:proofErr w:type="spellStart"/>
-      <w:r>
-        <w:t>Kitchenham</w:t>
-      </w:r>
-      <w:proofErr w:type="spellEnd"/>
-      <w:r>
-        <w:t xml:space="preserve"> e Charters (2007) para assegurar o rigor técnico e a reprodutibilidade dos procedimentos de busca e seleção bibliográfica.</w:t>
+      <w:r>
+        <w:t xml:space="preserve">); e </w:t>
+      </w:r>
+      <w:r>
+        <w:t>5</w:t>
+      </w:r>
+      <w:r>
+        <w:t xml:space="preserve">) extração de dados e mapeamento sistemático dos resultados. </w:t>
       </w:r>
     </w:p>
     <w:p>
@@ -979,113 +981,65 @@
         <w:tab/>
       </w:r>
       <w:r>
-        <w:t xml:space="preserve">Para a estruturação rigorosa das questões de pesquisa e identificação precisa das palavras-chave que compõem a </w:t>
-      </w:r>
-      <w:proofErr w:type="spellStart"/>
-      <w:r>
-        <w:t>string</w:t>
-      </w:r>
-      <w:proofErr w:type="spellEnd"/>
-      <w:r>
-        <w:t xml:space="preserve"> de busca, adota-se o framework PICOC (acrônimo para </w:t>
-      </w:r>
-      <w:proofErr w:type="spellStart"/>
-      <w:r>
-        <w:t>Population</w:t>
-      </w:r>
-      <w:proofErr w:type="spellEnd"/>
+        <w:t>Para a estruturação rigorosa das questões de pesquis</w:t>
+      </w:r>
+      <w:r>
+        <w:t>a</w:t>
+      </w:r>
+      <w:r>
+        <w:t xml:space="preserve"> e a</w:t>
+      </w:r>
+      <w:r>
+        <w:t xml:space="preserve"> </w:t>
+      </w:r>
+      <w:r>
+        <w:t>identificação precisa das palavras-chave que compõem a string de busca</w:t>
+      </w:r>
+      <w:r>
+        <w:t xml:space="preserve"> </w:t>
+      </w:r>
+      <w:r>
+        <w:t xml:space="preserve">adota-se o framework PICOC (acrônimo para Population, Intervention, Comparison, Outcome, and Context). </w:t>
+      </w:r>
+      <w:r>
+        <w:t>Integrado</w:t>
+      </w:r>
+      <w:r>
+        <w:t xml:space="preserve"> formalmente à Engenharia de Software por Kitchenham e Charters (2007), essa estrutura estende os modelos tradicionais de revisão ao decompor o escopo da investigação em cinco dimensões fundamentais: </w:t>
+      </w:r>
+      <w:r>
+        <w:t>1</w:t>
+      </w:r>
+      <w:r>
+        <w:t xml:space="preserve">) População (P), que delimita o grupo de interesse, papel ou área afetada; </w:t>
+      </w:r>
+      <w:r>
+        <w:t>2</w:t>
+      </w:r>
+      <w:r>
+        <w:t xml:space="preserve">) Intervenção (I), correspondente à tecnologia, ferramenta ou metodologia específica sob análise; </w:t>
+      </w:r>
+      <w:r>
+        <w:t>3</w:t>
+      </w:r>
+      <w:r>
+        <w:t xml:space="preserve">) Comparação (C), que identifica a alternativa ou estado atual com o qual a intervenção é contrastada; </w:t>
+      </w:r>
+      <w:r>
+        <w:t>4</w:t>
+      </w:r>
+      <w:r>
+        <w:t xml:space="preserve">) Resultado (Outcome - O), que define os efeitos, benefícios ou métricas de interesse a serem medidos; e </w:t>
+      </w:r>
+      <w:r>
+        <w:t>5</w:t>
+      </w:r>
+      <w:r>
+        <w:t>) Contexto (C)</w:t>
+      </w:r>
       <w:r>
         <w:t xml:space="preserve">, </w:t>
       </w:r>
-      <w:proofErr w:type="spellStart"/>
-      <w:r>
-        <w:t>Intervention</w:t>
-      </w:r>
-      <w:proofErr w:type="spellEnd"/>
-      <w:r>
-        <w:t xml:space="preserve">, </w:t>
-      </w:r>
-      <w:proofErr w:type="spellStart"/>
-      <w:r>
-        <w:t>Comparison</w:t>
-      </w:r>
-      <w:proofErr w:type="spellEnd"/>
-      <w:r>
-        <w:t xml:space="preserve">, </w:t>
-      </w:r>
-      <w:proofErr w:type="spellStart"/>
-      <w:r>
-        <w:t>Outcome</w:t>
-      </w:r>
-      <w:proofErr w:type="spellEnd"/>
-      <w:r>
-        <w:t xml:space="preserve">, </w:t>
-      </w:r>
-      <w:proofErr w:type="spellStart"/>
-      <w:r>
-        <w:t>and</w:t>
-      </w:r>
-      <w:proofErr w:type="spellEnd"/>
-      <w:r>
-        <w:t xml:space="preserve"> </w:t>
-      </w:r>
-      <w:proofErr w:type="spellStart"/>
-      <w:r>
-        <w:t>Context</w:t>
-      </w:r>
-      <w:proofErr w:type="spellEnd"/>
-      <w:r>
-        <w:t xml:space="preserve">). </w:t>
-      </w:r>
-      <w:r>
-        <w:t>Integrado</w:t>
-      </w:r>
-      <w:r>
-        <w:t xml:space="preserve"> formalmente à Engenharia de Software por </w:t>
-      </w:r>
-      <w:proofErr w:type="spellStart"/>
-      <w:r>
-        <w:t>Kitchenham</w:t>
-      </w:r>
-      <w:proofErr w:type="spellEnd"/>
-      <w:r>
-        <w:t xml:space="preserve"> e Charters (2007), essa estrutura estende os modelos tradicionais de revisão ao decompor o escopo da investigação em cinco dimensões fundamentais: (i) População (P), que delimita o grupo de interesse, papel ou área afetada; (</w:t>
-      </w:r>
-      <w:proofErr w:type="spellStart"/>
-      <w:r>
-        <w:t>ii</w:t>
-      </w:r>
-      <w:proofErr w:type="spellEnd"/>
-      <w:r>
-        <w:t>) Intervenção (I), correspondente à tecnologia, ferramenta ou metodologia específica sob análise; (</w:t>
-      </w:r>
-      <w:proofErr w:type="spellStart"/>
-      <w:r>
-        <w:t>iii</w:t>
-      </w:r>
-      <w:proofErr w:type="spellEnd"/>
-      <w:r>
-        <w:t>) Comparação (C), que identifica a alternativa ou estado atual com o qual a intervenção é contrastada; (</w:t>
-      </w:r>
-      <w:proofErr w:type="spellStart"/>
-      <w:r>
-        <w:t>iv</w:t>
-      </w:r>
-      <w:proofErr w:type="spellEnd"/>
-      <w:r>
-        <w:t>) Resultado (</w:t>
-      </w:r>
-      <w:proofErr w:type="spellStart"/>
-      <w:r>
-        <w:t>Outcome</w:t>
-      </w:r>
-      <w:proofErr w:type="spellEnd"/>
-      <w:r>
-        <w:t xml:space="preserve"> - O), que define os efeitos, benefícios ou métricas de interesse a serem medidos; e (v) Contexto (C)</w:t>
-      </w:r>
-      <w:r>
-        <w:t xml:space="preserve">, </w:t>
-      </w:r>
       <w:r>
         <w:t>que especifica o ambiente ou cenário no qual a investigação se insere, delimitando o escopo da pesquisa em termos de domínio, tipo de estudo ou período considerado.</w:t>
       </w:r>
@@ -1098,101 +1052,35 @@
         <w:tab/>
       </w:r>
       <w:r>
-        <w:t>Para garantir a transparência, o rigor e a reprodutibilidade visual no processo de seleção dos estudos primários, adota-se o fluxograma PRISMA (</w:t>
-      </w:r>
-      <w:proofErr w:type="spellStart"/>
-      <w:r>
-        <w:t>Preferred</w:t>
-      </w:r>
-      <w:proofErr w:type="spellEnd"/>
-      <w:r>
-        <w:t xml:space="preserve"> </w:t>
-      </w:r>
-      <w:proofErr w:type="spellStart"/>
-      <w:r>
-        <w:t>Reporting</w:t>
-      </w:r>
-      <w:proofErr w:type="spellEnd"/>
-      <w:r>
-        <w:t xml:space="preserve"> </w:t>
-      </w:r>
-      <w:proofErr w:type="spellStart"/>
-      <w:r>
-        <w:t>Items</w:t>
-      </w:r>
-      <w:proofErr w:type="spellEnd"/>
-      <w:r>
-        <w:t xml:space="preserve"> for </w:t>
-      </w:r>
-      <w:proofErr w:type="spellStart"/>
-      <w:r>
-        <w:t>Systematic</w:t>
-      </w:r>
-      <w:proofErr w:type="spellEnd"/>
-      <w:r>
-        <w:t xml:space="preserve"> Reviews </w:t>
-      </w:r>
-      <w:proofErr w:type="spellStart"/>
-      <w:r>
-        <w:t>and</w:t>
-      </w:r>
-      <w:proofErr w:type="spellEnd"/>
-      <w:r>
-        <w:t xml:space="preserve"> Meta-</w:t>
-      </w:r>
-      <w:proofErr w:type="spellStart"/>
-      <w:r>
-        <w:t>Analyses</w:t>
-      </w:r>
-      <w:proofErr w:type="spellEnd"/>
-      <w:r>
-        <w:t xml:space="preserve">). Embora originado como uma diretriz de relato em outras ciências, o modelo de fluxo de quatro fases do PRISMA é integrado a este estudo de forma complementar e adaptada às práticas de revisão de </w:t>
-      </w:r>
-      <w:proofErr w:type="spellStart"/>
-      <w:r>
-        <w:t>Kitchenham</w:t>
-      </w:r>
-      <w:proofErr w:type="spellEnd"/>
-      <w:r>
-        <w:t xml:space="preserve"> e Charters (2007) e de mapeamento de Petersen et al. (2015). O diagrama documenta de forma rastreável o funil de dados da pesquisa por meio de quatro </w:t>
-      </w:r>
-      <w:proofErr w:type="spellStart"/>
-      <w:r>
-        <w:t>macroetapas</w:t>
-      </w:r>
-      <w:proofErr w:type="spellEnd"/>
-      <w:r>
-        <w:t>: (i) Identificação, que contabiliza os registros brutos localizados nas bases de dados eletrônicas após a remoção de duplicatas; (</w:t>
-      </w:r>
-      <w:proofErr w:type="spellStart"/>
-      <w:r>
-        <w:t>ii</w:t>
-      </w:r>
-      <w:proofErr w:type="spellEnd"/>
-      <w:r>
-        <w:t>) Triagem (</w:t>
-      </w:r>
-      <w:proofErr w:type="spellStart"/>
-      <w:r>
-        <w:t>Screening</w:t>
-      </w:r>
-      <w:proofErr w:type="spellEnd"/>
-      <w:r>
-        <w:t>), que mapeia a exclusão inicial com base na leitura de títulos e resumos; (</w:t>
-      </w:r>
-      <w:proofErr w:type="spellStart"/>
-      <w:r>
-        <w:t>iii</w:t>
-      </w:r>
-      <w:proofErr w:type="spellEnd"/>
-      <w:r>
-        <w:t>) Elegibilidade, que quantifica os artigos avaliados na íntegra a partir dos critérios de inclusão e exclusão; e (</w:t>
-      </w:r>
-      <w:proofErr w:type="spellStart"/>
-      <w:r>
-        <w:t>iv</w:t>
-      </w:r>
-      <w:proofErr w:type="spellEnd"/>
+        <w:t>Para garantir a transparência, o rigor e a reprodutibilidade visual no processo de seleção dos estudos primários, adota-se o fluxograma PRISMA (Preferred Reporting Items for Systematic Reviews and Meta-Analyses). Embora originado como uma diretriz de relato em outras ciências, o modelo de fluxo de quatro fases do PRISMA é integrado a este estudo de forma complementar e adaptada às práticas de revisão de Kitchenham e Charters (2007) e de mapeamento de Petersen et al. (2015). O diagrama documenta de forma rastreável o funil de dados da pesquisa por meio de quatro etapas</w:t>
+      </w:r>
+      <w:r>
+        <w:t xml:space="preserve"> principais</w:t>
+      </w:r>
+      <w:r>
+        <w:t xml:space="preserve">: </w:t>
+      </w:r>
+      <w:r>
+        <w:t>1</w:t>
+      </w:r>
+      <w:r>
+        <w:t xml:space="preserve">) Identificação, que contabiliza os registros brutos localizados nas bases de dados eletrônicas após a remoção de duplicatas; </w:t>
+      </w:r>
+      <w:r>
+        <w:t>2</w:t>
+      </w:r>
+      <w:r>
+        <w:t xml:space="preserve">) Triagem (Screening), que mapeia a exclusão inicial com base na leitura de títulos e resumos; </w:t>
+      </w:r>
+      <w:r>
+        <w:t>3</w:t>
+      </w:r>
+      <w:r>
+        <w:t xml:space="preserve">) Elegibilidade, que quantifica os artigos avaliados na íntegra a partir dos critérios de inclusão e exclusão; e </w:t>
+      </w:r>
+      <w:r>
+        <w:t>4</w:t>
+      </w:r>
       <w:r>
         <w:t>) Inclusão, que consolida o número final de estudos primários selecionados para o mapeamento. O uso do diagrama mitiga vieses de publicação e facilita a auditoria externa do processo de refinamento amostral.</w:t>
       </w:r>
@@ -1205,428 +1093,30 @@
         <w:tab/>
       </w:r>
       <w:r>
-        <w:t xml:space="preserve">Para a definição estruturada e alinhamento do escopo deste estudo, adota-se a abordagem </w:t>
-      </w:r>
-      <w:proofErr w:type="spellStart"/>
-      <w:r>
-        <w:t>Goal-Question-Metric</w:t>
-      </w:r>
-      <w:proofErr w:type="spellEnd"/>
-      <w:r>
-        <w:t xml:space="preserve"> (GQM), desenvolvida originalmente por Basili e Weiss (1984) e consolidada por Basili (1992). O GQM é um paradigma de medição orientado a objetivos que estabelece uma estrutura hierárquica dividida em três níveis: (i) Conceitual (</w:t>
-      </w:r>
-      <w:proofErr w:type="spellStart"/>
-      <w:r>
-        <w:t>Goal</w:t>
-      </w:r>
-      <w:proofErr w:type="spellEnd"/>
-      <w:r>
-        <w:t>), onde se define o objetivo principal da investigação sob uma perspectiva e contexto específicos; (</w:t>
-      </w:r>
-      <w:proofErr w:type="spellStart"/>
-      <w:r>
-        <w:t>ii</w:t>
-      </w:r>
-      <w:proofErr w:type="spellEnd"/>
-      <w:r>
-        <w:t>) Operacional (</w:t>
-      </w:r>
-      <w:proofErr w:type="spellStart"/>
-      <w:r>
-        <w:t>Question</w:t>
-      </w:r>
-      <w:proofErr w:type="spellEnd"/>
-      <w:r>
-        <w:t>), no qual o objetivo é refinado em um conjunto de questões que caracterizam o objeto de estudo de forma quantificável; e (</w:t>
-      </w:r>
-      <w:proofErr w:type="spellStart"/>
-      <w:r>
-        <w:t>iii</w:t>
-      </w:r>
-      <w:proofErr w:type="spellEnd"/>
-      <w:r>
-        <w:t>) Quantitativo (</w:t>
-      </w:r>
-      <w:proofErr w:type="spellStart"/>
-      <w:r>
-        <w:t>Metric</w:t>
-      </w:r>
-      <w:proofErr w:type="spellEnd"/>
-      <w:r>
-        <w:t xml:space="preserve">), onde são associadas as métricas de dados necessárias para responder satisfatoriamente a cada questão formulada. No âmbito deste protocolo, a aplicação do </w:t>
-      </w:r>
-      <w:r>
-        <w:lastRenderedPageBreak/>
-        <w:t xml:space="preserve">framework GQM garante que a coleta e a análise das evidências da literatura estejam rigorosamente vinculadas às metas centrais da pesquisa, evitando a inclusão de métricas </w:t>
-      </w:r>
-      <w:proofErr w:type="spellStart"/>
-      <w:r>
-        <w:t>ad-hoc</w:t>
-      </w:r>
-      <w:proofErr w:type="spellEnd"/>
-      <w:r>
-        <w:t xml:space="preserve"> ou desconexas do propósito científico.</w:t>
-      </w:r>
-    </w:p>
-    <w:p/>
-    <w:p>
-      <w:pPr>
-        <w:rPr>
-          <w:b/>
-          <w:bCs/>
-        </w:rPr>
-      </w:pPr>
-    </w:p>
-    <w:p>
-      <w:pPr>
-        <w:rPr>
-          <w:b/>
-          <w:bCs/>
-        </w:rPr>
-      </w:pPr>
-    </w:p>
-    <w:p>
-      <w:pPr>
-        <w:rPr>
-          <w:b/>
-          <w:bCs/>
-        </w:rPr>
-      </w:pPr>
-    </w:p>
-    <w:p>
-      <w:pPr>
-        <w:rPr>
-          <w:b/>
-          <w:bCs/>
-        </w:rPr>
-      </w:pPr>
-    </w:p>
-    <w:p>
-      <w:pPr>
-        <w:rPr>
-          <w:b/>
-          <w:bCs/>
-        </w:rPr>
-      </w:pPr>
-    </w:p>
-    <w:p>
-      <w:pPr>
-        <w:rPr>
-          <w:b/>
-          <w:bCs/>
-        </w:rPr>
-      </w:pPr>
-    </w:p>
-    <w:p>
-      <w:pPr>
-        <w:rPr>
-          <w:b/>
-          <w:bCs/>
-        </w:rPr>
-      </w:pPr>
-    </w:p>
-    <w:p>
-      <w:pPr>
-        <w:rPr>
-          <w:b/>
-          <w:bCs/>
-        </w:rPr>
-      </w:pPr>
-    </w:p>
-    <w:p>
-      <w:pPr>
-        <w:rPr>
-          <w:b/>
-          <w:bCs/>
-        </w:rPr>
-      </w:pPr>
-    </w:p>
-    <w:p>
-      <w:pPr>
-        <w:rPr>
-          <w:b/>
-          <w:bCs/>
-        </w:rPr>
-      </w:pPr>
-    </w:p>
-    <w:p>
-      <w:pPr>
-        <w:rPr>
-          <w:b/>
-          <w:bCs/>
-        </w:rPr>
-      </w:pPr>
-    </w:p>
-    <w:p>
-      <w:pPr>
-        <w:rPr>
-          <w:b/>
-          <w:bCs/>
-        </w:rPr>
-      </w:pPr>
-    </w:p>
-    <w:p>
-      <w:pPr>
-        <w:rPr>
-          <w:b/>
-          <w:bCs/>
-        </w:rPr>
-      </w:pPr>
-    </w:p>
-    <w:p>
-      <w:pPr>
-        <w:rPr>
-          <w:b/>
-          <w:bCs/>
-        </w:rPr>
-      </w:pPr>
-    </w:p>
-    <w:p>
-      <w:pPr>
-        <w:rPr>
-          <w:b/>
-          <w:bCs/>
-        </w:rPr>
-      </w:pPr>
-    </w:p>
-    <w:p>
-      <w:pPr>
-        <w:rPr>
-          <w:b/>
-          <w:bCs/>
-        </w:rPr>
-      </w:pPr>
-    </w:p>
-    <w:p>
-      <w:pPr>
-        <w:rPr>
-          <w:b/>
-          <w:bCs/>
-        </w:rPr>
-      </w:pPr>
-    </w:p>
-    <w:p>
-      <w:pPr>
-        <w:rPr>
-          <w:b/>
-          <w:bCs/>
-        </w:rPr>
-      </w:pPr>
-    </w:p>
-    <w:p>
-      <w:pPr>
-        <w:rPr>
-          <w:b/>
-          <w:bCs/>
-        </w:rPr>
-      </w:pPr>
-    </w:p>
-    <w:p>
-      <w:pPr>
-        <w:rPr>
-          <w:b/>
-          <w:bCs/>
-        </w:rPr>
-      </w:pPr>
-    </w:p>
-    <w:p>
-      <w:pPr>
-        <w:rPr>
-          <w:b/>
-          <w:bCs/>
-        </w:rPr>
-      </w:pPr>
-    </w:p>
-    <w:p>
-      <w:pPr>
-        <w:rPr>
-          <w:b/>
-          <w:bCs/>
-        </w:rPr>
-      </w:pPr>
-    </w:p>
-    <w:p>
-      <w:pPr>
-        <w:rPr>
-          <w:b/>
-          <w:bCs/>
-        </w:rPr>
-      </w:pPr>
-    </w:p>
-    <w:p>
-      <w:pPr>
-        <w:rPr>
-          <w:b/>
-          <w:bCs/>
-        </w:rPr>
-      </w:pPr>
-    </w:p>
-    <w:p>
-      <w:pPr>
-        <w:rPr>
-          <w:b/>
-          <w:bCs/>
-        </w:rPr>
-      </w:pPr>
-    </w:p>
-    <w:p>
-      <w:pPr>
-        <w:rPr>
-          <w:b/>
-          <w:bCs/>
-        </w:rPr>
-      </w:pPr>
-    </w:p>
-    <w:p>
-      <w:pPr>
-        <w:rPr>
-          <w:b/>
-          <w:bCs/>
-        </w:rPr>
-      </w:pPr>
-    </w:p>
-    <w:p>
-      <w:pPr>
-        <w:rPr>
-          <w:b/>
-          <w:bCs/>
-        </w:rPr>
-      </w:pPr>
-    </w:p>
-    <w:p>
-      <w:pPr>
-        <w:rPr>
-          <w:b/>
-          <w:bCs/>
-        </w:rPr>
-      </w:pPr>
-    </w:p>
-    <w:p>
-      <w:pPr>
-        <w:rPr>
-          <w:b/>
-          <w:bCs/>
-        </w:rPr>
-      </w:pPr>
-    </w:p>
-    <w:p>
-      <w:pPr>
-        <w:rPr>
-          <w:b/>
-          <w:bCs/>
-        </w:rPr>
-      </w:pPr>
-    </w:p>
-    <w:p>
-      <w:pPr>
-        <w:rPr>
-          <w:b/>
-          <w:bCs/>
-        </w:rPr>
-      </w:pPr>
-    </w:p>
-    <w:p>
-      <w:pPr>
-        <w:rPr>
-          <w:b/>
-          <w:bCs/>
-        </w:rPr>
-      </w:pPr>
-    </w:p>
-    <w:p>
-      <w:pPr>
-        <w:rPr>
-          <w:b/>
-          <w:bCs/>
-        </w:rPr>
-      </w:pPr>
-    </w:p>
-    <w:p>
-      <w:pPr>
-        <w:rPr>
-          <w:b/>
-          <w:bCs/>
-        </w:rPr>
-      </w:pPr>
-    </w:p>
-    <w:p>
-      <w:pPr>
-        <w:rPr>
-          <w:b/>
-          <w:bCs/>
-        </w:rPr>
-      </w:pPr>
-    </w:p>
-    <w:p>
-      <w:pPr>
-        <w:rPr>
-          <w:b/>
-          <w:bCs/>
-        </w:rPr>
-      </w:pPr>
-    </w:p>
-    <w:p>
-      <w:pPr>
-        <w:rPr>
-          <w:b/>
-          <w:bCs/>
-        </w:rPr>
-      </w:pPr>
-    </w:p>
-    <w:p>
-      <w:pPr>
-        <w:rPr>
-          <w:b/>
-          <w:bCs/>
-        </w:rPr>
-      </w:pPr>
-    </w:p>
-    <w:p>
-      <w:pPr>
-        <w:rPr>
-          <w:b/>
-          <w:bCs/>
-        </w:rPr>
-      </w:pPr>
-    </w:p>
-    <w:p>
-      <w:pPr>
-        <w:rPr>
-          <w:b/>
-          <w:bCs/>
-        </w:rPr>
-      </w:pPr>
-    </w:p>
-    <w:p>
-      <w:pPr>
-        <w:rPr>
-          <w:b/>
-          <w:bCs/>
-        </w:rPr>
-      </w:pPr>
-    </w:p>
-    <w:p>
-      <w:pPr>
-        <w:rPr>
-          <w:b/>
-          <w:bCs/>
-        </w:rPr>
-      </w:pPr>
-    </w:p>
-    <w:p>
-      <w:pPr>
-        <w:rPr>
-          <w:b/>
-          <w:bCs/>
-        </w:rPr>
-      </w:pPr>
-    </w:p>
-    <w:p>
-      <w:pPr>
-        <w:rPr>
-          <w:b/>
-          <w:bCs/>
-        </w:rPr>
+        <w:t xml:space="preserve">Para a definição estruturada e alinhamento do escopo deste estudo, adota-se a abordagem Goal-Question-Metric (GQM), desenvolvida originalmente por Basili e Weiss (1984) e consolidada por Basili (1992). O GQM é um paradigma de medição orientado a objetivos que estabelece uma estrutura hierárquica dividida em três níveis: </w:t>
+      </w:r>
+      <w:r>
+        <w:t>1</w:t>
+      </w:r>
+      <w:r>
+        <w:t xml:space="preserve">) Conceitual (Goal), onde se define o objetivo principal da investigação sob uma perspectiva e contexto específicos; </w:t>
+      </w:r>
+      <w:r>
+        <w:t>2</w:t>
+      </w:r>
+      <w:r>
+        <w:t xml:space="preserve">) Operacional (Question), no qual o objetivo é refinado em um conjunto de questões que caracterizam o objeto de estudo de forma quantificável; e </w:t>
+      </w:r>
+      <w:r>
+        <w:t>3</w:t>
+      </w:r>
+      <w:r>
+        <w:t>) Quantitativo (Metric), onde são associadas as métricas de dados necessárias para responder satisfatoriamente a cada questão formulada. No âmbito deste protocolo, a aplicação do framework GQM garante que a coleta e a análise das evidências da literatura estejam rigorosamente vinculadas às metas centrais da pesquisa, evitando a inclusão de métricas ad-hoc ou desconexas do propósito científico.</w:t>
+      </w:r>
+    </w:p>
+    <w:p>
+      <w:pPr>
+        <w:jc w:val="both"/>
       </w:pPr>
       <w:r>
         <w:rPr>
@@ -1661,49 +1151,17 @@
         <w:t>Analisar</w:t>
       </w:r>
       <w:r>
-        <w:t xml:space="preserve"> abordagens de </w:t>
-      </w:r>
-      <w:proofErr w:type="spellStart"/>
-      <w:r>
-        <w:t>Retrieval-Augmented</w:t>
-      </w:r>
-      <w:proofErr w:type="spellEnd"/>
-      <w:r>
-        <w:t xml:space="preserve"> Generation (RAG) </w:t>
-      </w:r>
-    </w:p>
-    <w:p>
-      <w:r>
-        <w:t xml:space="preserve">            baseadas em Large </w:t>
-      </w:r>
-      <w:proofErr w:type="spellStart"/>
-      <w:r>
-        <w:t>Language</w:t>
-      </w:r>
-      <w:proofErr w:type="spellEnd"/>
-      <w:r>
-        <w:t xml:space="preserve"> Models (</w:t>
-      </w:r>
-      <w:proofErr w:type="spellStart"/>
-      <w:r>
-        <w:t>LLMs</w:t>
-      </w:r>
-      <w:proofErr w:type="spellEnd"/>
-      <w:r>
-        <w:t>)</w:t>
-      </w:r>
-    </w:p>
-    <w:p>
-      <w:r>
-        <w:t xml:space="preserve">            aplicadas a </w:t>
-      </w:r>
-      <w:proofErr w:type="spellStart"/>
-      <w:r>
-        <w:t>codebases</w:t>
-      </w:r>
-      <w:proofErr w:type="spellEnd"/>
-      <w:r>
-        <w:t xml:space="preserve"> de software</w:t>
+        <w:t xml:space="preserve"> abordagens de Retrieval-Augmented Generation (RAG) </w:t>
+      </w:r>
+    </w:p>
+    <w:p>
+      <w:r>
+        <w:t xml:space="preserve">            baseadas em Large Language Models (LLMs)</w:t>
+      </w:r>
+    </w:p>
+    <w:p>
+      <w:r>
+        <w:t xml:space="preserve">            aplicadas a codebases de software</w:t>
       </w:r>
     </w:p>
     <w:p>
@@ -1721,15 +1179,7 @@
         <w:t xml:space="preserve"> suas</w:t>
       </w:r>
       <w:r>
-        <w:t xml:space="preserve"> técnicas, </w:t>
-      </w:r>
-      <w:proofErr w:type="spellStart"/>
-      <w:r>
-        <w:t>LLMs</w:t>
-      </w:r>
-      <w:proofErr w:type="spellEnd"/>
-      <w:r>
-        <w:t xml:space="preserve"> empregadas,</w:t>
+        <w:t xml:space="preserve"> técnicas, LLMs empregadas,</w:t>
       </w:r>
     </w:p>
     <w:p>
@@ -1819,28 +1269,15 @@
         <w:jc w:val="both"/>
       </w:pPr>
       <w:r>
-        <w:t xml:space="preserve">- RQ1: Quais técnicas e arquiteturas de RAG são propostas para aplicação em </w:t>
-      </w:r>
-      <w:proofErr w:type="spellStart"/>
-      <w:r>
-        <w:t>codebases</w:t>
-      </w:r>
-      <w:proofErr w:type="spellEnd"/>
-      <w:r>
-        <w:t xml:space="preserve"> de software?</w:t>
+        <w:t>- RQ1: Quais técnicas e arquiteturas de RAG são propostas para aplicação em codebases de software?</w:t>
       </w:r>
     </w:p>
     <w:p>
       <w:pPr>
         <w:jc w:val="both"/>
       </w:pPr>
-      <w:proofErr w:type="spellStart"/>
-      <w:r>
-        <w:t>Rationale</w:t>
-      </w:r>
-      <w:proofErr w:type="spellEnd"/>
-      <w:r>
-        <w:t>: Identificar e classificar as arquiteturas existentes: permite consolidar o estado da arte quanto às estratégias de recuperação e processamento de código, servindo de base para as demais questões do mapeamento.</w:t>
+      <w:r>
+        <w:t>Rationale: Identificar e classificar as arquiteturas existentes: permite consolidar o estado da arte quanto às estratégias de recuperação e processamento de código, servindo de base para as demais questões do mapeamento.</w:t>
       </w:r>
     </w:p>
     <w:p>
@@ -1853,44 +1290,15 @@
         <w:jc w:val="both"/>
       </w:pPr>
       <w:r>
-        <w:t xml:space="preserve">- RQ2: Quais Large </w:t>
-      </w:r>
-      <w:proofErr w:type="spellStart"/>
-      <w:r>
-        <w:t>Language</w:t>
-      </w:r>
-      <w:proofErr w:type="spellEnd"/>
-      <w:r>
-        <w:t xml:space="preserve"> Models são empregadas como componente gerador nas abordagens de RAG para </w:t>
-      </w:r>
-      <w:proofErr w:type="spellStart"/>
-      <w:r>
-        <w:t>codebases</w:t>
-      </w:r>
-      <w:proofErr w:type="spellEnd"/>
-      <w:r>
-        <w:t>?</w:t>
+        <w:t>- RQ2: Quais Large Language Models são empregadas como componente gerador nas abordagens de RAG para codebases?</w:t>
       </w:r>
     </w:p>
     <w:p>
       <w:pPr>
         <w:jc w:val="both"/>
       </w:pPr>
-      <w:proofErr w:type="spellStart"/>
-      <w:r>
-        <w:t>Rationale</w:t>
-      </w:r>
-      <w:proofErr w:type="spellEnd"/>
-      <w:r>
-        <w:t xml:space="preserve">: Compreender quais </w:t>
-      </w:r>
-      <w:proofErr w:type="spellStart"/>
-      <w:r>
-        <w:t>LLMs</w:t>
-      </w:r>
-      <w:proofErr w:type="spellEnd"/>
-      <w:r>
-        <w:t xml:space="preserve"> são predominantemente adotadas auxilia pesquisadores e praticantes na seleção de modelos adequados para implementações futuras, além de revelar tendências de adoção na área.</w:t>
+      <w:r>
+        <w:t>Rationale: Compreender quais LLMs são predominantemente adotadas auxilia pesquisadores e praticantes na seleção de modelos adequados para implementações futuras, além de revelar tendências de adoção na área.</w:t>
       </w:r>
     </w:p>
     <w:p>
@@ -1910,13 +1318,8 @@
       <w:pPr>
         <w:jc w:val="both"/>
       </w:pPr>
-      <w:proofErr w:type="spellStart"/>
-      <w:r>
-        <w:t>Rationale</w:t>
-      </w:r>
-      <w:proofErr w:type="spellEnd"/>
-      <w:r>
-        <w:t>: Conhecer o escopo das linguagens e sistemas investigados evidencia o alcance das abordagens propostas e possíveis vieses de cobertura na literatura.</w:t>
+      <w:r>
+        <w:t>Rationale: Conhecer o escopo das linguagens e sistemas investigados evidencia o alcance das abordagens propostas e possíveis vieses de cobertura na literatura.</w:t>
       </w:r>
     </w:p>
     <w:p>
@@ -1929,28 +1332,15 @@
         <w:jc w:val="both"/>
       </w:pPr>
       <w:r>
-        <w:t xml:space="preserve">- RQ4: Quais métricas são utilizadas para avaliar a efetividade das abordagens de RAG em </w:t>
-      </w:r>
-      <w:proofErr w:type="spellStart"/>
-      <w:r>
-        <w:t>codebases</w:t>
-      </w:r>
-      <w:proofErr w:type="spellEnd"/>
-      <w:r>
-        <w:t>?</w:t>
+        <w:t>- RQ4: Quais métricas são utilizadas para avaliar a efetividade das abordagens de RAG em codebases?</w:t>
       </w:r>
     </w:p>
     <w:p>
       <w:pPr>
         <w:jc w:val="both"/>
       </w:pPr>
-      <w:proofErr w:type="spellStart"/>
-      <w:r>
-        <w:t>Rationale</w:t>
-      </w:r>
-      <w:proofErr w:type="spellEnd"/>
-      <w:r>
-        <w:t>: Mapear as métricas utilizadas permite avaliar o rigor dos estudos e identificar padrões de avaliação que possam orientar trabalhos futuros.</w:t>
+      <w:r>
+        <w:t>Rationale: Mapear as métricas utilizadas permite avaliar o rigor dos estudos e identificar padrões de avaliação que possam orientar trabalhos futuros.</w:t>
       </w:r>
     </w:p>
     <w:p>
@@ -1963,25 +1353,12 @@
         <w:jc w:val="both"/>
       </w:pPr>
       <w:r>
-        <w:t xml:space="preserve">- RQ5: Quais são as principais lacunas identificadas na literatura sobre RAG aplicado a </w:t>
-      </w:r>
-      <w:proofErr w:type="spellStart"/>
-      <w:r>
-        <w:t>codebases</w:t>
-      </w:r>
-      <w:proofErr w:type="spellEnd"/>
-      <w:r>
-        <w:t>?</w:t>
-      </w:r>
-    </w:p>
-    <w:p>
-      <w:proofErr w:type="spellStart"/>
-      <w:r>
-        <w:t>Rationale</w:t>
-      </w:r>
-      <w:proofErr w:type="spellEnd"/>
-      <w:r>
-        <w:t>: Identificar lacunas contribui diretamente para a agenda de pesquisa da área, apontando oportunidades para estudos futuros.</w:t>
+        <w:t>- RQ5: Quais são as principais lacunas identificadas na literatura sobre RAG aplicado a codebases?</w:t>
+      </w:r>
+    </w:p>
+    <w:p>
+      <w:r>
+        <w:t>Rationale: Identificar lacunas contribui diretamente para a agenda de pesquisa da área, apontando oportunidades para estudos futuros.</w:t>
       </w:r>
     </w:p>
     <w:p/>
@@ -2088,13 +1465,8 @@
             <w:pPr>
               <w:jc w:val="both"/>
             </w:pPr>
-            <w:proofErr w:type="spellStart"/>
-            <w:r>
-              <w:t>Codebases</w:t>
-            </w:r>
-            <w:proofErr w:type="spellEnd"/>
-            <w:r>
-              <w:t xml:space="preserve"> de software</w:t>
+            <w:r>
+              <w:t>Codebases de software</w:t>
             </w:r>
             <w:r>
               <w:t>:</w:t>
@@ -2134,15 +1506,7 @@
               <w:jc w:val="both"/>
             </w:pPr>
             <w:r>
-              <w:t xml:space="preserve">Abordagens de RAG baseadas em </w:t>
-            </w:r>
-            <w:proofErr w:type="spellStart"/>
-            <w:r>
-              <w:t>LLMs</w:t>
-            </w:r>
-            <w:proofErr w:type="spellEnd"/>
-            <w:r>
-              <w:t xml:space="preserve"> ou IA Generativa.</w:t>
+              <w:t>Abordagens de RAG baseadas em LLMs ou IA Generativa.</w:t>
             </w:r>
           </w:p>
         </w:tc>
@@ -2203,15 +1567,7 @@
           </w:tcPr>
           <w:p>
             <w:r>
-              <w:t xml:space="preserve">O - </w:t>
-            </w:r>
-            <w:proofErr w:type="spellStart"/>
-            <w:r>
-              <w:t>Outcome</w:t>
-            </w:r>
-            <w:proofErr w:type="spellEnd"/>
-            <w:r>
-              <w:t xml:space="preserve"> (Resultado)</w:t>
+              <w:t>O - Outcome (Resultado)</w:t>
             </w:r>
           </w:p>
         </w:tc>
@@ -2231,13 +1587,8 @@
             <w:pPr>
               <w:jc w:val="both"/>
             </w:pPr>
-            <w:proofErr w:type="spellStart"/>
-            <w:r>
-              <w:t>LLMs</w:t>
-            </w:r>
-            <w:proofErr w:type="spellEnd"/>
-            <w:r>
-              <w:t xml:space="preserve"> empregadas.</w:t>
+            <w:r>
+              <w:t>LLMs empregadas.</w:t>
             </w:r>
           </w:p>
           <w:p>
@@ -2334,89 +1685,17 @@
     </w:p>
     <w:p>
       <w:r>
-        <w:t>("</w:t>
-      </w:r>
-      <w:proofErr w:type="spellStart"/>
-      <w:r>
-        <w:t>source</w:t>
-      </w:r>
-      <w:proofErr w:type="spellEnd"/>
-      <w:r>
-        <w:t xml:space="preserve"> </w:t>
-      </w:r>
-      <w:proofErr w:type="spellStart"/>
-      <w:r>
-        <w:t>code</w:t>
-      </w:r>
-      <w:proofErr w:type="spellEnd"/>
-      <w:r>
-        <w:t>" OR "</w:t>
-      </w:r>
-      <w:proofErr w:type="spellStart"/>
-      <w:r>
-        <w:t>codebase</w:t>
-      </w:r>
-      <w:proofErr w:type="spellEnd"/>
-      <w:r>
-        <w:t>" OR "</w:t>
-      </w:r>
-      <w:proofErr w:type="spellStart"/>
-      <w:r>
-        <w:t>code</w:t>
-      </w:r>
-      <w:proofErr w:type="spellEnd"/>
-      <w:r>
-        <w:t xml:space="preserve"> </w:t>
-      </w:r>
-      <w:proofErr w:type="spellStart"/>
-      <w:r>
-        <w:t>repository</w:t>
-      </w:r>
-      <w:proofErr w:type="spellEnd"/>
-      <w:r>
-        <w:t>") AND</w:t>
-      </w:r>
-    </w:p>
-    <w:p>
-      <w:r>
-        <w:t>("</w:t>
-      </w:r>
-      <w:proofErr w:type="spellStart"/>
-      <w:r>
-        <w:t>Retrieval-Augmented</w:t>
-      </w:r>
-      <w:proofErr w:type="spellEnd"/>
-      <w:r>
-        <w:t xml:space="preserve"> Generation" OR "RAG") AND</w:t>
-      </w:r>
-    </w:p>
-    <w:p>
-      <w:r>
-        <w:t xml:space="preserve">("LLM" OR "Large </w:t>
-      </w:r>
-      <w:proofErr w:type="spellStart"/>
-      <w:r>
-        <w:t>Language</w:t>
-      </w:r>
-      <w:proofErr w:type="spellEnd"/>
-      <w:r>
-        <w:t xml:space="preserve"> Model" OR "</w:t>
-      </w:r>
-      <w:proofErr w:type="spellStart"/>
-      <w:r>
-        <w:t>GenAI</w:t>
-      </w:r>
-      <w:proofErr w:type="spellEnd"/>
-      <w:r>
-        <w:t>" OR "</w:t>
-      </w:r>
-      <w:proofErr w:type="spellStart"/>
-      <w:r>
-        <w:t>Generative</w:t>
-      </w:r>
-      <w:proofErr w:type="spellEnd"/>
-      <w:r>
-        <w:t xml:space="preserve"> AI")</w:t>
+        <w:t>("source code" OR "codebase" OR "code repository") AND</w:t>
+      </w:r>
+    </w:p>
+    <w:p>
+      <w:r>
+        <w:t>("Retrieval-Augmented Generation" OR "RAG") AND</w:t>
+      </w:r>
+    </w:p>
+    <w:p>
+      <w:r>
+        <w:t>("LLM" OR "Large Language Model" OR "GenAI" OR "Generative AI")</w:t>
       </w:r>
     </w:p>
     <w:p/>
@@ -2477,202 +1756,81 @@
           <w:i/>
           <w:iCs/>
         </w:rPr>
-        <w:t xml:space="preserve">- O “Resultado” não compõe a </w:t>
-      </w:r>
-      <w:proofErr w:type="spellStart"/>
-      <w:r>
+        <w:t>- O “Resultado” não compõe a string pois representa o que será extraído dos estudos, não um critério de busca.</w:t>
+      </w:r>
+    </w:p>
+    <w:p>
+      <w:pPr>
+        <w:jc w:val="both"/>
         <w:rPr>
           <w:i/>
           <w:iCs/>
         </w:rPr>
-        <w:t>string</w:t>
-      </w:r>
-      <w:proofErr w:type="spellEnd"/>
+      </w:pPr>
       <w:r>
         <w:rPr>
           <w:i/>
           <w:iCs/>
         </w:rPr>
-        <w:t xml:space="preserve"> pois representa o que será extraído dos estudos, não um critério de busca.</w:t>
-      </w:r>
-    </w:p>
-    <w:p>
-      <w:pPr>
-        <w:jc w:val="both"/>
+        <w:t xml:space="preserve">- </w:t>
+      </w:r>
+      <w:r>
         <w:rPr>
           <w:i/>
           <w:iCs/>
         </w:rPr>
-      </w:pPr>
-      <w:r>
+        <w:t>O "Contexto" não compõe a string de busca pois é garantido pelos critérios de seleção: a delimitação ao domínio de Engenharia de Software é assegurada pelo CI1, e a exigência de revisão por pares é assegurada pelo CE5.</w:t>
+      </w:r>
+    </w:p>
+    <w:p>
+      <w:pPr>
+        <w:jc w:val="both"/>
         <w:rPr>
           <w:i/>
           <w:iCs/>
         </w:rPr>
-        <w:t xml:space="preserve">- </w:t>
-      </w:r>
+      </w:pPr>
       <w:r>
         <w:rPr>
           <w:i/>
           <w:iCs/>
         </w:rPr>
-        <w:t xml:space="preserve">O "Contexto" não compõe a </w:t>
-      </w:r>
-      <w:proofErr w:type="spellStart"/>
+        <w:t xml:space="preserve">- </w:t>
+      </w:r>
       <w:r>
         <w:rPr>
           <w:i/>
           <w:iCs/>
         </w:rPr>
-        <w:t>string</w:t>
-      </w:r>
-      <w:proofErr w:type="spellEnd"/>
+        <w:t>Embora RAG e LLM componham conceitualmente a mesma Intervenção, eles são representados como dois grupos distintos conectados por AND na string de busca. Essa decisão é intencional: o AND garante que apenas estudos que tratam explicitamente da combinação RAG+LLM sejam recuperados, excluindo trabalhos sobre RAG sem base em modelos de linguagem de grande escala e trabalhos sobre LLMs aplicados a código sem componente de recuperação. Trata-se de uma escolha de precisão sobre sensibilidade. Está-se ciente de que artigos que referenciam modelos específicos (</w:t>
+      </w:r>
       <w:r>
         <w:rPr>
           <w:i/>
           <w:iCs/>
         </w:rPr>
-        <w:t xml:space="preserve"> de busca pois é garantido pelos critérios de seleção: a delimitação ao domínio de Engenharia de Software é assegurada pelo CI1, e a exigência de revisão por pares é assegurada pelo CE5.</w:t>
-      </w:r>
-    </w:p>
-    <w:p>
-      <w:pPr>
-        <w:jc w:val="both"/>
+        <w:t>Ex.:</w:t>
+      </w:r>
+      <w:r>
         <w:rPr>
           <w:i/>
           <w:iCs/>
         </w:rPr>
-      </w:pPr>
+        <w:t xml:space="preserve"> GPT, Llama, Gemini</w:t>
+      </w:r>
       <w:r>
         <w:rPr>
           <w:i/>
           <w:iCs/>
         </w:rPr>
-        <w:t xml:space="preserve">- </w:t>
+        <w:t>, Claude, etc.</w:t>
       </w:r>
       <w:r>
         <w:rPr>
           <w:i/>
           <w:iCs/>
         </w:rPr>
-        <w:t xml:space="preserve">Embora RAG e LLM componham conceitualmente a mesma Intervenção, eles são representados como dois grupos distintos conectados por AND na </w:t>
-      </w:r>
-      <w:proofErr w:type="spellStart"/>
-      <w:r>
-        <w:rPr>
-          <w:i/>
-          <w:iCs/>
-        </w:rPr>
-        <w:t>string</w:t>
-      </w:r>
-      <w:proofErr w:type="spellEnd"/>
-      <w:r>
-        <w:rPr>
-          <w:i/>
-          <w:iCs/>
-        </w:rPr>
-        <w:t xml:space="preserve"> de busca. Essa decisão é intencional: o AND garante que apenas estudos que tratam explicitamente da combinação RAG+LLM sejam recuperados, excluindo trabalhos sobre RAG sem base em modelos de linguagem de grande escala e trabalhos sobre </w:t>
-      </w:r>
-      <w:proofErr w:type="spellStart"/>
-      <w:r>
-        <w:rPr>
-          <w:i/>
-          <w:iCs/>
-        </w:rPr>
-        <w:t>LLMs</w:t>
-      </w:r>
-      <w:proofErr w:type="spellEnd"/>
-      <w:r>
-        <w:rPr>
-          <w:i/>
-          <w:iCs/>
-        </w:rPr>
-        <w:t xml:space="preserve"> aplicados a código sem componente de recuperação. Trata-se de uma escolha de precisão sobre sensibilidade. Está-se ciente de que artigos que referenciam modelos específicos (</w:t>
-      </w:r>
-      <w:r>
-        <w:rPr>
-          <w:i/>
-          <w:iCs/>
-        </w:rPr>
-        <w:t>Ex.:</w:t>
-      </w:r>
-      <w:r>
-        <w:rPr>
-          <w:i/>
-          <w:iCs/>
-        </w:rPr>
-        <w:t xml:space="preserve"> GPT, </w:t>
-      </w:r>
-      <w:proofErr w:type="spellStart"/>
-      <w:r>
-        <w:rPr>
-          <w:i/>
-          <w:iCs/>
-        </w:rPr>
-        <w:t>Llama</w:t>
-      </w:r>
-      <w:proofErr w:type="spellEnd"/>
-      <w:r>
-        <w:rPr>
-          <w:i/>
-          <w:iCs/>
-        </w:rPr>
-        <w:t>, Gemini</w:t>
-      </w:r>
-      <w:r>
-        <w:rPr>
-          <w:i/>
-          <w:iCs/>
-        </w:rPr>
-        <w:t xml:space="preserve">, </w:t>
-      </w:r>
-      <w:proofErr w:type="gramStart"/>
-      <w:r>
-        <w:rPr>
-          <w:i/>
-          <w:iCs/>
-        </w:rPr>
-        <w:t>Claude, etc.</w:t>
-      </w:r>
-      <w:proofErr w:type="gramEnd"/>
-      <w:r>
-        <w:rPr>
-          <w:i/>
-          <w:iCs/>
-        </w:rPr>
-        <w:t xml:space="preserve">) sem empregar os termos "LLM" ou "Large </w:t>
-      </w:r>
-      <w:proofErr w:type="spellStart"/>
-      <w:r>
-        <w:rPr>
-          <w:i/>
-          <w:iCs/>
-        </w:rPr>
-        <w:t>Language</w:t>
-      </w:r>
-      <w:proofErr w:type="spellEnd"/>
-      <w:r>
-        <w:rPr>
-          <w:i/>
-          <w:iCs/>
-        </w:rPr>
-        <w:t xml:space="preserve"> Model" podem não ser recuperados; para mitigar parcialmente esse risco, o termo "</w:t>
-      </w:r>
-      <w:proofErr w:type="spellStart"/>
-      <w:r>
-        <w:rPr>
-          <w:i/>
-          <w:iCs/>
-        </w:rPr>
-        <w:t>Generative</w:t>
-      </w:r>
-      <w:proofErr w:type="spellEnd"/>
-      <w:r>
-        <w:rPr>
-          <w:i/>
-          <w:iCs/>
-        </w:rPr>
-        <w:t xml:space="preserve"> AI" foi incluído como hiperônimo de uso corrente na literatura, aumentando a chance de cobertura indireta desses modelos. Essa decisão é documentada aqui para fins de rastreabilidade e reprodutibilidade da busca.</w:t>
+        <w:t>) sem empregar os termos "LLM" ou "Large Language Model" podem não ser recuperados; para mitigar parcialmente esse risco, o termo "Generative AI" foi incluído como hiperônimo de uso corrente na literatura, aumentando a chance de cobertura indireta desses modelos. Essa decisão é documentada aqui para fins de rastreabilidade e reprodutibilidade da busca.</w:t>
       </w:r>
     </w:p>
     <w:p/>
@@ -2819,47 +1977,7 @@
               <w:jc w:val="both"/>
             </w:pPr>
             <w:r>
-              <w:t xml:space="preserve">Principal repositório de publicações da </w:t>
-            </w:r>
-            <w:proofErr w:type="spellStart"/>
-            <w:r>
-              <w:t>Association</w:t>
-            </w:r>
-            <w:proofErr w:type="spellEnd"/>
-            <w:r>
-              <w:t xml:space="preserve"> for </w:t>
-            </w:r>
-            <w:proofErr w:type="spellStart"/>
-            <w:r>
-              <w:t>Computing</w:t>
-            </w:r>
-            <w:proofErr w:type="spellEnd"/>
-            <w:r>
-              <w:t xml:space="preserve"> Machinery (ACM), com cobertura abrangente de Engenharia de Software e áreas correlatas. Indexa </w:t>
-            </w:r>
-            <w:proofErr w:type="spellStart"/>
-            <w:r>
-              <w:t>venues</w:t>
-            </w:r>
-            <w:proofErr w:type="spellEnd"/>
-            <w:r>
-              <w:t xml:space="preserve"> de alto impacto como ESEC/FSE, ISSTA, ICSE (</w:t>
-            </w:r>
-            <w:proofErr w:type="spellStart"/>
-            <w:r>
-              <w:t>co-publicada</w:t>
-            </w:r>
-            <w:proofErr w:type="spellEnd"/>
-            <w:r>
-              <w:t xml:space="preserve"> com IEEE) e periódicos como TOSEM e CACM. Oferece busca avançada com operadores booleanos e exportação estruturada em </w:t>
-            </w:r>
-            <w:proofErr w:type="spellStart"/>
-            <w:r>
-              <w:t>BibTeX</w:t>
-            </w:r>
-            <w:proofErr w:type="spellEnd"/>
-            <w:r>
-              <w:t xml:space="preserve"> </w:t>
+              <w:t xml:space="preserve">Principal repositório de publicações da Association for Computing Machinery (ACM), com cobertura abrangente de Engenharia de Software e áreas correlatas. Indexa venues de alto impacto como ESEC/FSE, ISSTA, ICSE (co-publicada com IEEE) e periódicos como TOSEM e CACM. Oferece busca avançada com operadores booleanos e exportação estruturada em BibTeX </w:t>
             </w:r>
             <w:r>
               <w:t>-</w:t>
@@ -2877,13 +1995,8 @@
           </w:tcPr>
           <w:p>
             <w:r>
-              <w:t xml:space="preserve">IEEE </w:t>
-            </w:r>
-            <w:proofErr w:type="spellStart"/>
-            <w:r>
-              <w:t>Xplore</w:t>
-            </w:r>
-            <w:proofErr w:type="spellEnd"/>
+              <w:t>IEEE Xplore</w:t>
+            </w:r>
           </w:p>
         </w:tc>
         <w:tc>
@@ -2905,15 +2018,7 @@
               <w:jc w:val="both"/>
             </w:pPr>
             <w:r>
-              <w:t>Principal repositório de publicações IEEE e IET em Engenharia de Software, Computação e áreas afins. Indexa conferências de alto impacto como ICSE, ASE, SANER e MSR, além dos principais periódicos da área (e.g., IEEE TSE, IEEE Software). Oferece busca avançada com exportação em CSV/</w:t>
-            </w:r>
-            <w:proofErr w:type="spellStart"/>
-            <w:r>
-              <w:t>BibTeX</w:t>
-            </w:r>
-            <w:proofErr w:type="spellEnd"/>
-            <w:r>
-              <w:t>.</w:t>
+              <w:t>Principal repositório de publicações IEEE e IET em Engenharia de Software, Computação e áreas afins. Indexa conferências de alto impacto como ICSE, ASE, SANER e MSR, além dos principais periódicos da área (e.g., IEEE TSE, IEEE Software). Oferece busca avançada com exportação em CSV/BibTeX.</w:t>
             </w:r>
           </w:p>
         </w:tc>
@@ -2965,85 +2070,21 @@
           <w:i/>
           <w:iCs/>
         </w:rPr>
-        <w:t xml:space="preserve">Observação: As bases selecionadas apresentam sobreposição intencional de cobertura. O Scopus indexa publicações da ACM e do IEEE, podendo duplicar resultados já retornados pela ACM Digital Library e pelo IEEE </w:t>
-      </w:r>
-      <w:proofErr w:type="spellStart"/>
+        <w:t xml:space="preserve">Observação: As bases selecionadas apresentam sobreposição intencional de cobertura. O Scopus indexa publicações da ACM e do IEEE, podendo duplicar resultados já retornados pela ACM Digital Library e pelo IEEE Xplore. Adicionalmente, alguns venues são co-publicados por mais de uma editora </w:t>
+      </w:r>
       <w:r>
         <w:rPr>
           <w:i/>
           <w:iCs/>
         </w:rPr>
-        <w:t>Xplore</w:t>
-      </w:r>
-      <w:proofErr w:type="spellEnd"/>
+        <w:t>(</w:t>
+      </w:r>
       <w:r>
         <w:rPr>
           <w:i/>
           <w:iCs/>
         </w:rPr>
-        <w:t xml:space="preserve">. Adicionalmente, alguns </w:t>
-      </w:r>
-      <w:proofErr w:type="spellStart"/>
-      <w:r>
-        <w:rPr>
-          <w:i/>
-          <w:iCs/>
-        </w:rPr>
-        <w:t>venues</w:t>
-      </w:r>
-      <w:proofErr w:type="spellEnd"/>
-      <w:r>
-        <w:rPr>
-          <w:i/>
-          <w:iCs/>
-        </w:rPr>
-        <w:t xml:space="preserve"> são </w:t>
-      </w:r>
-      <w:proofErr w:type="spellStart"/>
-      <w:r>
-        <w:rPr>
-          <w:i/>
-          <w:iCs/>
-        </w:rPr>
-        <w:t>co-publicados</w:t>
-      </w:r>
-      <w:proofErr w:type="spellEnd"/>
-      <w:r>
-        <w:rPr>
-          <w:i/>
-          <w:iCs/>
-        </w:rPr>
-        <w:t xml:space="preserve"> por mais de uma editora </w:t>
-      </w:r>
-      <w:r>
-        <w:rPr>
-          <w:i/>
-          <w:iCs/>
-        </w:rPr>
-        <w:t>(</w:t>
-      </w:r>
-      <w:r>
-        <w:rPr>
-          <w:i/>
-          <w:iCs/>
-        </w:rPr>
-        <w:t xml:space="preserve">notadamente o ICSE, </w:t>
-      </w:r>
-      <w:proofErr w:type="spellStart"/>
-      <w:r>
-        <w:rPr>
-          <w:i/>
-          <w:iCs/>
-        </w:rPr>
-        <w:t>co-publicado</w:t>
-      </w:r>
-      <w:proofErr w:type="spellEnd"/>
-      <w:r>
-        <w:rPr>
-          <w:i/>
-          <w:iCs/>
-        </w:rPr>
-        <w:t xml:space="preserve"> pela ACM e pelo IEEE</w:t>
+        <w:t>notadamente o ICSE, co-publicado pela ACM e pelo IEEE</w:t>
       </w:r>
       <w:r>
         <w:rPr>
@@ -3423,15 +2464,7 @@
               <w:t>e</w:t>
             </w:r>
             <w:r>
-              <w:t xml:space="preserve">m caso de mesmo trabalho em múltiplos </w:t>
-            </w:r>
-            <w:proofErr w:type="spellStart"/>
-            <w:r>
-              <w:t>venues</w:t>
-            </w:r>
-            <w:proofErr w:type="spellEnd"/>
-            <w:r>
-              <w:t xml:space="preserve">, manter apenas a versão publicada com </w:t>
+              <w:t xml:space="preserve">m caso de mesmo trabalho em múltiplos venues, manter apenas a versão publicada com </w:t>
             </w:r>
             <w:r>
               <w:t>revisão</w:t>
@@ -3509,23 +2542,7 @@
               <w:jc w:val="both"/>
             </w:pPr>
             <w:r>
-              <w:t xml:space="preserve">Literatura cinzenta: </w:t>
-            </w:r>
-            <w:proofErr w:type="spellStart"/>
-            <w:r>
-              <w:t>preprints</w:t>
-            </w:r>
-            <w:proofErr w:type="spellEnd"/>
-            <w:r>
-              <w:t xml:space="preserve">, relatórios técnicos, </w:t>
-            </w:r>
-            <w:proofErr w:type="spellStart"/>
-            <w:r>
-              <w:t>whitepapers</w:t>
-            </w:r>
-            <w:proofErr w:type="spellEnd"/>
-            <w:r>
-              <w:t>, posts e artigos sem revisão por pares formal.</w:t>
+              <w:t>Literatura cinzenta: preprints, relatórios técnicos, whitepapers, posts e artigos sem revisão por pares formal.</w:t>
             </w:r>
           </w:p>
         </w:tc>
@@ -3627,21 +2644,7 @@
           <w:bCs/>
         </w:rPr>
         <w:lastRenderedPageBreak/>
-        <w:t>7</w:t>
-      </w:r>
-      <w:r>
-        <w:rPr>
-          <w:b/>
-          <w:bCs/>
-        </w:rPr>
-        <w:t xml:space="preserve">. </w:t>
-      </w:r>
-      <w:r>
-        <w:rPr>
-          <w:b/>
-          <w:bCs/>
-        </w:rPr>
-        <w:t>PRISMA</w:t>
+        <w:t>7. PRISMA</w:t>
       </w:r>
     </w:p>
     <w:p>
@@ -3657,67 +2660,29 @@
         <w:jc w:val="both"/>
       </w:pPr>
       <w:r>
-        <w:t xml:space="preserve">A busca inicial nas bases de dados eletrônicas retornou um total de 140 registros brutos, distribuídos entre Scopus (n = 77), IEEE </w:t>
-      </w:r>
-      <w:proofErr w:type="spellStart"/>
-      <w:r>
-        <w:t>Xplore</w:t>
-      </w:r>
-      <w:proofErr w:type="spellEnd"/>
-      <w:r>
-        <w:t xml:space="preserve"> (n = 51) e ACM Digital Library (n = 12). Para dar suporte ao gerenciamento e à seleção desses estudos, os metadados</w:t>
-      </w:r>
-      <w:r>
-        <w:t xml:space="preserve"> (.</w:t>
-      </w:r>
-      <w:proofErr w:type="spellStart"/>
-      <w:r>
-        <w:t>bib</w:t>
-      </w:r>
-      <w:proofErr w:type="spellEnd"/>
-      <w:r>
-        <w:t>)</w:t>
-      </w:r>
-      <w:r>
-        <w:t xml:space="preserve"> foram importados para a plataforma </w:t>
-      </w:r>
-      <w:proofErr w:type="spellStart"/>
-      <w:r>
-        <w:t>Rayyan</w:t>
-      </w:r>
-      <w:proofErr w:type="spellEnd"/>
-      <w:r>
-        <w:t xml:space="preserve"> (OUZZANI et al., 2016). Por meio das funcionalidades da ferramenta, foi executado o processo automatizado de detecção de similaridade, resultando na identificação e remoção de 32 registros duplicados, restando 108 artigos únicos para a etapa de triagem. Na sequência, realizou-se a análise preliminar de títulos e resumos dentro da plataforma, o que levou à exclusão de 58 estudos que não atendiam aos critérios de elegibilidade. Ao final desse funil de seleção, 50 estudos primários foram integralmente incluídos para a extração de dados e composição do mapeamento sistemático.</w:t>
-      </w:r>
-    </w:p>
-    <w:p/>
-    <w:p>
-      <w:pPr>
-        <w:rPr>
-          <w:b/>
-          <w:bCs/>
-        </w:rPr>
-      </w:pPr>
-      <w:r>
-        <w:rPr>
-          <w:b/>
-          <w:bCs/>
-        </w:rPr>
-        <w:t>7</w:t>
-      </w:r>
-      <w:r>
-        <w:rPr>
-          <w:b/>
-          <w:bCs/>
-        </w:rPr>
-        <w:t xml:space="preserve">.1. </w:t>
-      </w:r>
-      <w:r>
-        <w:rPr>
-          <w:b/>
-          <w:bCs/>
-        </w:rPr>
-        <w:t>Organização dos dados no fluxo PRISMA</w:t>
+        <w:t>A busca inicial nas bases de dados eletrônicas retornou um total de 140 registros brutos, distribuídos entre Scopus (n = 77), IEEE Xplore (n = 51) e ACM Digital Library (n = 12). Para dar suporte ao gerenciamento e à seleção desses estudos, os metadados</w:t>
+      </w:r>
+      <w:r>
+        <w:t xml:space="preserve"> (.bib)</w:t>
+      </w:r>
+      <w:r>
+        <w:t xml:space="preserve"> foram importados para a plataforma Rayyan (OUZZANI et al., 2016). Por meio das funcionalidades da ferramenta, foi executado o processo automatizado de detecção de similaridade, resultando na identificação e remoção de 32 registros duplicados, restando 108 artigos únicos para a etapa de triagem. Na sequência, realizou-se a análise preliminar de títulos e resumos dentro da plataforma, o que levou à exclusão de 58 estudos que não atendiam aos critérios de elegibilidade. Ao final desse funil de seleção, 50 estudos primários foram integralmente incluídos para a extração de dados e composição do mapeamento sistemático.</w:t>
+      </w:r>
+    </w:p>
+    <w:p/>
+    <w:p>
+      <w:pPr>
+        <w:rPr>
+          <w:b/>
+          <w:bCs/>
+        </w:rPr>
+      </w:pPr>
+      <w:r>
+        <w:rPr>
+          <w:b/>
+          <w:bCs/>
+        </w:rPr>
+        <w:t>7.1. Organização dos dados no fluxo PRISMA</w:t>
       </w:r>
     </w:p>
     <w:p>
@@ -3761,23 +2726,7 @@
           <w:i/>
           <w:iCs/>
         </w:rPr>
-        <w:t xml:space="preserve">IEEE </w:t>
-      </w:r>
-      <w:proofErr w:type="spellStart"/>
-      <w:r>
-        <w:rPr>
-          <w:i/>
-          <w:iCs/>
-        </w:rPr>
-        <w:t>Xplore</w:t>
-      </w:r>
-      <w:proofErr w:type="spellEnd"/>
-      <w:r>
-        <w:rPr>
-          <w:i/>
-          <w:iCs/>
-        </w:rPr>
-        <w:t>:</w:t>
+        <w:t>IEEE Xplore:</w:t>
       </w:r>
       <w:r>
         <w:t xml:space="preserve"> 51</w:t>
@@ -3855,23 +2804,7 @@
           <w:b/>
           <w:bCs/>
         </w:rPr>
-        <w:t>Triagem (</w:t>
-      </w:r>
-      <w:proofErr w:type="spellStart"/>
-      <w:r>
-        <w:rPr>
-          <w:b/>
-          <w:bCs/>
-        </w:rPr>
-        <w:t>Screening</w:t>
-      </w:r>
-      <w:proofErr w:type="spellEnd"/>
-      <w:r>
-        <w:rPr>
-          <w:b/>
-          <w:bCs/>
-        </w:rPr>
-        <w:t>):</w:t>
+        <w:t>Triagem (Screening):</w:t>
       </w:r>
       <w:r>
         <w:t xml:space="preserve"> 108 artigos avaliados (título/resumo).</w:t>
@@ -3911,14 +2844,7 @@
           <w:b/>
           <w:bCs/>
         </w:rPr>
-        <w:t>Adicionados</w:t>
-      </w:r>
-      <w:r>
-        <w:rPr>
-          <w:b/>
-          <w:bCs/>
-        </w:rPr>
-        <w:t xml:space="preserve"> (Elegíveis / Amostra Final):</w:t>
+        <w:t>Adicionados (Elegíveis / Amostra Final):</w:t>
       </w:r>
       <w:r>
         <w:t xml:space="preserve"> 50 artigos restantes (108 - 58 = 50).</w:t>
@@ -3974,187 +2900,17 @@
           <w:sz w:val="24"/>
           <w:szCs w:val="24"/>
         </w:rPr>
-        <w:t xml:space="preserve">BASILI, Victor </w:t>
-      </w:r>
-      <w:proofErr w:type="gramStart"/>
-      <w:r>
-        <w:rPr>
-          <w:sz w:val="24"/>
-          <w:szCs w:val="24"/>
-        </w:rPr>
-        <w:t>R..</w:t>
-      </w:r>
-      <w:proofErr w:type="gramEnd"/>
-      <w:r>
-        <w:rPr>
-          <w:sz w:val="24"/>
-          <w:szCs w:val="24"/>
-        </w:rPr>
-        <w:t xml:space="preserve"> Software </w:t>
-      </w:r>
-      <w:proofErr w:type="spellStart"/>
-      <w:r>
-        <w:rPr>
-          <w:sz w:val="24"/>
-          <w:szCs w:val="24"/>
-        </w:rPr>
-        <w:t>Modeling</w:t>
-      </w:r>
-      <w:proofErr w:type="spellEnd"/>
-      <w:r>
-        <w:rPr>
-          <w:sz w:val="24"/>
-          <w:szCs w:val="24"/>
-        </w:rPr>
-        <w:t xml:space="preserve"> </w:t>
-      </w:r>
-      <w:proofErr w:type="spellStart"/>
-      <w:r>
-        <w:rPr>
-          <w:sz w:val="24"/>
-          <w:szCs w:val="24"/>
-        </w:rPr>
-        <w:t>and</w:t>
-      </w:r>
-      <w:proofErr w:type="spellEnd"/>
-      <w:r>
-        <w:rPr>
-          <w:sz w:val="24"/>
-          <w:szCs w:val="24"/>
-        </w:rPr>
-        <w:t xml:space="preserve"> </w:t>
-      </w:r>
-      <w:proofErr w:type="spellStart"/>
-      <w:r>
-        <w:rPr>
-          <w:sz w:val="24"/>
-          <w:szCs w:val="24"/>
-        </w:rPr>
-        <w:t>Measurement</w:t>
-      </w:r>
-      <w:proofErr w:type="spellEnd"/>
-      <w:r>
-        <w:rPr>
-          <w:sz w:val="24"/>
-          <w:szCs w:val="24"/>
-        </w:rPr>
-        <w:t xml:space="preserve">: The </w:t>
-      </w:r>
-      <w:proofErr w:type="spellStart"/>
-      <w:r>
-        <w:rPr>
-          <w:sz w:val="24"/>
-          <w:szCs w:val="24"/>
-        </w:rPr>
-        <w:t>Goal</w:t>
-      </w:r>
-      <w:proofErr w:type="spellEnd"/>
-      <w:r>
-        <w:rPr>
-          <w:sz w:val="24"/>
-          <w:szCs w:val="24"/>
-        </w:rPr>
-        <w:t>/</w:t>
-      </w:r>
-      <w:proofErr w:type="spellStart"/>
-      <w:r>
-        <w:rPr>
-          <w:sz w:val="24"/>
-          <w:szCs w:val="24"/>
-        </w:rPr>
-        <w:t>Question</w:t>
-      </w:r>
-      <w:proofErr w:type="spellEnd"/>
-      <w:r>
-        <w:rPr>
-          <w:sz w:val="24"/>
-          <w:szCs w:val="24"/>
-        </w:rPr>
-        <w:t>/</w:t>
-      </w:r>
-      <w:proofErr w:type="spellStart"/>
-      <w:r>
-        <w:rPr>
-          <w:sz w:val="24"/>
-          <w:szCs w:val="24"/>
-        </w:rPr>
-        <w:t>Metric</w:t>
-      </w:r>
-      <w:proofErr w:type="spellEnd"/>
-      <w:r>
-        <w:rPr>
-          <w:sz w:val="24"/>
-          <w:szCs w:val="24"/>
-        </w:rPr>
-        <w:t xml:space="preserve"> </w:t>
-      </w:r>
-      <w:proofErr w:type="spellStart"/>
-      <w:r>
-        <w:rPr>
-          <w:sz w:val="24"/>
-          <w:szCs w:val="24"/>
-        </w:rPr>
-        <w:t>Paradigm</w:t>
-      </w:r>
-      <w:proofErr w:type="spellEnd"/>
-      <w:r>
-        <w:rPr>
-          <w:sz w:val="24"/>
-          <w:szCs w:val="24"/>
-        </w:rPr>
-        <w:t xml:space="preserve">. </w:t>
-      </w:r>
-      <w:proofErr w:type="spellStart"/>
-      <w:r>
-        <w:rPr>
-          <w:b/>
-          <w:bCs/>
-          <w:sz w:val="24"/>
-          <w:szCs w:val="24"/>
-        </w:rPr>
-        <w:t>Institute</w:t>
-      </w:r>
-      <w:proofErr w:type="spellEnd"/>
-      <w:r>
-        <w:rPr>
-          <w:b/>
-          <w:bCs/>
-          <w:sz w:val="24"/>
-          <w:szCs w:val="24"/>
-        </w:rPr>
-        <w:t xml:space="preserve"> for </w:t>
-      </w:r>
-      <w:proofErr w:type="spellStart"/>
-      <w:r>
-        <w:rPr>
-          <w:b/>
-          <w:bCs/>
-          <w:sz w:val="24"/>
-          <w:szCs w:val="24"/>
-        </w:rPr>
-        <w:t>Advanced</w:t>
-      </w:r>
-      <w:proofErr w:type="spellEnd"/>
-      <w:r>
-        <w:rPr>
-          <w:b/>
-          <w:bCs/>
-          <w:sz w:val="24"/>
-          <w:szCs w:val="24"/>
-        </w:rPr>
-        <w:t xml:space="preserve"> Computer </w:t>
-      </w:r>
-      <w:proofErr w:type="spellStart"/>
-      <w:r>
-        <w:rPr>
-          <w:b/>
-          <w:bCs/>
-          <w:sz w:val="24"/>
-          <w:szCs w:val="24"/>
-        </w:rPr>
-        <w:t>Studies</w:t>
-      </w:r>
-      <w:proofErr w:type="spellEnd"/>
+        <w:t xml:space="preserve">BASILI, Victor R.. Software Modeling and Measurement: The Goal/Question/Metric Paradigm. </w:t>
+      </w:r>
+      <w:r>
+        <w:rPr>
+          <w:b/>
+          <w:bCs/>
+          <w:sz w:val="24"/>
+          <w:szCs w:val="24"/>
+        </w:rPr>
+        <w:t>Institute for Advanced Computer Studies</w:t>
+      </w:r>
       <w:r>
         <w:rPr>
           <w:sz w:val="24"/>
@@ -4167,78 +2923,14 @@
           <w:sz w:val="24"/>
           <w:szCs w:val="24"/>
         </w:rPr>
-        <w:t xml:space="preserve"> </w:t>
-      </w:r>
-      <w:proofErr w:type="spellStart"/>
-      <w:r>
-        <w:rPr>
-          <w:sz w:val="24"/>
-          <w:szCs w:val="24"/>
-        </w:rPr>
-        <w:t>Department</w:t>
-      </w:r>
-      <w:proofErr w:type="spellEnd"/>
-      <w:r>
-        <w:rPr>
-          <w:sz w:val="24"/>
-          <w:szCs w:val="24"/>
-        </w:rPr>
-        <w:t xml:space="preserve"> </w:t>
-      </w:r>
-      <w:proofErr w:type="spellStart"/>
-      <w:r>
-        <w:rPr>
-          <w:sz w:val="24"/>
-          <w:szCs w:val="24"/>
-        </w:rPr>
-        <w:t>of</w:t>
-      </w:r>
-      <w:proofErr w:type="spellEnd"/>
-      <w:r>
-        <w:rPr>
-          <w:sz w:val="24"/>
-          <w:szCs w:val="24"/>
-        </w:rPr>
-        <w:t xml:space="preserve"> Computer Science,</w:t>
-      </w:r>
-      <w:r>
-        <w:rPr>
-          <w:sz w:val="24"/>
-          <w:szCs w:val="24"/>
-        </w:rPr>
-        <w:t xml:space="preserve"> </w:t>
-      </w:r>
-      <w:proofErr w:type="spellStart"/>
-      <w:r>
-        <w:rPr>
-          <w:sz w:val="24"/>
-          <w:szCs w:val="24"/>
-        </w:rPr>
-        <w:t>University</w:t>
-      </w:r>
-      <w:proofErr w:type="spellEnd"/>
-      <w:r>
-        <w:rPr>
-          <w:sz w:val="24"/>
-          <w:szCs w:val="24"/>
-        </w:rPr>
-        <w:t xml:space="preserve"> </w:t>
-      </w:r>
-      <w:proofErr w:type="spellStart"/>
-      <w:r>
-        <w:rPr>
-          <w:sz w:val="24"/>
-          <w:szCs w:val="24"/>
-        </w:rPr>
-        <w:t>of</w:t>
-      </w:r>
-      <w:proofErr w:type="spellEnd"/>
-      <w:r>
-        <w:rPr>
-          <w:sz w:val="24"/>
-          <w:szCs w:val="24"/>
-        </w:rPr>
-        <w:t xml:space="preserve"> Maryland, 1992.</w:t>
+        <w:t xml:space="preserve"> Department of Computer Science,</w:t>
+      </w:r>
+      <w:r>
+        <w:rPr>
+          <w:sz w:val="24"/>
+          <w:szCs w:val="24"/>
+        </w:rPr>
+        <w:t xml:space="preserve"> University of Maryland, 1992.</w:t>
       </w:r>
     </w:p>
     <w:p>
@@ -4255,148 +2947,17 @@
           <w:sz w:val="24"/>
           <w:szCs w:val="24"/>
         </w:rPr>
-        <w:t xml:space="preserve">BASILI, Victor; WEISS, David </w:t>
-      </w:r>
-      <w:proofErr w:type="gramStart"/>
-      <w:r>
-        <w:rPr>
-          <w:sz w:val="24"/>
-          <w:szCs w:val="24"/>
-        </w:rPr>
-        <w:t>M..</w:t>
-      </w:r>
-      <w:proofErr w:type="gramEnd"/>
-      <w:r>
-        <w:rPr>
-          <w:sz w:val="24"/>
-          <w:szCs w:val="24"/>
-        </w:rPr>
-        <w:t xml:space="preserve"> A </w:t>
-      </w:r>
-      <w:proofErr w:type="spellStart"/>
-      <w:r>
-        <w:rPr>
-          <w:sz w:val="24"/>
-          <w:szCs w:val="24"/>
-        </w:rPr>
-        <w:t>Methodology</w:t>
-      </w:r>
-      <w:proofErr w:type="spellEnd"/>
-      <w:r>
-        <w:rPr>
-          <w:sz w:val="24"/>
-          <w:szCs w:val="24"/>
-        </w:rPr>
-        <w:t xml:space="preserve"> for </w:t>
-      </w:r>
-      <w:proofErr w:type="spellStart"/>
-      <w:r>
-        <w:rPr>
-          <w:sz w:val="24"/>
-          <w:szCs w:val="24"/>
-        </w:rPr>
-        <w:t>Collecting</w:t>
-      </w:r>
-      <w:proofErr w:type="spellEnd"/>
-      <w:r>
-        <w:rPr>
-          <w:sz w:val="24"/>
-          <w:szCs w:val="24"/>
-        </w:rPr>
-        <w:t xml:space="preserve"> </w:t>
-      </w:r>
-      <w:proofErr w:type="spellStart"/>
-      <w:r>
-        <w:rPr>
-          <w:sz w:val="24"/>
-          <w:szCs w:val="24"/>
-        </w:rPr>
-        <w:t>Valid</w:t>
-      </w:r>
-      <w:proofErr w:type="spellEnd"/>
-      <w:r>
-        <w:rPr>
-          <w:sz w:val="24"/>
-          <w:szCs w:val="24"/>
-        </w:rPr>
-        <w:t xml:space="preserve"> Software </w:t>
-      </w:r>
-      <w:proofErr w:type="spellStart"/>
-      <w:r>
-        <w:rPr>
-          <w:sz w:val="24"/>
-          <w:szCs w:val="24"/>
-        </w:rPr>
-        <w:t>Engineering</w:t>
-      </w:r>
-      <w:proofErr w:type="spellEnd"/>
-      <w:r>
-        <w:rPr>
-          <w:sz w:val="24"/>
-          <w:szCs w:val="24"/>
-        </w:rPr>
-        <w:t xml:space="preserve"> Data. </w:t>
-      </w:r>
-      <w:r>
-        <w:rPr>
-          <w:b/>
-          <w:bCs/>
-          <w:sz w:val="24"/>
-          <w:szCs w:val="24"/>
-        </w:rPr>
-        <w:t xml:space="preserve">IEEE </w:t>
-      </w:r>
-      <w:proofErr w:type="spellStart"/>
-      <w:r>
-        <w:rPr>
-          <w:b/>
-          <w:bCs/>
-          <w:sz w:val="24"/>
-          <w:szCs w:val="24"/>
-        </w:rPr>
-        <w:t>Transactions</w:t>
-      </w:r>
-      <w:proofErr w:type="spellEnd"/>
-      <w:r>
-        <w:rPr>
-          <w:b/>
-          <w:bCs/>
-          <w:sz w:val="24"/>
-          <w:szCs w:val="24"/>
-        </w:rPr>
-        <w:t xml:space="preserve"> </w:t>
-      </w:r>
-      <w:proofErr w:type="spellStart"/>
-      <w:r>
-        <w:rPr>
-          <w:b/>
-          <w:bCs/>
-          <w:sz w:val="24"/>
-          <w:szCs w:val="24"/>
-        </w:rPr>
-        <w:t>on</w:t>
-      </w:r>
-      <w:proofErr w:type="spellEnd"/>
-      <w:r>
-        <w:rPr>
-          <w:b/>
-          <w:bCs/>
-          <w:sz w:val="24"/>
-          <w:szCs w:val="24"/>
-        </w:rPr>
-        <w:t xml:space="preserve"> Software </w:t>
-      </w:r>
-      <w:proofErr w:type="spellStart"/>
-      <w:r>
-        <w:rPr>
-          <w:b/>
-          <w:bCs/>
-          <w:sz w:val="24"/>
-          <w:szCs w:val="24"/>
-        </w:rPr>
-        <w:t>Engineering</w:t>
-      </w:r>
-      <w:proofErr w:type="spellEnd"/>
+        <w:t xml:space="preserve">BASILI, Victor; WEISS, David M.. A Methodology for Collecting Valid Software Engineering Data. </w:t>
+      </w:r>
+      <w:r>
+        <w:rPr>
+          <w:b/>
+          <w:bCs/>
+          <w:sz w:val="24"/>
+          <w:szCs w:val="24"/>
+        </w:rPr>
+        <w:t>IEEE Transactions on Software Engineering</w:t>
+      </w:r>
       <w:r>
         <w:rPr>
           <w:sz w:val="24"/>
@@ -4475,41 +3036,8 @@
           <w:sz w:val="24"/>
           <w:szCs w:val="24"/>
         </w:rPr>
-        <w:t xml:space="preserve">. </w:t>
-      </w:r>
-      <w:proofErr w:type="spellStart"/>
-      <w:r>
-        <w:rPr>
-          <w:sz w:val="24"/>
-          <w:szCs w:val="24"/>
-        </w:rPr>
-        <w:t>Guidelines</w:t>
-      </w:r>
-      <w:proofErr w:type="spellEnd"/>
-      <w:r>
-        <w:rPr>
-          <w:sz w:val="24"/>
-          <w:szCs w:val="24"/>
-        </w:rPr>
-        <w:t xml:space="preserve"> for </w:t>
-      </w:r>
-      <w:proofErr w:type="spellStart"/>
-      <w:r>
-        <w:rPr>
-          <w:sz w:val="24"/>
-          <w:szCs w:val="24"/>
-        </w:rPr>
-        <w:t>performing</w:t>
-      </w:r>
-      <w:proofErr w:type="spellEnd"/>
-      <w:r>
-        <w:rPr>
-          <w:sz w:val="24"/>
-          <w:szCs w:val="24"/>
-        </w:rPr>
-        <w:t xml:space="preserve"> </w:t>
-      </w:r>
-      <w:proofErr w:type="spellStart"/>
+        <w:t xml:space="preserve">. Guidelines for performing </w:t>
+      </w:r>
       <w:r>
         <w:rPr>
           <w:sz w:val="24"/>
@@ -4522,17 +3050,8 @@
           <w:sz w:val="24"/>
           <w:szCs w:val="24"/>
         </w:rPr>
-        <w:t>ystematic</w:t>
-      </w:r>
-      <w:proofErr w:type="spellEnd"/>
-      <w:r>
-        <w:rPr>
-          <w:sz w:val="24"/>
-          <w:szCs w:val="24"/>
-        </w:rPr>
-        <w:t xml:space="preserve"> </w:t>
-      </w:r>
-      <w:proofErr w:type="spellStart"/>
+        <w:t xml:space="preserve">ystematic </w:t>
+      </w:r>
       <w:r>
         <w:rPr>
           <w:sz w:val="24"/>
@@ -4545,15 +3064,7 @@
           <w:sz w:val="24"/>
           <w:szCs w:val="24"/>
         </w:rPr>
-        <w:t>iterature</w:t>
-      </w:r>
-      <w:proofErr w:type="spellEnd"/>
-      <w:r>
-        <w:rPr>
-          <w:sz w:val="24"/>
-          <w:szCs w:val="24"/>
-        </w:rPr>
-        <w:t xml:space="preserve"> </w:t>
+        <w:t xml:space="preserve">iterature </w:t>
       </w:r>
       <w:r>
         <w:rPr>
@@ -4583,7 +3094,6 @@
         </w:rPr>
         <w:t xml:space="preserve">oftware </w:t>
       </w:r>
-      <w:proofErr w:type="spellStart"/>
       <w:r>
         <w:rPr>
           <w:sz w:val="24"/>
@@ -4596,83 +3106,23 @@
           <w:sz w:val="24"/>
           <w:szCs w:val="24"/>
         </w:rPr>
-        <w:t>ngineering</w:t>
-      </w:r>
-      <w:proofErr w:type="spellEnd"/>
-      <w:r>
-        <w:rPr>
-          <w:sz w:val="24"/>
-          <w:szCs w:val="24"/>
-        </w:rPr>
-        <w:t xml:space="preserve">. </w:t>
-      </w:r>
-      <w:r>
-        <w:rPr>
-          <w:b/>
-          <w:bCs/>
-          <w:sz w:val="24"/>
-          <w:szCs w:val="24"/>
-        </w:rPr>
-        <w:t xml:space="preserve">EBSE </w:t>
-      </w:r>
-      <w:proofErr w:type="spellStart"/>
-      <w:r>
-        <w:rPr>
-          <w:b/>
-          <w:bCs/>
-          <w:sz w:val="24"/>
-          <w:szCs w:val="24"/>
-        </w:rPr>
-        <w:t>Technical</w:t>
-      </w:r>
-      <w:proofErr w:type="spellEnd"/>
-      <w:r>
-        <w:rPr>
-          <w:b/>
-          <w:bCs/>
-          <w:sz w:val="24"/>
-          <w:szCs w:val="24"/>
-        </w:rPr>
-        <w:t xml:space="preserve"> Report EBSE-2007-01</w:t>
-      </w:r>
-      <w:r>
-        <w:rPr>
-          <w:sz w:val="24"/>
-          <w:szCs w:val="24"/>
-        </w:rPr>
-        <w:t xml:space="preserve">, </w:t>
-      </w:r>
-      <w:proofErr w:type="spellStart"/>
-      <w:r>
-        <w:rPr>
-          <w:sz w:val="24"/>
-          <w:szCs w:val="24"/>
-        </w:rPr>
-        <w:t>Keele</w:t>
-      </w:r>
-      <w:proofErr w:type="spellEnd"/>
-      <w:r>
-        <w:rPr>
-          <w:sz w:val="24"/>
-          <w:szCs w:val="24"/>
-        </w:rPr>
-        <w:t xml:space="preserve"> </w:t>
-      </w:r>
-      <w:proofErr w:type="spellStart"/>
-      <w:r>
-        <w:rPr>
-          <w:sz w:val="24"/>
-          <w:szCs w:val="24"/>
-        </w:rPr>
-        <w:t>University</w:t>
-      </w:r>
-      <w:proofErr w:type="spellEnd"/>
-      <w:r>
-        <w:rPr>
-          <w:sz w:val="24"/>
-          <w:szCs w:val="24"/>
-        </w:rPr>
-        <w:t>,</w:t>
+        <w:t xml:space="preserve">ngineering. </w:t>
+      </w:r>
+      <w:r>
+        <w:rPr>
+          <w:b/>
+          <w:bCs/>
+          <w:sz w:val="24"/>
+          <w:szCs w:val="24"/>
+        </w:rPr>
+        <w:t>EBSE Technical Report EBSE-2007-01</w:t>
+      </w:r>
+      <w:r>
+        <w:rPr>
+          <w:sz w:val="24"/>
+          <w:szCs w:val="24"/>
+        </w:rPr>
+        <w:t>, Keele University,</w:t>
       </w:r>
       <w:r>
         <w:rPr>
@@ -4703,75 +3153,23 @@
           <w:sz w:val="24"/>
           <w:szCs w:val="24"/>
         </w:rPr>
-        <w:t xml:space="preserve">OUZZANI, Mourad et al. </w:t>
-      </w:r>
-      <w:proofErr w:type="spellStart"/>
-      <w:r>
-        <w:rPr>
-          <w:sz w:val="24"/>
-          <w:szCs w:val="24"/>
-        </w:rPr>
-        <w:t>Rayyan</w:t>
-      </w:r>
-      <w:proofErr w:type="spellEnd"/>
-      <w:r>
-        <w:rPr>
-          <w:sz w:val="24"/>
-          <w:szCs w:val="24"/>
-        </w:rPr>
-        <w:t xml:space="preserve"> – a web </w:t>
-      </w:r>
-      <w:proofErr w:type="spellStart"/>
-      <w:r>
-        <w:rPr>
-          <w:sz w:val="24"/>
-          <w:szCs w:val="24"/>
-        </w:rPr>
-        <w:t>and</w:t>
-      </w:r>
-      <w:proofErr w:type="spellEnd"/>
-      <w:r>
-        <w:rPr>
-          <w:sz w:val="24"/>
-          <w:szCs w:val="24"/>
-        </w:rPr>
-        <w:t xml:space="preserve"> mobile app for </w:t>
-      </w:r>
-      <w:proofErr w:type="spellStart"/>
-      <w:r>
-        <w:rPr>
-          <w:sz w:val="24"/>
-          <w:szCs w:val="24"/>
-        </w:rPr>
-        <w:t>systematic</w:t>
-      </w:r>
-      <w:proofErr w:type="spellEnd"/>
-      <w:r>
-        <w:rPr>
-          <w:sz w:val="24"/>
-          <w:szCs w:val="24"/>
-        </w:rPr>
-        <w:t xml:space="preserve"> reviews. </w:t>
-      </w:r>
-      <w:proofErr w:type="spellStart"/>
-      <w:r>
-        <w:rPr>
-          <w:b/>
-          <w:bCs/>
-          <w:sz w:val="24"/>
-          <w:szCs w:val="24"/>
-        </w:rPr>
-        <w:t>Systematic</w:t>
-      </w:r>
-      <w:proofErr w:type="spellEnd"/>
-      <w:r>
-        <w:rPr>
-          <w:b/>
-          <w:bCs/>
-          <w:sz w:val="24"/>
-          <w:szCs w:val="24"/>
-        </w:rPr>
-        <w:t xml:space="preserve"> Reviews</w:t>
+        <w:t>OUZZANI, Mourad et al. Rayyan</w:t>
+      </w:r>
+      <w:r>
+        <w:rPr>
+          <w:sz w:val="24"/>
+          <w:szCs w:val="24"/>
+        </w:rPr>
+        <w:t xml:space="preserve"> – a web and mobile app for systematic reviews. </w:t>
+      </w:r>
+      <w:r>
+        <w:rPr>
+          <w:b/>
+          <w:bCs/>
+          <w:sz w:val="24"/>
+          <w:szCs w:val="24"/>
+        </w:rPr>
+        <w:t>Systematic Reviews</w:t>
       </w:r>
       <w:r>
         <w:rPr>
@@ -4809,143 +3207,16 @@
           <w:sz w:val="24"/>
           <w:szCs w:val="24"/>
         </w:rPr>
-        <w:t xml:space="preserve"> et al. </w:t>
-      </w:r>
-      <w:proofErr w:type="spellStart"/>
-      <w:r>
-        <w:rPr>
-          <w:sz w:val="24"/>
-          <w:szCs w:val="24"/>
-        </w:rPr>
-        <w:t>Guidelines</w:t>
-      </w:r>
-      <w:proofErr w:type="spellEnd"/>
-      <w:r>
-        <w:rPr>
-          <w:sz w:val="24"/>
-          <w:szCs w:val="24"/>
-        </w:rPr>
-        <w:t xml:space="preserve"> for </w:t>
-      </w:r>
-      <w:proofErr w:type="spellStart"/>
-      <w:r>
-        <w:rPr>
-          <w:sz w:val="24"/>
-          <w:szCs w:val="24"/>
-        </w:rPr>
-        <w:t>conducting</w:t>
-      </w:r>
-      <w:proofErr w:type="spellEnd"/>
-      <w:r>
-        <w:rPr>
-          <w:sz w:val="24"/>
-          <w:szCs w:val="24"/>
-        </w:rPr>
-        <w:t xml:space="preserve"> </w:t>
-      </w:r>
-      <w:proofErr w:type="spellStart"/>
-      <w:r>
-        <w:rPr>
-          <w:sz w:val="24"/>
-          <w:szCs w:val="24"/>
-        </w:rPr>
-        <w:t>systematic</w:t>
-      </w:r>
-      <w:proofErr w:type="spellEnd"/>
-      <w:r>
-        <w:rPr>
-          <w:sz w:val="24"/>
-          <w:szCs w:val="24"/>
-        </w:rPr>
-        <w:t xml:space="preserve"> mapping </w:t>
-      </w:r>
-      <w:proofErr w:type="spellStart"/>
-      <w:r>
-        <w:rPr>
-          <w:sz w:val="24"/>
-          <w:szCs w:val="24"/>
-        </w:rPr>
-        <w:t>studies</w:t>
-      </w:r>
-      <w:proofErr w:type="spellEnd"/>
-      <w:r>
-        <w:rPr>
-          <w:sz w:val="24"/>
-          <w:szCs w:val="24"/>
-        </w:rPr>
-        <w:t xml:space="preserve"> in software </w:t>
-      </w:r>
-      <w:proofErr w:type="spellStart"/>
-      <w:r>
-        <w:rPr>
-          <w:sz w:val="24"/>
-          <w:szCs w:val="24"/>
-        </w:rPr>
-        <w:t>engineering</w:t>
-      </w:r>
-      <w:proofErr w:type="spellEnd"/>
-      <w:r>
-        <w:rPr>
-          <w:sz w:val="24"/>
-          <w:szCs w:val="24"/>
-        </w:rPr>
-        <w:t xml:space="preserve">: </w:t>
-      </w:r>
-      <w:proofErr w:type="spellStart"/>
-      <w:r>
-        <w:rPr>
-          <w:sz w:val="24"/>
-          <w:szCs w:val="24"/>
-        </w:rPr>
-        <w:t>An</w:t>
-      </w:r>
-      <w:proofErr w:type="spellEnd"/>
-      <w:r>
-        <w:rPr>
-          <w:sz w:val="24"/>
-          <w:szCs w:val="24"/>
-        </w:rPr>
-        <w:t xml:space="preserve"> update. </w:t>
-      </w:r>
-      <w:proofErr w:type="spellStart"/>
-      <w:r>
-        <w:rPr>
-          <w:b/>
-          <w:bCs/>
-          <w:sz w:val="24"/>
-          <w:szCs w:val="24"/>
-        </w:rPr>
-        <w:t>Information</w:t>
-      </w:r>
-      <w:proofErr w:type="spellEnd"/>
-      <w:r>
-        <w:rPr>
-          <w:b/>
-          <w:bCs/>
-          <w:sz w:val="24"/>
-          <w:szCs w:val="24"/>
-        </w:rPr>
-        <w:t xml:space="preserve"> </w:t>
-      </w:r>
-      <w:proofErr w:type="spellStart"/>
-      <w:r>
-        <w:rPr>
-          <w:b/>
-          <w:bCs/>
-          <w:sz w:val="24"/>
-          <w:szCs w:val="24"/>
-        </w:rPr>
-        <w:t>and</w:t>
-      </w:r>
-      <w:proofErr w:type="spellEnd"/>
-      <w:r>
-        <w:rPr>
-          <w:b/>
-          <w:bCs/>
-          <w:sz w:val="24"/>
-          <w:szCs w:val="24"/>
-        </w:rPr>
-        <w:t xml:space="preserve"> Software Technology</w:t>
+        <w:t xml:space="preserve"> et al. Guidelines for conducting systematic mapping studies in software engineering: An update. </w:t>
+      </w:r>
+      <w:r>
+        <w:rPr>
+          <w:b/>
+          <w:bCs/>
+          <w:sz w:val="24"/>
+          <w:szCs w:val="24"/>
+        </w:rPr>
+        <w:t>Information and Software Technology</w:t>
       </w:r>
       <w:r>
         <w:rPr>
@@ -6038,6 +4309,7 @@
   <w:style w:type="character" w:default="1" w:styleId="Fontepargpadro">
     <w:name w:val="Default Paragraph Font"/>
     <w:uiPriority w:val="1"/>
+    <w:semiHidden/>
     <w:unhideWhenUsed/>
   </w:style>
   <w:style w:type="table" w:default="1" w:styleId="Tabelanormal">

</xml_diff>

<commit_message>
Branch: main; Reference and citation added to justify the choice of publication sources.
</commit_message>
<xml_diff>
--- a/research_protocol/protocol.docx
+++ b/research_protocol/protocol.docx
@@ -930,7 +930,29 @@
         <w:t xml:space="preserve"> </w:t>
       </w:r>
       <w:r>
-        <w:t xml:space="preserve">A condução deste trabalho segue estritamente as diretrizes e o framework propostos por Petersen et al. (2015), projetados para estruturar, categorizar e quantificar visualmente o estado da arte de um determinado campo de conhecimento. O processo é executado em cinco etapas sequenciais: </w:t>
+        <w:t xml:space="preserve">A condução deste trabalho segue estritamente as diretrizes e o framework propostos por </w:t>
+      </w:r>
+      <w:r>
+        <w:t xml:space="preserve">Petersen, </w:t>
+      </w:r>
+      <w:proofErr w:type="spellStart"/>
+      <w:r>
+        <w:t>Vakkalanka</w:t>
+      </w:r>
+      <w:proofErr w:type="spellEnd"/>
+      <w:r>
+        <w:t xml:space="preserve"> e </w:t>
+      </w:r>
+      <w:proofErr w:type="spellStart"/>
+      <w:r>
+        <w:t>Kuzniarz</w:t>
+      </w:r>
+      <w:proofErr w:type="spellEnd"/>
+      <w:r>
+        <w:t xml:space="preserve"> (2015)</w:t>
+      </w:r>
+      <w:r>
+        <w:t xml:space="preserve">, projetados para estruturar, categorizar e quantificar visualmente o estado da arte de um determinado campo de conhecimento. O processo é executado em cinco etapas sequenciais: </w:t>
       </w:r>
       <w:r>
         <w:t>1</w:t>
@@ -1182,7 +1204,29 @@
       </w:r>
       <w:proofErr w:type="spellEnd"/>
       <w:r>
-        <w:t xml:space="preserve"> e Charters (2007) e de mapeamento de Petersen et al. (2015). O diagrama documenta de forma rastreável o funil de dados da pesquisa por meio de quatro etapas</w:t>
+        <w:t xml:space="preserve"> e Charters (2007) e de mapeamento de </w:t>
+      </w:r>
+      <w:r>
+        <w:t xml:space="preserve">Petersen, </w:t>
+      </w:r>
+      <w:proofErr w:type="spellStart"/>
+      <w:r>
+        <w:t>Vakkalanka</w:t>
+      </w:r>
+      <w:proofErr w:type="spellEnd"/>
+      <w:r>
+        <w:t xml:space="preserve"> e </w:t>
+      </w:r>
+      <w:proofErr w:type="spellStart"/>
+      <w:r>
+        <w:t>Kuzniarz</w:t>
+      </w:r>
+      <w:proofErr w:type="spellEnd"/>
+      <w:r>
+        <w:t xml:space="preserve"> (2015)</w:t>
+      </w:r>
+      <w:r>
+        <w:t>. O diagrama documenta de forma rastreável o funil de dados da pesquisa por meio de quatro etapas</w:t>
       </w:r>
       <w:r>
         <w:t xml:space="preserve"> principais</w:t>
@@ -2652,31 +2696,65 @@
     </w:p>
     <w:p>
       <w:pPr>
-        <w:rPr>
-          <w:b/>
-          <w:bCs/>
-        </w:rPr>
-      </w:pPr>
-      <w:r>
-        <w:rPr>
-          <w:b/>
-          <w:bCs/>
-        </w:rPr>
-        <w:t>5</w:t>
-      </w:r>
-      <w:r>
-        <w:rPr>
-          <w:b/>
-          <w:bCs/>
-        </w:rPr>
-        <w:t xml:space="preserve">.1. </w:t>
-      </w:r>
-      <w:r>
-        <w:rPr>
-          <w:b/>
-          <w:bCs/>
-        </w:rPr>
-        <w:t>ACM Digital Library</w:t>
+        <w:jc w:val="both"/>
+      </w:pPr>
+      <w:r>
+        <w:t xml:space="preserve">A seleção das bases de dados seguiu as recomendações de </w:t>
+      </w:r>
+      <w:proofErr w:type="spellStart"/>
+      <w:r>
+        <w:t>Dyba</w:t>
+      </w:r>
+      <w:proofErr w:type="spellEnd"/>
+      <w:r>
+        <w:t xml:space="preserve">, </w:t>
+      </w:r>
+      <w:proofErr w:type="spellStart"/>
+      <w:r>
+        <w:t>Kitchenham</w:t>
+      </w:r>
+      <w:proofErr w:type="spellEnd"/>
+      <w:r>
+        <w:t xml:space="preserve"> e Jorgensen (2005) sobre as fontes mais comumente utilizadas na condução de revisões sistemáticas em Engenharia de Software. Com base nessas diretrizes, foram selecionadas as seguintes bases: ACM Digital Library, IEEE </w:t>
+      </w:r>
+      <w:proofErr w:type="spellStart"/>
+      <w:r>
+        <w:t>Xplore</w:t>
+      </w:r>
+      <w:proofErr w:type="spellEnd"/>
+      <w:r>
+        <w:t xml:space="preserve"> e Scopus. A inclusão do Scopus, não contemplada pelos autores à época de sua publicação, é respaldada por sua ampla adoção posterior em revisões sistemáticas em Engenharia de Software, conforme evidenciado em </w:t>
+      </w:r>
+      <w:proofErr w:type="spellStart"/>
+      <w:r>
+        <w:t>Kitchenham</w:t>
+      </w:r>
+      <w:proofErr w:type="spellEnd"/>
+      <w:r>
+        <w:t xml:space="preserve"> e Charters (2007).</w:t>
+      </w:r>
+    </w:p>
+    <w:p>
+      <w:pPr>
+        <w:rPr>
+          <w:b/>
+          <w:bCs/>
+        </w:rPr>
+      </w:pPr>
+    </w:p>
+    <w:p>
+      <w:pPr>
+        <w:rPr>
+          <w:b/>
+          <w:bCs/>
+        </w:rPr>
+      </w:pPr>
+      <w:r>
+        <w:rPr>
+          <w:b/>
+          <w:bCs/>
+        </w:rPr>
+        <w:t>5.1. ACM Digital Library</w:t>
       </w:r>
     </w:p>
     <w:p>
@@ -4338,28 +4416,7 @@
           <w:b/>
           <w:bCs/>
         </w:rPr>
-        <w:t>5.</w:t>
-      </w:r>
-      <w:r>
-        <w:rPr>
-          <w:b/>
-          <w:bCs/>
-        </w:rPr>
-        <w:t>2</w:t>
-      </w:r>
-      <w:r>
-        <w:rPr>
-          <w:b/>
-          <w:bCs/>
-        </w:rPr>
-        <w:t xml:space="preserve">. </w:t>
-      </w:r>
-      <w:r>
-        <w:rPr>
-          <w:b/>
-          <w:bCs/>
-        </w:rPr>
-        <w:t>IEEE Explore</w:t>
+        <w:t>5.2. IEEE Explore</w:t>
       </w:r>
     </w:p>
     <w:p/>
@@ -4379,10 +4436,7 @@
         </w:r>
       </w:hyperlink>
       <w:r>
-        <w:t>, é o p</w:t>
-      </w:r>
-      <w:r>
-        <w:t>rincipal repositório de publicações IEEE e IET em Engenharia de Software, Computação e áreas afins. Indexa conferências de alto impacto como ICSE, ASE, SANER e MSR, além dos principais periódicos da área (e.g., IEEE TSE, IEEE Software). Oferece busca avançada com exportação em CSV/</w:t>
+        <w:t>, é o principal repositório de publicações IEEE e IET em Engenharia de Software, Computação e áreas afins. Indexa conferências de alto impacto como ICSE, ASE, SANER e MSR, além dos principais periódicos da área (e.g., IEEE TSE, IEEE Software). Oferece busca avançada com exportação em CSV/</w:t>
       </w:r>
       <w:proofErr w:type="spellStart"/>
       <w:r>
@@ -4392,46 +4446,6 @@
       <w:r>
         <w:t>.</w:t>
       </w:r>
-    </w:p>
-    <w:p>
-      <w:pPr>
-        <w:jc w:val="both"/>
-      </w:pPr>
-    </w:p>
-    <w:p>
-      <w:pPr>
-        <w:jc w:val="both"/>
-      </w:pPr>
-    </w:p>
-    <w:p>
-      <w:pPr>
-        <w:jc w:val="both"/>
-      </w:pPr>
-    </w:p>
-    <w:p>
-      <w:pPr>
-        <w:jc w:val="both"/>
-      </w:pPr>
-    </w:p>
-    <w:p>
-      <w:pPr>
-        <w:jc w:val="both"/>
-      </w:pPr>
-    </w:p>
-    <w:p>
-      <w:pPr>
-        <w:jc w:val="both"/>
-      </w:pPr>
-    </w:p>
-    <w:p>
-      <w:pPr>
-        <w:jc w:val="both"/>
-      </w:pPr>
-    </w:p>
-    <w:p>
-      <w:pPr>
-        <w:jc w:val="both"/>
-      </w:pPr>
     </w:p>
     <w:p>
       <w:pPr>
@@ -6353,40 +6367,7 @@
         <w:t xml:space="preserve">, </w:t>
       </w:r>
       <w:r>
-        <w:t>é a b</w:t>
-      </w:r>
-      <w:r>
-        <w:t>ase multidisciplinar da Elsevier com ampla cobertura de Engenharia de Software,</w:t>
-      </w:r>
-      <w:r>
-        <w:t xml:space="preserve"> inclusive,</w:t>
-      </w:r>
-      <w:r>
-        <w:t xml:space="preserve"> </w:t>
-      </w:r>
-      <w:r>
-        <w:t>indexando</w:t>
-      </w:r>
-      <w:r>
-        <w:t xml:space="preserve"> publicações </w:t>
-      </w:r>
-      <w:r>
-        <w:t xml:space="preserve">da </w:t>
-      </w:r>
-      <w:r>
-        <w:t>ACM</w:t>
-      </w:r>
-      <w:r>
-        <w:t xml:space="preserve"> e IEEE</w:t>
-      </w:r>
-      <w:r>
-        <w:t>. Possui índice de citações e ferramentas de análise bibliométrica, além de suporte a exportação estruturada</w:t>
-      </w:r>
-      <w:r>
-        <w:t>,</w:t>
-      </w:r>
-      <w:r>
-        <w:t xml:space="preserve"> fundamentais para a condução sistemática e reproduzível da busca.</w:t>
+        <w:t>é a base multidisciplinar da Elsevier com ampla cobertura de Engenharia de Software, inclusive, indexando publicações da ACM e IEEE. Possui índice de citações e ferramentas de análise bibliométrica, além de suporte a exportação estruturada, fundamentais para a condução sistemática e reproduzível da busca.</w:t>
       </w:r>
     </w:p>
     <w:p>
@@ -8397,6 +8378,10 @@
     <w:p>
       <w:pPr>
         <w:jc w:val="both"/>
+        <w:rPr>
+          <w:sz w:val="24"/>
+          <w:szCs w:val="24"/>
+        </w:rPr>
       </w:pPr>
       <w:r>
         <w:rPr>
@@ -8579,6 +8564,109 @@
           <w:szCs w:val="24"/>
         </w:rPr>
         <w:t xml:space="preserve"> 1984.</w:t>
+      </w:r>
+    </w:p>
+    <w:p>
+      <w:pPr>
+        <w:jc w:val="both"/>
+        <w:rPr>
+          <w:sz w:val="24"/>
+          <w:szCs w:val="24"/>
+        </w:rPr>
+      </w:pPr>
+    </w:p>
+    <w:p>
+      <w:pPr>
+        <w:jc w:val="both"/>
+        <w:rPr>
+          <w:sz w:val="24"/>
+          <w:szCs w:val="24"/>
+        </w:rPr>
+      </w:pPr>
+      <w:r>
+        <w:rPr>
+          <w:sz w:val="24"/>
+          <w:szCs w:val="24"/>
+        </w:rPr>
+        <w:t xml:space="preserve">DYBA, Tore; KITCHENHAM, Barbara; JORGENSEN, Magne. </w:t>
+      </w:r>
+      <w:proofErr w:type="spellStart"/>
+      <w:r>
+        <w:rPr>
+          <w:sz w:val="24"/>
+          <w:szCs w:val="24"/>
+        </w:rPr>
+        <w:t>Evidence-based</w:t>
+      </w:r>
+      <w:proofErr w:type="spellEnd"/>
+      <w:r>
+        <w:rPr>
+          <w:sz w:val="24"/>
+          <w:szCs w:val="24"/>
+        </w:rPr>
+        <w:t xml:space="preserve"> software </w:t>
+      </w:r>
+      <w:proofErr w:type="spellStart"/>
+      <w:r>
+        <w:rPr>
+          <w:sz w:val="24"/>
+          <w:szCs w:val="24"/>
+        </w:rPr>
+        <w:t>engineering</w:t>
+      </w:r>
+      <w:proofErr w:type="spellEnd"/>
+      <w:r>
+        <w:rPr>
+          <w:sz w:val="24"/>
+          <w:szCs w:val="24"/>
+        </w:rPr>
+        <w:t xml:space="preserve"> for </w:t>
+      </w:r>
+      <w:proofErr w:type="spellStart"/>
+      <w:r>
+        <w:rPr>
+          <w:sz w:val="24"/>
+          <w:szCs w:val="24"/>
+        </w:rPr>
+        <w:t>practitioners</w:t>
+      </w:r>
+      <w:proofErr w:type="spellEnd"/>
+      <w:r>
+        <w:rPr>
+          <w:sz w:val="24"/>
+          <w:szCs w:val="24"/>
+        </w:rPr>
+        <w:t xml:space="preserve">. </w:t>
+      </w:r>
+      <w:r>
+        <w:rPr>
+          <w:b/>
+          <w:bCs/>
+          <w:sz w:val="24"/>
+          <w:szCs w:val="24"/>
+        </w:rPr>
+        <w:t>IEEE Software</w:t>
+      </w:r>
+      <w:r>
+        <w:rPr>
+          <w:sz w:val="24"/>
+          <w:szCs w:val="24"/>
+        </w:rPr>
+        <w:t>, v. 22, n. 1, p. 58</w:t>
+      </w:r>
+      <w:r>
+        <w:rPr>
+          <w:sz w:val="24"/>
+          <w:szCs w:val="24"/>
+        </w:rPr>
+        <w:t>-</w:t>
+      </w:r>
+      <w:r>
+        <w:rPr>
+          <w:sz w:val="24"/>
+          <w:szCs w:val="24"/>
+        </w:rPr>
+        <w:t>65, 2005.</w:t>
       </w:r>
     </w:p>
     <w:p>
@@ -8943,21 +9031,30 @@
           <w:sz w:val="24"/>
           <w:szCs w:val="24"/>
         </w:rPr>
-        <w:t>PETERSEN, K</w:t>
-      </w:r>
-      <w:r>
-        <w:rPr>
-          <w:sz w:val="24"/>
-          <w:szCs w:val="24"/>
-        </w:rPr>
-        <w:t>ai</w:t>
-      </w:r>
-      <w:r>
-        <w:rPr>
-          <w:sz w:val="24"/>
-          <w:szCs w:val="24"/>
-        </w:rPr>
-        <w:t xml:space="preserve"> et al. </w:t>
+        <w:t xml:space="preserve">PETERSEN, Kai; VAKKALANKA, </w:t>
+      </w:r>
+      <w:proofErr w:type="spellStart"/>
+      <w:r>
+        <w:rPr>
+          <w:sz w:val="24"/>
+          <w:szCs w:val="24"/>
+        </w:rPr>
+        <w:t>Sairam</w:t>
+      </w:r>
+      <w:proofErr w:type="spellEnd"/>
+      <w:r>
+        <w:rPr>
+          <w:sz w:val="24"/>
+          <w:szCs w:val="24"/>
+        </w:rPr>
+        <w:t>; KUZNIARZ, Ludwik.</w:t>
+      </w:r>
+      <w:r>
+        <w:rPr>
+          <w:sz w:val="24"/>
+          <w:szCs w:val="24"/>
+        </w:rPr>
+        <w:t xml:space="preserve"> </w:t>
       </w:r>
       <w:proofErr w:type="spellStart"/>
       <w:r>

</xml_diff>

<commit_message>
Branch: main; Added section "8. THREATS TO VALIDITY"
</commit_message>
<xml_diff>
--- a/research_protocol/protocol.docx
+++ b/research_protocol/protocol.docx
@@ -2595,17 +2595,8 @@
           <w:i/>
           <w:iCs/>
         </w:rPr>
-        <w:t xml:space="preserve">, </w:t>
-      </w:r>
-      <w:proofErr w:type="gramStart"/>
-      <w:r>
-        <w:rPr>
-          <w:i/>
-          <w:iCs/>
-        </w:rPr>
-        <w:t>Claude, etc.</w:t>
-      </w:r>
-      <w:proofErr w:type="gramEnd"/>
+        <w:t>, Claude, etc.</w:t>
+      </w:r>
       <w:r>
         <w:rPr>
           <w:i/>
@@ -6496,25 +6487,7 @@
                 <w:sz w:val="20"/>
                 <w:szCs w:val="20"/>
               </w:rPr>
-              <w:t>TITLE-ABS-</w:t>
-            </w:r>
-            <w:proofErr w:type="gramStart"/>
-            <w:r>
-              <w:rPr>
-                <w:rFonts w:ascii="Consolas" w:hAnsi="Consolas"/>
-                <w:sz w:val="20"/>
-                <w:szCs w:val="20"/>
-              </w:rPr>
-              <w:t>KEY(</w:t>
-            </w:r>
-            <w:proofErr w:type="gramEnd"/>
-            <w:r>
-              <w:rPr>
-                <w:rFonts w:ascii="Consolas" w:hAnsi="Consolas"/>
-                <w:sz w:val="20"/>
-                <w:szCs w:val="20"/>
-              </w:rPr>
-              <w:t>"</w:t>
+              <w:t>TITLE-ABS-KEY("</w:t>
             </w:r>
             <w:proofErr w:type="spellStart"/>
             <w:r>
@@ -6693,25 +6666,7 @@
                 <w:sz w:val="20"/>
                 <w:szCs w:val="20"/>
               </w:rPr>
-              <w:t>AND TITLE-ABS-</w:t>
-            </w:r>
-            <w:proofErr w:type="gramStart"/>
-            <w:r>
-              <w:rPr>
-                <w:rFonts w:ascii="Consolas" w:hAnsi="Consolas"/>
-                <w:sz w:val="20"/>
-                <w:szCs w:val="20"/>
-              </w:rPr>
-              <w:t>KEY(</w:t>
-            </w:r>
-            <w:proofErr w:type="gramEnd"/>
-            <w:r>
-              <w:rPr>
-                <w:rFonts w:ascii="Consolas" w:hAnsi="Consolas"/>
-                <w:sz w:val="20"/>
-                <w:szCs w:val="20"/>
-              </w:rPr>
-              <w:t>"</w:t>
+              <w:t>AND TITLE-ABS-KEY("</w:t>
             </w:r>
             <w:proofErr w:type="spellStart"/>
             <w:r>
@@ -6782,25 +6737,7 @@
                 <w:sz w:val="20"/>
                 <w:szCs w:val="20"/>
               </w:rPr>
-              <w:t>AND TITLE-ABS-</w:t>
-            </w:r>
-            <w:proofErr w:type="gramStart"/>
-            <w:r>
-              <w:rPr>
-                <w:rFonts w:ascii="Consolas" w:hAnsi="Consolas"/>
-                <w:sz w:val="20"/>
-                <w:szCs w:val="20"/>
-              </w:rPr>
-              <w:t>KEY(</w:t>
-            </w:r>
-            <w:proofErr w:type="gramEnd"/>
-            <w:r>
-              <w:rPr>
-                <w:rFonts w:ascii="Consolas" w:hAnsi="Consolas"/>
-                <w:sz w:val="20"/>
-                <w:szCs w:val="20"/>
-              </w:rPr>
-              <w:t xml:space="preserve">"LLM" OR "Large </w:t>
+              <w:t xml:space="preserve">AND TITLE-ABS-KEY("LLM" OR "Large </w:t>
             </w:r>
             <w:proofErr w:type="spellStart"/>
             <w:r>
@@ -7549,7 +7486,6 @@
             <w:r>
               <w:t xml:space="preserve">, </w:t>
             </w:r>
-            <w:proofErr w:type="gramStart"/>
             <w:r>
               <w:t>dissertações</w:t>
             </w:r>
@@ -7559,7 +7495,6 @@
             <w:r>
               <w:t>.</w:t>
             </w:r>
-            <w:proofErr w:type="gramEnd"/>
           </w:p>
         </w:tc>
       </w:tr>
@@ -8055,28 +7990,148 @@
     </w:p>
     <w:p/>
     <w:p/>
+    <w:p>
+      <w:pPr>
+        <w:rPr>
+          <w:b/>
+          <w:bCs/>
+        </w:rPr>
+      </w:pPr>
+      <w:r>
+        <w:rPr>
+          <w:b/>
+          <w:bCs/>
+        </w:rPr>
+        <w:t>8</w:t>
+      </w:r>
+      <w:r>
+        <w:rPr>
+          <w:b/>
+          <w:bCs/>
+        </w:rPr>
+        <w:t xml:space="preserve">. </w:t>
+      </w:r>
+      <w:r>
+        <w:rPr>
+          <w:b/>
+          <w:bCs/>
+        </w:rPr>
+        <w:t>AMEAÇAS À VALIDADE</w:t>
+      </w:r>
+    </w:p>
+    <w:p>
+      <w:pPr>
+        <w:rPr>
+          <w:b/>
+          <w:bCs/>
+        </w:rPr>
+      </w:pPr>
+    </w:p>
+    <w:p>
+      <w:pPr>
+        <w:ind w:firstLine="720"/>
+        <w:jc w:val="both"/>
+      </w:pPr>
+      <w:r>
+        <w:t>As ameaças à validade identificadas neste estudo envolvem</w:t>
+      </w:r>
+      <w:r>
+        <w:t>:</w:t>
+      </w:r>
+      <w:r>
+        <w:t xml:space="preserve"> 1) a elaboração da </w:t>
+      </w:r>
+      <w:proofErr w:type="spellStart"/>
+      <w:r>
+        <w:t>string</w:t>
+      </w:r>
+      <w:proofErr w:type="spellEnd"/>
+      <w:r>
+        <w:t xml:space="preserve"> de busca</w:t>
+      </w:r>
+      <w:r>
+        <w:t>;</w:t>
+      </w:r>
+      <w:r>
+        <w:t xml:space="preserve"> 2) a possível ausência de estudos primários relevantes</w:t>
+      </w:r>
+      <w:r>
+        <w:t>;</w:t>
+      </w:r>
+      <w:r>
+        <w:t xml:space="preserve"> 3) a confiabilidade na seleção</w:t>
+      </w:r>
+      <w:r>
+        <w:t>;</w:t>
+      </w:r>
+      <w:r>
+        <w:t xml:space="preserve"> 4) a confiabilidade na extração de dados.</w:t>
+      </w:r>
+    </w:p>
+    <w:p>
+      <w:pPr>
+        <w:ind w:firstLine="720"/>
+        <w:jc w:val="both"/>
+      </w:pPr>
+      <w:r>
+        <w:t xml:space="preserve">Para mitigar a ameaça 1, a </w:t>
+      </w:r>
+      <w:proofErr w:type="spellStart"/>
+      <w:r>
+        <w:t>string</w:t>
+      </w:r>
+      <w:proofErr w:type="spellEnd"/>
+      <w:r>
+        <w:t xml:space="preserve"> de busca foi elaborada sistematicamente seguindo o framework PICOC (KITCHENHAM; CHARTERS, 2007), garantindo rastreabilidade entre os termos de busca e os objetivos da pesquisa. A ameaça 1 é diretamente relacionada à ameaça 2, uma vez que estudos relevantes podem não ter sido recuperados caso empreguem terminologia distinta da adotada na </w:t>
+      </w:r>
+      <w:proofErr w:type="spellStart"/>
+      <w:r>
+        <w:t>string</w:t>
+      </w:r>
+      <w:proofErr w:type="spellEnd"/>
+      <w:r>
+        <w:t xml:space="preserve"> canônica. Essa limitação é parcialmente atenuada pela inclusão do termo "</w:t>
+      </w:r>
+      <w:proofErr w:type="spellStart"/>
+      <w:r>
+        <w:t>Generative</w:t>
+      </w:r>
+      <w:proofErr w:type="spellEnd"/>
+      <w:r>
+        <w:t xml:space="preserve"> AI" como hiperônimo, pela cobertura complementar das três bases selecionadas </w:t>
+      </w:r>
+      <w:r>
+        <w:t>(</w:t>
+      </w:r>
+      <w:r>
+        <w:t xml:space="preserve">ACM Digital Library, IEEE </w:t>
+      </w:r>
+      <w:proofErr w:type="spellStart"/>
+      <w:r>
+        <w:t>Xplore</w:t>
+      </w:r>
+      <w:proofErr w:type="spellEnd"/>
+      <w:r>
+        <w:t xml:space="preserve"> e Scopus</w:t>
+      </w:r>
+      <w:r>
+        <w:t>)</w:t>
+      </w:r>
+      <w:r>
+        <w:t xml:space="preserve"> e pelo fato de o Scopus indexar publicações das demais bases, ampliando a cobertura indireta.</w:t>
+      </w:r>
+    </w:p>
+    <w:p>
+      <w:pPr>
+        <w:ind w:firstLine="720"/>
+        <w:jc w:val="both"/>
+      </w:pPr>
+      <w:r>
+        <w:t>Com o objetivo de reduzir o impacto da ameaça 3, foram definidas questões de pesquisa estruturadas pelo framework GQM e derivados critérios explícitos de inclusão e exclusão, detalhados o suficiente para orientar decisões de triagem de forma objetiva e rastreável. Como limitação, reconhece-se que a condução por um único pesquisador pode introduzir viés nas etapas de triagem e extração de dados, caracterizando também a ameaça 4. A definição rigorosa dos critérios busca mitigar parcialmente esse risco, ainda que não o elimine integralmente.</w:t>
+      </w:r>
+    </w:p>
     <w:p/>
     <w:p/>
-    <w:p/>
-    <w:p/>
-    <w:p/>
-    <w:p/>
-    <w:p/>
-    <w:p/>
-    <w:p/>
-    <w:p/>
-    <w:p/>
-    <w:p/>
-    <w:p/>
-    <w:p/>
-    <w:p/>
-    <w:p/>
-    <w:p/>
-    <w:p/>
-    <w:p/>
-    <w:p/>
-    <w:p/>
-    <w:p/>
     <w:p>
       <w:pPr>
         <w:rPr>
@@ -8099,573 +8154,305 @@
         <w:jc w:val="both"/>
       </w:pPr>
       <w:r>
-        <w:rPr>
-          <w:sz w:val="24"/>
-          <w:szCs w:val="24"/>
-        </w:rPr>
-        <w:t xml:space="preserve">BASILI, Victor </w:t>
-      </w:r>
-      <w:proofErr w:type="gramStart"/>
-      <w:r>
-        <w:rPr>
-          <w:sz w:val="24"/>
-          <w:szCs w:val="24"/>
-        </w:rPr>
-        <w:t>R..</w:t>
-      </w:r>
-      <w:proofErr w:type="gramEnd"/>
-      <w:r>
-        <w:rPr>
-          <w:sz w:val="24"/>
-          <w:szCs w:val="24"/>
-        </w:rPr>
+        <w:t xml:space="preserve">BASILI, Victor R.. Software </w:t>
+      </w:r>
+      <w:proofErr w:type="spellStart"/>
+      <w:r>
+        <w:t>Modeling</w:t>
+      </w:r>
+      <w:proofErr w:type="spellEnd"/>
+      <w:r>
+        <w:t xml:space="preserve"> </w:t>
+      </w:r>
+      <w:proofErr w:type="spellStart"/>
+      <w:r>
+        <w:t>and</w:t>
+      </w:r>
+      <w:proofErr w:type="spellEnd"/>
+      <w:r>
+        <w:t xml:space="preserve"> </w:t>
+      </w:r>
+      <w:proofErr w:type="spellStart"/>
+      <w:r>
+        <w:t>Measurement</w:t>
+      </w:r>
+      <w:proofErr w:type="spellEnd"/>
+      <w:r>
+        <w:t xml:space="preserve">: The </w:t>
+      </w:r>
+      <w:proofErr w:type="spellStart"/>
+      <w:r>
+        <w:t>Goal</w:t>
+      </w:r>
+      <w:proofErr w:type="spellEnd"/>
+      <w:r>
+        <w:t>/</w:t>
+      </w:r>
+      <w:proofErr w:type="spellStart"/>
+      <w:r>
+        <w:t>Question</w:t>
+      </w:r>
+      <w:proofErr w:type="spellEnd"/>
+      <w:r>
+        <w:t>/</w:t>
+      </w:r>
+      <w:proofErr w:type="spellStart"/>
+      <w:r>
+        <w:t>Metric</w:t>
+      </w:r>
+      <w:proofErr w:type="spellEnd"/>
+      <w:r>
+        <w:t xml:space="preserve"> </w:t>
+      </w:r>
+      <w:proofErr w:type="spellStart"/>
+      <w:r>
+        <w:t>Paradigm</w:t>
+      </w:r>
+      <w:proofErr w:type="spellEnd"/>
+      <w:r>
+        <w:t xml:space="preserve">. </w:t>
+      </w:r>
+      <w:proofErr w:type="spellStart"/>
+      <w:r>
+        <w:rPr>
+          <w:b/>
+          <w:bCs/>
+        </w:rPr>
+        <w:t>Institute</w:t>
+      </w:r>
+      <w:proofErr w:type="spellEnd"/>
+      <w:r>
+        <w:rPr>
+          <w:b/>
+          <w:bCs/>
+        </w:rPr>
+        <w:t xml:space="preserve"> for </w:t>
+      </w:r>
+      <w:proofErr w:type="spellStart"/>
+      <w:r>
+        <w:rPr>
+          <w:b/>
+          <w:bCs/>
+        </w:rPr>
+        <w:t>Advanced</w:t>
+      </w:r>
+      <w:proofErr w:type="spellEnd"/>
+      <w:r>
+        <w:rPr>
+          <w:b/>
+          <w:bCs/>
+        </w:rPr>
+        <w:t xml:space="preserve"> Computer </w:t>
+      </w:r>
+      <w:proofErr w:type="spellStart"/>
+      <w:r>
+        <w:rPr>
+          <w:b/>
+          <w:bCs/>
+        </w:rPr>
+        <w:t>Studies</w:t>
+      </w:r>
+      <w:proofErr w:type="spellEnd"/>
+      <w:r>
+        <w:t>,</w:t>
+      </w:r>
+      <w:r>
+        <w:t xml:space="preserve"> </w:t>
+      </w:r>
+      <w:proofErr w:type="spellStart"/>
+      <w:r>
+        <w:t>Department</w:t>
+      </w:r>
+      <w:proofErr w:type="spellEnd"/>
+      <w:r>
+        <w:t xml:space="preserve"> </w:t>
+      </w:r>
+      <w:proofErr w:type="spellStart"/>
+      <w:r>
+        <w:t>of</w:t>
+      </w:r>
+      <w:proofErr w:type="spellEnd"/>
+      <w:r>
+        <w:t xml:space="preserve"> Computer Science,</w:t>
+      </w:r>
+      <w:r>
+        <w:t xml:space="preserve"> </w:t>
+      </w:r>
+      <w:proofErr w:type="spellStart"/>
+      <w:r>
+        <w:t>University</w:t>
+      </w:r>
+      <w:proofErr w:type="spellEnd"/>
+      <w:r>
+        <w:t xml:space="preserve"> </w:t>
+      </w:r>
+      <w:proofErr w:type="spellStart"/>
+      <w:r>
+        <w:t>of</w:t>
+      </w:r>
+      <w:proofErr w:type="spellEnd"/>
+      <w:r>
+        <w:t xml:space="preserve"> Maryland, 1992.</w:t>
+      </w:r>
+    </w:p>
+    <w:p>
+      <w:pPr>
+        <w:jc w:val="both"/>
+      </w:pPr>
+    </w:p>
+    <w:p>
+      <w:pPr>
+        <w:jc w:val="both"/>
+      </w:pPr>
+      <w:r>
+        <w:t xml:space="preserve">BASILI, Victor; WEISS, David M.. A </w:t>
+      </w:r>
+      <w:proofErr w:type="spellStart"/>
+      <w:r>
+        <w:t>Methodology</w:t>
+      </w:r>
+      <w:proofErr w:type="spellEnd"/>
+      <w:r>
+        <w:t xml:space="preserve"> for </w:t>
+      </w:r>
+      <w:proofErr w:type="spellStart"/>
+      <w:r>
+        <w:t>Collecting</w:t>
+      </w:r>
+      <w:proofErr w:type="spellEnd"/>
+      <w:r>
+        <w:t xml:space="preserve"> </w:t>
+      </w:r>
+      <w:proofErr w:type="spellStart"/>
+      <w:r>
+        <w:t>Valid</w:t>
+      </w:r>
+      <w:proofErr w:type="spellEnd"/>
+      <w:r>
         <w:t xml:space="preserve"> Software </w:t>
       </w:r>
       <w:proofErr w:type="spellStart"/>
       <w:r>
-        <w:rPr>
-          <w:sz w:val="24"/>
-          <w:szCs w:val="24"/>
-        </w:rPr>
-        <w:t>Modeling</w:t>
-      </w:r>
-      <w:proofErr w:type="spellEnd"/>
-      <w:r>
-        <w:rPr>
-          <w:sz w:val="24"/>
-          <w:szCs w:val="24"/>
+        <w:t>Engineering</w:t>
+      </w:r>
+      <w:proofErr w:type="spellEnd"/>
+      <w:r>
+        <w:t xml:space="preserve"> Data. </w:t>
+      </w:r>
+      <w:r>
+        <w:rPr>
+          <w:b/>
+          <w:bCs/>
+        </w:rPr>
+        <w:t xml:space="preserve">IEEE </w:t>
+      </w:r>
+      <w:proofErr w:type="spellStart"/>
+      <w:r>
+        <w:rPr>
+          <w:b/>
+          <w:bCs/>
+        </w:rPr>
+        <w:t>Transactions</w:t>
+      </w:r>
+      <w:proofErr w:type="spellEnd"/>
+      <w:r>
+        <w:rPr>
+          <w:b/>
+          <w:bCs/>
         </w:rPr>
         <w:t xml:space="preserve"> </w:t>
       </w:r>
       <w:proofErr w:type="spellStart"/>
       <w:r>
         <w:rPr>
-          <w:sz w:val="24"/>
-          <w:szCs w:val="24"/>
-        </w:rPr>
-        <w:t>and</w:t>
-      </w:r>
-      <w:proofErr w:type="spellEnd"/>
-      <w:r>
-        <w:rPr>
-          <w:sz w:val="24"/>
-          <w:szCs w:val="24"/>
-        </w:rPr>
-        <w:t xml:space="preserve"> </w:t>
-      </w:r>
-      <w:proofErr w:type="spellStart"/>
-      <w:r>
-        <w:rPr>
-          <w:sz w:val="24"/>
-          <w:szCs w:val="24"/>
-        </w:rPr>
-        <w:t>Measurement</w:t>
-      </w:r>
-      <w:proofErr w:type="spellEnd"/>
-      <w:r>
-        <w:rPr>
-          <w:sz w:val="24"/>
-          <w:szCs w:val="24"/>
-        </w:rPr>
-        <w:t xml:space="preserve">: The </w:t>
-      </w:r>
-      <w:proofErr w:type="spellStart"/>
-      <w:r>
-        <w:rPr>
-          <w:sz w:val="24"/>
-          <w:szCs w:val="24"/>
-        </w:rPr>
-        <w:t>Goal</w:t>
-      </w:r>
-      <w:proofErr w:type="spellEnd"/>
-      <w:r>
-        <w:rPr>
-          <w:sz w:val="24"/>
-          <w:szCs w:val="24"/>
-        </w:rPr>
-        <w:t>/</w:t>
-      </w:r>
-      <w:proofErr w:type="spellStart"/>
-      <w:r>
-        <w:rPr>
-          <w:sz w:val="24"/>
-          <w:szCs w:val="24"/>
-        </w:rPr>
-        <w:t>Question</w:t>
-      </w:r>
-      <w:proofErr w:type="spellEnd"/>
-      <w:r>
-        <w:rPr>
-          <w:sz w:val="24"/>
-          <w:szCs w:val="24"/>
-        </w:rPr>
-        <w:t>/</w:t>
-      </w:r>
-      <w:proofErr w:type="spellStart"/>
-      <w:r>
-        <w:rPr>
-          <w:sz w:val="24"/>
-          <w:szCs w:val="24"/>
-        </w:rPr>
-        <w:t>Metric</w:t>
-      </w:r>
-      <w:proofErr w:type="spellEnd"/>
-      <w:r>
-        <w:rPr>
-          <w:sz w:val="24"/>
-          <w:szCs w:val="24"/>
-        </w:rPr>
-        <w:t xml:space="preserve"> </w:t>
-      </w:r>
-      <w:proofErr w:type="spellStart"/>
-      <w:r>
-        <w:rPr>
-          <w:sz w:val="24"/>
-          <w:szCs w:val="24"/>
-        </w:rPr>
-        <w:t>Paradigm</w:t>
-      </w:r>
-      <w:proofErr w:type="spellEnd"/>
-      <w:r>
-        <w:rPr>
-          <w:sz w:val="24"/>
-          <w:szCs w:val="24"/>
-        </w:rPr>
+          <w:b/>
+          <w:bCs/>
+        </w:rPr>
+        <w:t>on</w:t>
+      </w:r>
+      <w:proofErr w:type="spellEnd"/>
+      <w:r>
+        <w:rPr>
+          <w:b/>
+          <w:bCs/>
+        </w:rPr>
+        <w:t xml:space="preserve"> Software </w:t>
+      </w:r>
+      <w:proofErr w:type="spellStart"/>
+      <w:r>
+        <w:rPr>
+          <w:b/>
+          <w:bCs/>
+        </w:rPr>
+        <w:t>Engineering</w:t>
+      </w:r>
+      <w:proofErr w:type="spellEnd"/>
+      <w:r>
+        <w:t xml:space="preserve">, v. </w:t>
+      </w:r>
+      <w:r>
+        <w:t>SE</w:t>
+      </w:r>
+      <w:r>
+        <w:t>-10, n. 6,</w:t>
+      </w:r>
+      <w:r>
+        <w:t xml:space="preserve"> p. 728-738,</w:t>
+      </w:r>
+      <w:r>
+        <w:t xml:space="preserve"> 1984.</w:t>
+      </w:r>
+    </w:p>
+    <w:p>
+      <w:pPr>
+        <w:jc w:val="both"/>
+      </w:pPr>
+    </w:p>
+    <w:p>
+      <w:pPr>
+        <w:jc w:val="both"/>
+      </w:pPr>
+      <w:r>
+        <w:t xml:space="preserve">DYBA, Tore; KITCHENHAM, Barbara; JORGENSEN, Magne. </w:t>
+      </w:r>
+      <w:proofErr w:type="spellStart"/>
+      <w:r>
+        <w:t>Evidence-based</w:t>
+      </w:r>
+      <w:proofErr w:type="spellEnd"/>
+      <w:r>
+        <w:t xml:space="preserve"> software </w:t>
+      </w:r>
+      <w:proofErr w:type="spellStart"/>
+      <w:r>
+        <w:t>engineering</w:t>
+      </w:r>
+      <w:proofErr w:type="spellEnd"/>
+      <w:r>
+        <w:t xml:space="preserve"> for </w:t>
+      </w:r>
+      <w:proofErr w:type="spellStart"/>
+      <w:r>
+        <w:t>practitioners</w:t>
+      </w:r>
+      <w:proofErr w:type="spellEnd"/>
+      <w:r>
         <w:t xml:space="preserve">. </w:t>
       </w:r>
-      <w:proofErr w:type="spellStart"/>
-      <w:r>
-        <w:rPr>
-          <w:b/>
-          <w:bCs/>
-          <w:sz w:val="24"/>
-          <w:szCs w:val="24"/>
-        </w:rPr>
-        <w:t>Institute</w:t>
-      </w:r>
-      <w:proofErr w:type="spellEnd"/>
-      <w:r>
-        <w:rPr>
-          <w:b/>
-          <w:bCs/>
-          <w:sz w:val="24"/>
-          <w:szCs w:val="24"/>
-        </w:rPr>
-        <w:t xml:space="preserve"> for </w:t>
-      </w:r>
-      <w:proofErr w:type="spellStart"/>
-      <w:r>
-        <w:rPr>
-          <w:b/>
-          <w:bCs/>
-          <w:sz w:val="24"/>
-          <w:szCs w:val="24"/>
-        </w:rPr>
-        <w:t>Advanced</w:t>
-      </w:r>
-      <w:proofErr w:type="spellEnd"/>
-      <w:r>
-        <w:rPr>
-          <w:b/>
-          <w:bCs/>
-          <w:sz w:val="24"/>
-          <w:szCs w:val="24"/>
-        </w:rPr>
-        <w:t xml:space="preserve"> Computer </w:t>
-      </w:r>
-      <w:proofErr w:type="spellStart"/>
-      <w:r>
-        <w:rPr>
-          <w:b/>
-          <w:bCs/>
-          <w:sz w:val="24"/>
-          <w:szCs w:val="24"/>
-        </w:rPr>
-        <w:t>Studies</w:t>
-      </w:r>
-      <w:proofErr w:type="spellEnd"/>
-      <w:r>
-        <w:rPr>
-          <w:sz w:val="24"/>
-          <w:szCs w:val="24"/>
-        </w:rPr>
-        <w:t>,</w:t>
-      </w:r>
-      <w:r>
-        <w:rPr>
-          <w:sz w:val="24"/>
-          <w:szCs w:val="24"/>
-        </w:rPr>
-        <w:t xml:space="preserve"> </w:t>
-      </w:r>
-      <w:proofErr w:type="spellStart"/>
-      <w:r>
-        <w:rPr>
-          <w:sz w:val="24"/>
-          <w:szCs w:val="24"/>
-        </w:rPr>
-        <w:t>Department</w:t>
-      </w:r>
-      <w:proofErr w:type="spellEnd"/>
-      <w:r>
-        <w:rPr>
-          <w:sz w:val="24"/>
-          <w:szCs w:val="24"/>
-        </w:rPr>
-        <w:t xml:space="preserve"> </w:t>
-      </w:r>
-      <w:proofErr w:type="spellStart"/>
-      <w:r>
-        <w:rPr>
-          <w:sz w:val="24"/>
-          <w:szCs w:val="24"/>
-        </w:rPr>
-        <w:t>of</w:t>
-      </w:r>
-      <w:proofErr w:type="spellEnd"/>
-      <w:r>
-        <w:rPr>
-          <w:sz w:val="24"/>
-          <w:szCs w:val="24"/>
-        </w:rPr>
-        <w:t xml:space="preserve"> Computer Science,</w:t>
-      </w:r>
-      <w:r>
-        <w:rPr>
-          <w:sz w:val="24"/>
-          <w:szCs w:val="24"/>
-        </w:rPr>
-        <w:t xml:space="preserve"> </w:t>
-      </w:r>
-      <w:proofErr w:type="spellStart"/>
-      <w:r>
-        <w:rPr>
-          <w:sz w:val="24"/>
-          <w:szCs w:val="24"/>
-        </w:rPr>
-        <w:t>University</w:t>
-      </w:r>
-      <w:proofErr w:type="spellEnd"/>
-      <w:r>
-        <w:rPr>
-          <w:sz w:val="24"/>
-          <w:szCs w:val="24"/>
-        </w:rPr>
-        <w:t xml:space="preserve"> </w:t>
-      </w:r>
-      <w:proofErr w:type="spellStart"/>
-      <w:r>
-        <w:rPr>
-          <w:sz w:val="24"/>
-          <w:szCs w:val="24"/>
-        </w:rPr>
-        <w:t>of</w:t>
-      </w:r>
-      <w:proofErr w:type="spellEnd"/>
-      <w:r>
-        <w:rPr>
-          <w:sz w:val="24"/>
-          <w:szCs w:val="24"/>
-        </w:rPr>
-        <w:t xml:space="preserve"> Maryland, 1992.</w:t>
-      </w:r>
-    </w:p>
-    <w:p>
-      <w:pPr>
-        <w:jc w:val="both"/>
-      </w:pPr>
-    </w:p>
-    <w:p>
-      <w:pPr>
-        <w:jc w:val="both"/>
-        <w:rPr>
-          <w:sz w:val="24"/>
-          <w:szCs w:val="24"/>
-        </w:rPr>
-      </w:pPr>
-      <w:r>
-        <w:rPr>
-          <w:sz w:val="24"/>
-          <w:szCs w:val="24"/>
-        </w:rPr>
-        <w:t xml:space="preserve">BASILI, Victor; WEISS, David </w:t>
-      </w:r>
-      <w:proofErr w:type="gramStart"/>
-      <w:r>
-        <w:rPr>
-          <w:sz w:val="24"/>
-          <w:szCs w:val="24"/>
-        </w:rPr>
-        <w:t>M..</w:t>
-      </w:r>
-      <w:proofErr w:type="gramEnd"/>
-      <w:r>
-        <w:rPr>
-          <w:sz w:val="24"/>
-          <w:szCs w:val="24"/>
-        </w:rPr>
-        <w:t xml:space="preserve"> A </w:t>
-      </w:r>
-      <w:proofErr w:type="spellStart"/>
-      <w:r>
-        <w:rPr>
-          <w:sz w:val="24"/>
-          <w:szCs w:val="24"/>
-        </w:rPr>
-        <w:t>Methodology</w:t>
-      </w:r>
-      <w:proofErr w:type="spellEnd"/>
-      <w:r>
-        <w:rPr>
-          <w:sz w:val="24"/>
-          <w:szCs w:val="24"/>
-        </w:rPr>
-        <w:t xml:space="preserve"> for </w:t>
-      </w:r>
-      <w:proofErr w:type="spellStart"/>
-      <w:r>
-        <w:rPr>
-          <w:sz w:val="24"/>
-          <w:szCs w:val="24"/>
-        </w:rPr>
-        <w:t>Collecting</w:t>
-      </w:r>
-      <w:proofErr w:type="spellEnd"/>
-      <w:r>
-        <w:rPr>
-          <w:sz w:val="24"/>
-          <w:szCs w:val="24"/>
-        </w:rPr>
-        <w:t xml:space="preserve"> </w:t>
-      </w:r>
-      <w:proofErr w:type="spellStart"/>
-      <w:r>
-        <w:rPr>
-          <w:sz w:val="24"/>
-          <w:szCs w:val="24"/>
-        </w:rPr>
-        <w:t>Valid</w:t>
-      </w:r>
-      <w:proofErr w:type="spellEnd"/>
-      <w:r>
-        <w:rPr>
-          <w:sz w:val="24"/>
-          <w:szCs w:val="24"/>
-        </w:rPr>
-        <w:t xml:space="preserve"> Software </w:t>
-      </w:r>
-      <w:proofErr w:type="spellStart"/>
-      <w:r>
-        <w:rPr>
-          <w:sz w:val="24"/>
-          <w:szCs w:val="24"/>
-        </w:rPr>
-        <w:t>Engineering</w:t>
-      </w:r>
-      <w:proofErr w:type="spellEnd"/>
-      <w:r>
-        <w:rPr>
-          <w:sz w:val="24"/>
-          <w:szCs w:val="24"/>
-        </w:rPr>
-        <w:t xml:space="preserve"> Data. </w:t>
-      </w:r>
-      <w:r>
-        <w:rPr>
-          <w:b/>
-          <w:bCs/>
-          <w:sz w:val="24"/>
-          <w:szCs w:val="24"/>
-        </w:rPr>
-        <w:t xml:space="preserve">IEEE </w:t>
-      </w:r>
-      <w:proofErr w:type="spellStart"/>
-      <w:r>
-        <w:rPr>
-          <w:b/>
-          <w:bCs/>
-          <w:sz w:val="24"/>
-          <w:szCs w:val="24"/>
-        </w:rPr>
-        <w:t>Transactions</w:t>
-      </w:r>
-      <w:proofErr w:type="spellEnd"/>
-      <w:r>
-        <w:rPr>
-          <w:b/>
-          <w:bCs/>
-          <w:sz w:val="24"/>
-          <w:szCs w:val="24"/>
-        </w:rPr>
-        <w:t xml:space="preserve"> </w:t>
-      </w:r>
-      <w:proofErr w:type="spellStart"/>
-      <w:r>
-        <w:rPr>
-          <w:b/>
-          <w:bCs/>
-          <w:sz w:val="24"/>
-          <w:szCs w:val="24"/>
-        </w:rPr>
-        <w:t>on</w:t>
-      </w:r>
-      <w:proofErr w:type="spellEnd"/>
-      <w:r>
-        <w:rPr>
-          <w:b/>
-          <w:bCs/>
-          <w:sz w:val="24"/>
-          <w:szCs w:val="24"/>
-        </w:rPr>
-        <w:t xml:space="preserve"> Software </w:t>
-      </w:r>
-      <w:proofErr w:type="spellStart"/>
-      <w:r>
-        <w:rPr>
-          <w:b/>
-          <w:bCs/>
-          <w:sz w:val="24"/>
-          <w:szCs w:val="24"/>
-        </w:rPr>
-        <w:t>Engineering</w:t>
-      </w:r>
-      <w:proofErr w:type="spellEnd"/>
-      <w:r>
-        <w:rPr>
-          <w:sz w:val="24"/>
-          <w:szCs w:val="24"/>
-        </w:rPr>
-        <w:t xml:space="preserve">, v. </w:t>
-      </w:r>
-      <w:r>
-        <w:rPr>
-          <w:sz w:val="24"/>
-          <w:szCs w:val="24"/>
-        </w:rPr>
-        <w:t>SE</w:t>
-      </w:r>
-      <w:r>
-        <w:rPr>
-          <w:sz w:val="24"/>
-          <w:szCs w:val="24"/>
-        </w:rPr>
-        <w:t>-10, n. 6,</w:t>
-      </w:r>
-      <w:r>
-        <w:rPr>
-          <w:sz w:val="24"/>
-          <w:szCs w:val="24"/>
-        </w:rPr>
-        <w:t xml:space="preserve"> p. 728-738,</w:t>
-      </w:r>
-      <w:r>
-        <w:rPr>
-          <w:sz w:val="24"/>
-          <w:szCs w:val="24"/>
-        </w:rPr>
-        <w:t xml:space="preserve"> 1984.</w:t>
-      </w:r>
-    </w:p>
-    <w:p>
-      <w:pPr>
-        <w:jc w:val="both"/>
-        <w:rPr>
-          <w:sz w:val="24"/>
-          <w:szCs w:val="24"/>
-        </w:rPr>
-      </w:pPr>
-    </w:p>
-    <w:p>
-      <w:pPr>
-        <w:jc w:val="both"/>
-        <w:rPr>
-          <w:sz w:val="24"/>
-          <w:szCs w:val="24"/>
-        </w:rPr>
-      </w:pPr>
-      <w:r>
-        <w:rPr>
-          <w:sz w:val="24"/>
-          <w:szCs w:val="24"/>
-        </w:rPr>
-        <w:t xml:space="preserve">DYBA, Tore; KITCHENHAM, Barbara; JORGENSEN, Magne. </w:t>
-      </w:r>
-      <w:proofErr w:type="spellStart"/>
-      <w:r>
-        <w:rPr>
-          <w:sz w:val="24"/>
-          <w:szCs w:val="24"/>
-        </w:rPr>
-        <w:t>Evidence-based</w:t>
-      </w:r>
-      <w:proofErr w:type="spellEnd"/>
-      <w:r>
-        <w:rPr>
-          <w:sz w:val="24"/>
-          <w:szCs w:val="24"/>
-        </w:rPr>
-        <w:t xml:space="preserve"> software </w:t>
-      </w:r>
-      <w:proofErr w:type="spellStart"/>
-      <w:r>
-        <w:rPr>
-          <w:sz w:val="24"/>
-          <w:szCs w:val="24"/>
-        </w:rPr>
-        <w:t>engineering</w:t>
-      </w:r>
-      <w:proofErr w:type="spellEnd"/>
-      <w:r>
-        <w:rPr>
-          <w:sz w:val="24"/>
-          <w:szCs w:val="24"/>
-        </w:rPr>
-        <w:t xml:space="preserve"> for </w:t>
-      </w:r>
-      <w:proofErr w:type="spellStart"/>
-      <w:r>
-        <w:rPr>
-          <w:sz w:val="24"/>
-          <w:szCs w:val="24"/>
-        </w:rPr>
-        <w:t>practitioners</w:t>
-      </w:r>
-      <w:proofErr w:type="spellEnd"/>
-      <w:r>
-        <w:rPr>
-          <w:sz w:val="24"/>
-          <w:szCs w:val="24"/>
-        </w:rPr>
-        <w:t xml:space="preserve">. </w:t>
-      </w:r>
-      <w:r>
-        <w:rPr>
-          <w:b/>
-          <w:bCs/>
-          <w:sz w:val="24"/>
-          <w:szCs w:val="24"/>
+      <w:r>
+        <w:rPr>
+          <w:b/>
+          <w:bCs/>
         </w:rPr>
         <w:t>IEEE Software</w:t>
       </w:r>
       <w:r>
-        <w:rPr>
-          <w:sz w:val="24"/>
-          <w:szCs w:val="24"/>
-        </w:rPr>
         <w:t>, v. 22, n. 1, p. 58</w:t>
       </w:r>
       <w:r>
-        <w:rPr>
-          <w:sz w:val="24"/>
-          <w:szCs w:val="24"/>
-        </w:rPr>
         <w:t>-</w:t>
       </w:r>
       <w:r>
-        <w:rPr>
-          <w:sz w:val="24"/>
-          <w:szCs w:val="24"/>
-        </w:rPr>
         <w:t>65, 2005.</w:t>
       </w:r>
     </w:p>
@@ -8673,181 +8460,87 @@
       <w:pPr>
         <w:spacing w:before="240" w:after="240"/>
         <w:jc w:val="both"/>
-        <w:rPr>
-          <w:sz w:val="24"/>
-          <w:szCs w:val="24"/>
-        </w:rPr>
-      </w:pPr>
-      <w:r>
-        <w:rPr>
-          <w:sz w:val="24"/>
-          <w:szCs w:val="24"/>
-        </w:rPr>
+      </w:pPr>
+      <w:r>
         <w:t>KITCHENHAM, B</w:t>
       </w:r>
       <w:r>
-        <w:rPr>
-          <w:sz w:val="24"/>
-          <w:szCs w:val="24"/>
-        </w:rPr>
         <w:t>arbara</w:t>
       </w:r>
       <w:r>
-        <w:rPr>
-          <w:sz w:val="24"/>
-          <w:szCs w:val="24"/>
-        </w:rPr>
         <w:t>; CHARTERS, S</w:t>
       </w:r>
       <w:r>
-        <w:rPr>
-          <w:sz w:val="24"/>
-          <w:szCs w:val="24"/>
-        </w:rPr>
         <w:t>tuart</w:t>
       </w:r>
       <w:r>
-        <w:rPr>
-          <w:sz w:val="24"/>
-          <w:szCs w:val="24"/>
-        </w:rPr>
         <w:t xml:space="preserve">. </w:t>
       </w:r>
       <w:proofErr w:type="spellStart"/>
       <w:r>
-        <w:rPr>
-          <w:sz w:val="24"/>
-          <w:szCs w:val="24"/>
-        </w:rPr>
         <w:t>Guidelines</w:t>
       </w:r>
       <w:proofErr w:type="spellEnd"/>
       <w:r>
-        <w:rPr>
-          <w:sz w:val="24"/>
-          <w:szCs w:val="24"/>
-        </w:rPr>
         <w:t xml:space="preserve"> for </w:t>
       </w:r>
       <w:proofErr w:type="spellStart"/>
       <w:r>
-        <w:rPr>
-          <w:sz w:val="24"/>
-          <w:szCs w:val="24"/>
-        </w:rPr>
         <w:t>performing</w:t>
       </w:r>
       <w:proofErr w:type="spellEnd"/>
       <w:r>
-        <w:rPr>
-          <w:sz w:val="24"/>
-          <w:szCs w:val="24"/>
-        </w:rPr>
         <w:t xml:space="preserve"> </w:t>
       </w:r>
       <w:proofErr w:type="spellStart"/>
       <w:r>
-        <w:rPr>
-          <w:sz w:val="24"/>
-          <w:szCs w:val="24"/>
-        </w:rPr>
         <w:t>S</w:t>
       </w:r>
       <w:r>
-        <w:rPr>
-          <w:sz w:val="24"/>
-          <w:szCs w:val="24"/>
-        </w:rPr>
         <w:t>ystematic</w:t>
       </w:r>
       <w:proofErr w:type="spellEnd"/>
       <w:r>
-        <w:rPr>
-          <w:sz w:val="24"/>
-          <w:szCs w:val="24"/>
-        </w:rPr>
         <w:t xml:space="preserve"> </w:t>
       </w:r>
       <w:proofErr w:type="spellStart"/>
       <w:r>
-        <w:rPr>
-          <w:sz w:val="24"/>
-          <w:szCs w:val="24"/>
-        </w:rPr>
         <w:t>L</w:t>
       </w:r>
       <w:r>
-        <w:rPr>
-          <w:sz w:val="24"/>
-          <w:szCs w:val="24"/>
-        </w:rPr>
         <w:t>iterature</w:t>
       </w:r>
       <w:proofErr w:type="spellEnd"/>
       <w:r>
-        <w:rPr>
-          <w:sz w:val="24"/>
-          <w:szCs w:val="24"/>
-        </w:rPr>
         <w:t xml:space="preserve"> </w:t>
       </w:r>
       <w:r>
-        <w:rPr>
-          <w:sz w:val="24"/>
-          <w:szCs w:val="24"/>
-        </w:rPr>
         <w:t>R</w:t>
       </w:r>
       <w:r>
-        <w:rPr>
-          <w:sz w:val="24"/>
-          <w:szCs w:val="24"/>
-        </w:rPr>
         <w:t xml:space="preserve">eviews in </w:t>
       </w:r>
       <w:r>
-        <w:rPr>
-          <w:sz w:val="24"/>
-          <w:szCs w:val="24"/>
-        </w:rPr>
         <w:t>S</w:t>
       </w:r>
       <w:r>
-        <w:rPr>
-          <w:sz w:val="24"/>
-          <w:szCs w:val="24"/>
-        </w:rPr>
         <w:t xml:space="preserve">oftware </w:t>
       </w:r>
       <w:proofErr w:type="spellStart"/>
       <w:r>
-        <w:rPr>
-          <w:sz w:val="24"/>
-          <w:szCs w:val="24"/>
-        </w:rPr>
         <w:t>E</w:t>
       </w:r>
       <w:r>
-        <w:rPr>
-          <w:sz w:val="24"/>
-          <w:szCs w:val="24"/>
-        </w:rPr>
         <w:t>ngineering</w:t>
       </w:r>
       <w:proofErr w:type="spellEnd"/>
       <w:r>
-        <w:rPr>
-          <w:sz w:val="24"/>
-          <w:szCs w:val="24"/>
-        </w:rPr>
         <w:t xml:space="preserve">. </w:t>
       </w:r>
       <w:r>
         <w:rPr>
           <w:b/>
           <w:bCs/>
-          <w:sz w:val="24"/>
-          <w:szCs w:val="24"/>
         </w:rPr>
         <w:t xml:space="preserve">EBSE </w:t>
       </w:r>
@@ -8856,8 +8549,6 @@
         <w:rPr>
           <w:b/>
           <w:bCs/>
-          <w:sz w:val="24"/>
-          <w:szCs w:val="24"/>
         </w:rPr>
         <w:t>Technical</w:t>
       </w:r>
@@ -8866,62 +8557,32 @@
         <w:rPr>
           <w:b/>
           <w:bCs/>
-          <w:sz w:val="24"/>
-          <w:szCs w:val="24"/>
         </w:rPr>
         <w:t xml:space="preserve"> Report EBSE-2007-01</w:t>
       </w:r>
       <w:r>
-        <w:rPr>
-          <w:sz w:val="24"/>
-          <w:szCs w:val="24"/>
-        </w:rPr>
         <w:t xml:space="preserve">, </w:t>
       </w:r>
       <w:proofErr w:type="spellStart"/>
       <w:r>
-        <w:rPr>
-          <w:sz w:val="24"/>
-          <w:szCs w:val="24"/>
-        </w:rPr>
         <w:t>Keele</w:t>
       </w:r>
       <w:proofErr w:type="spellEnd"/>
       <w:r>
-        <w:rPr>
-          <w:sz w:val="24"/>
-          <w:szCs w:val="24"/>
-        </w:rPr>
         <w:t xml:space="preserve"> </w:t>
       </w:r>
       <w:proofErr w:type="spellStart"/>
       <w:r>
-        <w:rPr>
-          <w:sz w:val="24"/>
-          <w:szCs w:val="24"/>
-        </w:rPr>
         <w:t>University</w:t>
       </w:r>
       <w:proofErr w:type="spellEnd"/>
       <w:r>
-        <w:rPr>
-          <w:sz w:val="24"/>
-          <w:szCs w:val="24"/>
-        </w:rPr>
         <w:t>,</w:t>
       </w:r>
       <w:r>
-        <w:rPr>
-          <w:sz w:val="24"/>
-          <w:szCs w:val="24"/>
-        </w:rPr>
         <w:t xml:space="preserve"> v. 2.3,</w:t>
       </w:r>
       <w:r>
-        <w:rPr>
-          <w:sz w:val="24"/>
-          <w:szCs w:val="24"/>
-        </w:rPr>
         <w:t xml:space="preserve"> 2007.</w:t>
       </w:r>
     </w:p>
@@ -8929,64 +8590,32 @@
       <w:pPr>
         <w:spacing w:before="240" w:after="240"/>
         <w:jc w:val="both"/>
-        <w:rPr>
-          <w:sz w:val="24"/>
-          <w:szCs w:val="24"/>
-        </w:rPr>
-      </w:pPr>
-      <w:r>
-        <w:rPr>
-          <w:sz w:val="24"/>
-          <w:szCs w:val="24"/>
-        </w:rPr>
+      </w:pPr>
+      <w:r>
         <w:t xml:space="preserve">OUZZANI, Mourad et al. </w:t>
       </w:r>
       <w:proofErr w:type="spellStart"/>
       <w:r>
-        <w:rPr>
-          <w:sz w:val="24"/>
-          <w:szCs w:val="24"/>
-        </w:rPr>
         <w:t>Rayyan</w:t>
       </w:r>
       <w:proofErr w:type="spellEnd"/>
       <w:r>
-        <w:rPr>
-          <w:sz w:val="24"/>
-          <w:szCs w:val="24"/>
-        </w:rPr>
         <w:t xml:space="preserve"> – a web </w:t>
       </w:r>
       <w:proofErr w:type="spellStart"/>
       <w:r>
-        <w:rPr>
-          <w:sz w:val="24"/>
-          <w:szCs w:val="24"/>
-        </w:rPr>
         <w:t>and</w:t>
       </w:r>
       <w:proofErr w:type="spellEnd"/>
       <w:r>
-        <w:rPr>
-          <w:sz w:val="24"/>
-          <w:szCs w:val="24"/>
-        </w:rPr>
         <w:t xml:space="preserve"> mobile app for </w:t>
       </w:r>
       <w:proofErr w:type="spellStart"/>
       <w:r>
-        <w:rPr>
-          <w:sz w:val="24"/>
-          <w:szCs w:val="24"/>
-        </w:rPr>
         <w:t>systematic</w:t>
       </w:r>
       <w:proofErr w:type="spellEnd"/>
       <w:r>
-        <w:rPr>
-          <w:sz w:val="24"/>
-          <w:szCs w:val="24"/>
-        </w:rPr>
         <w:t xml:space="preserve"> reviews. </w:t>
       </w:r>
       <w:proofErr w:type="spellStart"/>
@@ -8994,8 +8623,6 @@
         <w:rPr>
           <w:b/>
           <w:bCs/>
-          <w:sz w:val="24"/>
-          <w:szCs w:val="24"/>
         </w:rPr>
         <w:t>Systematic</w:t>
       </w:r>
@@ -9004,16 +8631,10 @@
         <w:rPr>
           <w:b/>
           <w:bCs/>
-          <w:sz w:val="24"/>
-          <w:szCs w:val="24"/>
         </w:rPr>
         <w:t xml:space="preserve"> Reviews</w:t>
       </w:r>
       <w:r>
-        <w:rPr>
-          <w:sz w:val="24"/>
-          <w:szCs w:val="24"/>
-        </w:rPr>
         <w:t>, 2016.</w:t>
       </w:r>
     </w:p>
@@ -9021,135 +8642,67 @@
       <w:pPr>
         <w:spacing w:before="240" w:after="240"/>
         <w:jc w:val="both"/>
-        <w:rPr>
-          <w:sz w:val="24"/>
-          <w:szCs w:val="24"/>
-        </w:rPr>
-      </w:pPr>
-      <w:r>
-        <w:rPr>
-          <w:sz w:val="24"/>
-          <w:szCs w:val="24"/>
-        </w:rPr>
+      </w:pPr>
+      <w:r>
         <w:t xml:space="preserve">PETERSEN, Kai; VAKKALANKA, </w:t>
       </w:r>
       <w:proofErr w:type="spellStart"/>
       <w:r>
-        <w:rPr>
-          <w:sz w:val="24"/>
-          <w:szCs w:val="24"/>
-        </w:rPr>
         <w:t>Sairam</w:t>
       </w:r>
       <w:proofErr w:type="spellEnd"/>
       <w:r>
-        <w:rPr>
-          <w:sz w:val="24"/>
-          <w:szCs w:val="24"/>
-        </w:rPr>
         <w:t>; KUZNIARZ, Ludwik.</w:t>
       </w:r>
       <w:r>
-        <w:rPr>
-          <w:sz w:val="24"/>
-          <w:szCs w:val="24"/>
-        </w:rPr>
         <w:t xml:space="preserve"> </w:t>
       </w:r>
       <w:proofErr w:type="spellStart"/>
       <w:r>
-        <w:rPr>
-          <w:sz w:val="24"/>
-          <w:szCs w:val="24"/>
-        </w:rPr>
         <w:t>Guidelines</w:t>
       </w:r>
       <w:proofErr w:type="spellEnd"/>
       <w:r>
-        <w:rPr>
-          <w:sz w:val="24"/>
-          <w:szCs w:val="24"/>
-        </w:rPr>
         <w:t xml:space="preserve"> for </w:t>
       </w:r>
       <w:proofErr w:type="spellStart"/>
       <w:r>
-        <w:rPr>
-          <w:sz w:val="24"/>
-          <w:szCs w:val="24"/>
-        </w:rPr>
         <w:t>conducting</w:t>
       </w:r>
       <w:proofErr w:type="spellEnd"/>
       <w:r>
-        <w:rPr>
-          <w:sz w:val="24"/>
-          <w:szCs w:val="24"/>
-        </w:rPr>
         <w:t xml:space="preserve"> </w:t>
       </w:r>
       <w:proofErr w:type="spellStart"/>
       <w:r>
-        <w:rPr>
-          <w:sz w:val="24"/>
-          <w:szCs w:val="24"/>
-        </w:rPr>
         <w:t>systematic</w:t>
       </w:r>
       <w:proofErr w:type="spellEnd"/>
       <w:r>
-        <w:rPr>
-          <w:sz w:val="24"/>
-          <w:szCs w:val="24"/>
-        </w:rPr>
         <w:t xml:space="preserve"> mapping </w:t>
       </w:r>
       <w:proofErr w:type="spellStart"/>
       <w:r>
-        <w:rPr>
-          <w:sz w:val="24"/>
-          <w:szCs w:val="24"/>
-        </w:rPr>
         <w:t>studies</w:t>
       </w:r>
       <w:proofErr w:type="spellEnd"/>
       <w:r>
-        <w:rPr>
-          <w:sz w:val="24"/>
-          <w:szCs w:val="24"/>
-        </w:rPr>
         <w:t xml:space="preserve"> in software </w:t>
       </w:r>
       <w:proofErr w:type="spellStart"/>
       <w:r>
-        <w:rPr>
-          <w:sz w:val="24"/>
-          <w:szCs w:val="24"/>
-        </w:rPr>
         <w:t>engineering</w:t>
       </w:r>
       <w:proofErr w:type="spellEnd"/>
       <w:r>
-        <w:rPr>
-          <w:sz w:val="24"/>
-          <w:szCs w:val="24"/>
-        </w:rPr>
         <w:t xml:space="preserve">: </w:t>
       </w:r>
       <w:proofErr w:type="spellStart"/>
       <w:r>
-        <w:rPr>
-          <w:sz w:val="24"/>
-          <w:szCs w:val="24"/>
-        </w:rPr>
         <w:t>An</w:t>
       </w:r>
       <w:proofErr w:type="spellEnd"/>
       <w:r>
-        <w:rPr>
-          <w:sz w:val="24"/>
-          <w:szCs w:val="24"/>
-        </w:rPr>
         <w:t xml:space="preserve"> update. </w:t>
       </w:r>
       <w:proofErr w:type="spellStart"/>
@@ -9157,8 +8710,6 @@
         <w:rPr>
           <w:b/>
           <w:bCs/>
-          <w:sz w:val="24"/>
-          <w:szCs w:val="24"/>
         </w:rPr>
         <w:t>Information</w:t>
       </w:r>
@@ -9167,8 +8718,6 @@
         <w:rPr>
           <w:b/>
           <w:bCs/>
-          <w:sz w:val="24"/>
-          <w:szCs w:val="24"/>
         </w:rPr>
         <w:t xml:space="preserve"> </w:t>
       </w:r>
@@ -9177,8 +8726,6 @@
         <w:rPr>
           <w:b/>
           <w:bCs/>
-          <w:sz w:val="24"/>
-          <w:szCs w:val="24"/>
         </w:rPr>
         <w:t>and</w:t>
       </w:r>
@@ -9187,30 +8734,16 @@
         <w:rPr>
           <w:b/>
           <w:bCs/>
-          <w:sz w:val="24"/>
-          <w:szCs w:val="24"/>
         </w:rPr>
         <w:t xml:space="preserve"> Software Technology</w:t>
       </w:r>
       <w:r>
-        <w:rPr>
-          <w:sz w:val="24"/>
-          <w:szCs w:val="24"/>
-        </w:rPr>
         <w:t>, v. 64, p. 1</w:t>
       </w:r>
       <w:r>
-        <w:rPr>
-          <w:sz w:val="24"/>
-          <w:szCs w:val="24"/>
-        </w:rPr>
         <w:t>-</w:t>
       </w:r>
       <w:r>
-        <w:rPr>
-          <w:sz w:val="24"/>
-          <w:szCs w:val="24"/>
-        </w:rPr>
         <w:t>18, 2015.</w:t>
       </w:r>
     </w:p>
@@ -10164,7 +9697,7 @@
   <w:style w:type="paragraph" w:default="1" w:styleId="Normal">
     <w:name w:val="Normal"/>
     <w:qFormat/>
-    <w:rsid w:val="001E7D6F"/>
+    <w:rsid w:val="00C87156"/>
   </w:style>
   <w:style w:type="paragraph" w:styleId="Ttulo1">
     <w:name w:val="heading 1"/>

</xml_diff>